<commit_message>
Final UI Patch and Mobile Fixes
</commit_message>
<xml_diff>
--- a/Project ARES Recovery Prompt.docx
+++ b/Project ARES Recovery Prompt.docx
@@ -14,7 +14,7 @@
           <w:b/>
           <w:bCs/>
         </w:rPr>
-        <w:t>FILE 3: PROJECT ARES - BUSINESS BLUEPRINT &amp; PROGRESS (Updated)</w:t>
+        <w:t>FILE 3: PROJECT ARES - BUSINESS BLUEPRINT &amp; PROGRESS (Updated May 3, 2026)</w:t>
       </w:r>
     </w:p>
     <w:p>
@@ -59,7 +59,7 @@
       <w:pPr>
         <w:numPr>
           <w:ilvl w:val="0"/>
-          <w:numId w:val="12"/>
+          <w:numId w:val="18"/>
         </w:numPr>
         <w:rPr>
           <w:b/>
@@ -78,7 +78,7 @@
       <w:pPr>
         <w:numPr>
           <w:ilvl w:val="0"/>
-          <w:numId w:val="12"/>
+          <w:numId w:val="18"/>
         </w:numPr>
         <w:rPr>
           <w:b/>
@@ -97,7 +97,7 @@
       <w:pPr>
         <w:numPr>
           <w:ilvl w:val="0"/>
-          <w:numId w:val="12"/>
+          <w:numId w:val="18"/>
         </w:numPr>
         <w:rPr>
           <w:b/>
@@ -116,7 +116,7 @@
       <w:pPr>
         <w:numPr>
           <w:ilvl w:val="0"/>
-          <w:numId w:val="12"/>
+          <w:numId w:val="18"/>
         </w:numPr>
         <w:rPr>
           <w:b/>
@@ -143,14 +143,14 @@
           <w:b/>
           <w:bCs/>
         </w:rPr>
-        <w:t>THE TECH STACK (Antigravity Protocol):</w:t>
+        <w:t>LEGAL &amp; COMPLIANCE DOCTRINE (The Corporate Armor):</w:t>
       </w:r>
     </w:p>
     <w:p>
       <w:pPr>
         <w:numPr>
           <w:ilvl w:val="0"/>
-          <w:numId w:val="13"/>
+          <w:numId w:val="19"/>
         </w:numPr>
         <w:rPr>
           <w:b/>
@@ -162,14 +162,14 @@
           <w:b/>
           <w:bCs/>
         </w:rPr>
-        <w:t>The Brain: Google AI Studio (Gemini 1.5 Pro).</w:t>
+        <w:t>Lexicon Control (SEC Shield): The app and marketing materials will never use the words "Buy," "Sell," "Long," or "Short." Output is strictly limited to "Support Zones," "Liquidation Clusters," and "Market Posture."</w:t>
       </w:r>
     </w:p>
     <w:p>
       <w:pPr>
         <w:numPr>
           <w:ilvl w:val="0"/>
-          <w:numId w:val="13"/>
+          <w:numId w:val="19"/>
         </w:numPr>
         <w:rPr>
           <w:b/>
@@ -181,14 +181,14 @@
           <w:b/>
           <w:bCs/>
         </w:rPr>
-        <w:t>The IDE / Development Team: Google Antigravity (Autonomous Agent Manager).</w:t>
+        <w:t>The Corporate Veil (Civil Shield): Operations will be conducted under a registered LLC to completely isolate the Founder's personal crypto wealth from business liability.</w:t>
       </w:r>
     </w:p>
     <w:p>
       <w:pPr>
         <w:numPr>
           <w:ilvl w:val="0"/>
-          <w:numId w:val="13"/>
+          <w:numId w:val="19"/>
         </w:numPr>
         <w:rPr>
           <w:b/>
@@ -200,14 +200,14 @@
           <w:b/>
           <w:bCs/>
         </w:rPr>
-        <w:t>The Backend: Node.js (Custom script written by Antigravity Agent).</w:t>
+        <w:t>The Click-Wrap Agreement: Users must physically check a box agreeing to the Terms of Service (stating the app is an "As-Is" educational data tool, not financial advice, and the AI is prone to errors) before the Stripe checkout loads.</w:t>
       </w:r>
     </w:p>
     <w:p>
       <w:pPr>
         <w:numPr>
           <w:ilvl w:val="0"/>
-          <w:numId w:val="13"/>
+          <w:numId w:val="19"/>
         </w:numPr>
         <w:rPr>
           <w:b/>
@@ -219,62 +219,14 @@
           <w:b/>
           <w:bCs/>
         </w:rPr>
-        <w:t>The Sensors: </w:t>
-      </w:r>
-      <w:proofErr w:type="spellStart"/>
-      <w:r>
-        <w:rPr>
-          <w:b/>
-          <w:bCs/>
-        </w:rPr>
-        <w:t>CoinGecko</w:t>
-      </w:r>
-      <w:proofErr w:type="spellEnd"/>
-      <w:r>
-        <w:rPr>
-          <w:b/>
-          <w:bCs/>
-        </w:rPr>
-        <w:t xml:space="preserve"> API (Prices/Fear Index), Puppeteer/Browser Agent (Scraping </w:t>
-      </w:r>
-      <w:proofErr w:type="spellStart"/>
-      <w:r>
-        <w:rPr>
-          <w:b/>
-          <w:bCs/>
-        </w:rPr>
-        <w:t>Farside</w:t>
-      </w:r>
-      <w:proofErr w:type="spellEnd"/>
-      <w:r>
-        <w:rPr>
-          <w:b/>
-          <w:bCs/>
-        </w:rPr>
-        <w:t xml:space="preserve"> ETF Flows and </w:t>
-      </w:r>
-      <w:proofErr w:type="spellStart"/>
-      <w:r>
-        <w:rPr>
-          <w:b/>
-          <w:bCs/>
-        </w:rPr>
-        <w:t>Coinglass</w:t>
-      </w:r>
-      <w:proofErr w:type="spellEnd"/>
-      <w:r>
-        <w:rPr>
-          <w:b/>
-          <w:bCs/>
-        </w:rPr>
-        <w:t xml:space="preserve"> Heatmaps).</w:t>
+        <w:t>FTC Compliance: The Stripe Customer Portal will be integrated to allow mandatory 1-click subscription cancellations.</w:t>
       </w:r>
     </w:p>
     <w:p>
       <w:pPr>
         <w:numPr>
           <w:ilvl w:val="0"/>
-          <w:numId w:val="13"/>
+          <w:numId w:val="19"/>
         </w:numPr>
         <w:rPr>
           <w:b/>
@@ -286,7 +238,23 @@
           <w:b/>
           <w:bCs/>
         </w:rPr>
-        <w:t xml:space="preserve">The Body: React Web App (Tailwind CSS, </w:t>
+        <w:t xml:space="preserve">Data Legitimacy Pivot: Web scraping (Puppeteer) is authorized for </w:t>
+      </w:r>
+      <w:proofErr w:type="gramStart"/>
+      <w:r>
+        <w:rPr>
+          <w:b/>
+          <w:bCs/>
+        </w:rPr>
+        <w:t>the free</w:t>
+      </w:r>
+      <w:proofErr w:type="gramEnd"/>
+      <w:r>
+        <w:rPr>
+          <w:b/>
+          <w:bCs/>
+        </w:rPr>
+        <w:t xml:space="preserve"> Beta. Upon reaching 20 paying users ($600/</w:t>
       </w:r>
       <w:proofErr w:type="spellStart"/>
       <w:r>
@@ -294,7 +262,7 @@
           <w:b/>
           <w:bCs/>
         </w:rPr>
-        <w:t>Glassmorphism</w:t>
+        <w:t>mo</w:t>
       </w:r>
       <w:proofErr w:type="spellEnd"/>
       <w:r>
@@ -302,7 +270,39 @@
           <w:b/>
           <w:bCs/>
         </w:rPr>
-        <w:t xml:space="preserve"> UI).</w:t>
+        <w:t xml:space="preserve"> MRR), revenue will be diverted to purchase official, commercial API licenses from </w:t>
+      </w:r>
+      <w:proofErr w:type="spellStart"/>
+      <w:r>
+        <w:rPr>
+          <w:b/>
+          <w:bCs/>
+        </w:rPr>
+        <w:t>Coinglass</w:t>
+      </w:r>
+      <w:proofErr w:type="spellEnd"/>
+      <w:r>
+        <w:rPr>
+          <w:b/>
+          <w:bCs/>
+        </w:rPr>
+        <w:t xml:space="preserve"> and </w:t>
+      </w:r>
+      <w:proofErr w:type="spellStart"/>
+      <w:r>
+        <w:rPr>
+          <w:b/>
+          <w:bCs/>
+        </w:rPr>
+        <w:t>Farside</w:t>
+      </w:r>
+      <w:proofErr w:type="spellEnd"/>
+      <w:r>
+        <w:rPr>
+          <w:b/>
+          <w:bCs/>
+        </w:rPr>
+        <w:t xml:space="preserve"> to prevent IP lawsuits and IP bans.</w:t>
       </w:r>
     </w:p>
     <w:p>
@@ -317,14 +317,14 @@
           <w:b/>
           <w:bCs/>
         </w:rPr>
-        <w:t>CORE APP FEATURES:</w:t>
+        <w:t>THE TECH STACK (Antigravity Protocol):</w:t>
       </w:r>
     </w:p>
     <w:p>
       <w:pPr>
         <w:numPr>
           <w:ilvl w:val="0"/>
-          <w:numId w:val="14"/>
+          <w:numId w:val="20"/>
         </w:numPr>
         <w:rPr>
           <w:b/>
@@ -336,14 +336,14 @@
           <w:b/>
           <w:bCs/>
         </w:rPr>
-        <w:t>The Posture Shield: AI-driven market stance (Defensive/Aggressive/Danger).</w:t>
+        <w:t>The Brain: Google AI Studio (Gemini 1.5 Pro).</w:t>
       </w:r>
     </w:p>
     <w:p>
       <w:pPr>
         <w:numPr>
           <w:ilvl w:val="0"/>
-          <w:numId w:val="14"/>
+          <w:numId w:val="20"/>
         </w:numPr>
         <w:rPr>
           <w:b/>
@@ -355,14 +355,15 @@
           <w:b/>
           <w:bCs/>
         </w:rPr>
-        <w:t>The Kill Zone Targets: Exact limit order coordinates based on liquidation heatmaps.</w:t>
+        <w:lastRenderedPageBreak/>
+        <w:t>The IDE / Development Team: Google Antigravity (Autonomous Agent Manager).</w:t>
       </w:r>
     </w:p>
     <w:p>
       <w:pPr>
         <w:numPr>
           <w:ilvl w:val="0"/>
-          <w:numId w:val="14"/>
+          <w:numId w:val="20"/>
         </w:numPr>
         <w:rPr>
           <w:b/>
@@ -374,14 +375,14 @@
           <w:b/>
           <w:bCs/>
         </w:rPr>
-        <w:t>The Field Manual: Built-in educational onboarding for users.</w:t>
+        <w:t>The Backend: Node.js (Custom script written by Antigravity Agent). Hosted on Render.com.</w:t>
       </w:r>
     </w:p>
     <w:p>
       <w:pPr>
         <w:numPr>
           <w:ilvl w:val="0"/>
-          <w:numId w:val="14"/>
+          <w:numId w:val="20"/>
         </w:numPr>
         <w:rPr>
           <w:b/>
@@ -393,7 +394,7 @@
           <w:b/>
           <w:bCs/>
         </w:rPr>
-        <w:t>The Freemium Paywall: Blurred targets and padlock UI for free users to drive $29/</w:t>
+        <w:t>The Sensors: </w:t>
       </w:r>
       <w:proofErr w:type="spellStart"/>
       <w:r>
@@ -401,7 +402,7 @@
           <w:b/>
           <w:bCs/>
         </w:rPr>
-        <w:t>mo</w:t>
+        <w:t>CoinGecko</w:t>
       </w:r>
       <w:proofErr w:type="spellEnd"/>
       <w:r>
@@ -409,14 +410,46 @@
           <w:b/>
           <w:bCs/>
         </w:rPr>
-        <w:t xml:space="preserve"> conversions.</w:t>
+        <w:t xml:space="preserve"> API (Prices/Fear Index), Puppeteer/Browser Agent (Scraping </w:t>
+      </w:r>
+      <w:proofErr w:type="spellStart"/>
+      <w:r>
+        <w:rPr>
+          <w:b/>
+          <w:bCs/>
+        </w:rPr>
+        <w:t>Farside</w:t>
+      </w:r>
+      <w:proofErr w:type="spellEnd"/>
+      <w:r>
+        <w:rPr>
+          <w:b/>
+          <w:bCs/>
+        </w:rPr>
+        <w:t xml:space="preserve"> ETF Flows and </w:t>
+      </w:r>
+      <w:proofErr w:type="spellStart"/>
+      <w:r>
+        <w:rPr>
+          <w:b/>
+          <w:bCs/>
+        </w:rPr>
+        <w:t>Coinglass</w:t>
+      </w:r>
+      <w:proofErr w:type="spellEnd"/>
+      <w:r>
+        <w:rPr>
+          <w:b/>
+          <w:bCs/>
+        </w:rPr>
+        <w:t xml:space="preserve"> Heatmaps).</w:t>
       </w:r>
     </w:p>
     <w:p>
       <w:pPr>
         <w:numPr>
           <w:ilvl w:val="0"/>
-          <w:numId w:val="14"/>
+          <w:numId w:val="20"/>
         </w:numPr>
         <w:rPr>
           <w:b/>
@@ -428,7 +461,39 @@
           <w:b/>
           <w:bCs/>
         </w:rPr>
-        <w:t>Pro Teasers (UI Mockups): Custom Altcoin Radar and Whale Watch ticker displayed to tease future backend updates.</w:t>
+        <w:t xml:space="preserve">The Body: React Web App (Tailwind CSS, </w:t>
+      </w:r>
+      <w:proofErr w:type="spellStart"/>
+      <w:r>
+        <w:rPr>
+          <w:b/>
+          <w:bCs/>
+        </w:rPr>
+        <w:t>Glassmorphism</w:t>
+      </w:r>
+      <w:proofErr w:type="spellEnd"/>
+      <w:r>
+        <w:rPr>
+          <w:b/>
+          <w:bCs/>
+        </w:rPr>
+        <w:t xml:space="preserve"> UI). Hosted on </w:t>
+      </w:r>
+      <w:proofErr w:type="spellStart"/>
+      <w:r>
+        <w:rPr>
+          <w:b/>
+          <w:bCs/>
+        </w:rPr>
+        <w:t>Vercel</w:t>
+      </w:r>
+      <w:proofErr w:type="spellEnd"/>
+      <w:r>
+        <w:rPr>
+          <w:b/>
+          <w:bCs/>
+        </w:rPr>
+        <w:t>.</w:t>
       </w:r>
     </w:p>
     <w:p>
@@ -443,40 +508,166 @@
           <w:b/>
           <w:bCs/>
         </w:rPr>
-        <w:t>EXECUTION ROADMAP &amp; PROGRESS:</w:t>
+        <w:t>CORE APP FEATURES:</w:t>
       </w:r>
     </w:p>
     <w:p>
       <w:pPr>
-        <w:rPr>
-          <w:b/>
-          <w:bCs/>
-        </w:rPr>
-      </w:pPr>
-      <w:r>
-        <w:rPr>
-          <w:rFonts w:ascii="Segoe UI Emoji" w:hAnsi="Segoe UI Emoji" w:cs="Segoe UI Emoji"/>
-          <w:b/>
-          <w:bCs/>
-        </w:rPr>
-        <w:lastRenderedPageBreak/>
-        <w:t>🟢</w:t>
-      </w:r>
-      <w:r>
-        <w:rPr>
-          <w:b/>
-          <w:bCs/>
-        </w:rPr>
-        <w:t xml:space="preserve"> PHASE 1: PROVE THE BRAIN (Google AI Studio)</w:t>
+        <w:numPr>
+          <w:ilvl w:val="0"/>
+          <w:numId w:val="21"/>
+        </w:numPr>
+        <w:rPr>
+          <w:b/>
+          <w:bCs/>
+        </w:rPr>
+      </w:pPr>
+      <w:r>
+        <w:rPr>
+          <w:b/>
+          <w:bCs/>
+        </w:rPr>
+        <w:t>The Posture Shield: AI-driven market stance (Defensive/Aggressive/Danger).</w:t>
       </w:r>
     </w:p>
     <w:p>
       <w:pPr>
-        <w:rPr>
-          <w:b/>
-          <w:bCs/>
-        </w:rPr>
-      </w:pPr>
+        <w:numPr>
+          <w:ilvl w:val="0"/>
+          <w:numId w:val="21"/>
+        </w:numPr>
+        <w:rPr>
+          <w:b/>
+          <w:bCs/>
+        </w:rPr>
+      </w:pPr>
+      <w:r>
+        <w:rPr>
+          <w:b/>
+          <w:bCs/>
+        </w:rPr>
+        <w:t>The Kill Zone Targets: Exact limit order coordinates based on liquidation heatmaps.</w:t>
+      </w:r>
+    </w:p>
+    <w:p>
+      <w:pPr>
+        <w:numPr>
+          <w:ilvl w:val="0"/>
+          <w:numId w:val="21"/>
+        </w:numPr>
+        <w:rPr>
+          <w:b/>
+          <w:bCs/>
+        </w:rPr>
+      </w:pPr>
+      <w:r>
+        <w:rPr>
+          <w:b/>
+          <w:bCs/>
+        </w:rPr>
+        <w:t>The Field Manual: Built-in educational onboarding for users.</w:t>
+      </w:r>
+    </w:p>
+    <w:p>
+      <w:pPr>
+        <w:numPr>
+          <w:ilvl w:val="0"/>
+          <w:numId w:val="21"/>
+        </w:numPr>
+        <w:rPr>
+          <w:b/>
+          <w:bCs/>
+        </w:rPr>
+      </w:pPr>
+      <w:r>
+        <w:rPr>
+          <w:b/>
+          <w:bCs/>
+        </w:rPr>
+        <w:t>The Freemium Paywall: Blurred targets and padlock UI for free users to drive $29/</w:t>
+      </w:r>
+      <w:proofErr w:type="spellStart"/>
+      <w:r>
+        <w:rPr>
+          <w:b/>
+          <w:bCs/>
+        </w:rPr>
+        <w:t>mo</w:t>
+      </w:r>
+      <w:proofErr w:type="spellEnd"/>
+      <w:r>
+        <w:rPr>
+          <w:b/>
+          <w:bCs/>
+        </w:rPr>
+        <w:t xml:space="preserve"> conversions.</w:t>
+      </w:r>
+    </w:p>
+    <w:p>
+      <w:pPr>
+        <w:numPr>
+          <w:ilvl w:val="0"/>
+          <w:numId w:val="21"/>
+        </w:numPr>
+        <w:rPr>
+          <w:b/>
+          <w:bCs/>
+        </w:rPr>
+      </w:pPr>
+      <w:r>
+        <w:rPr>
+          <w:b/>
+          <w:bCs/>
+        </w:rPr>
+        <w:t>Pro Teasers (UI Mockups): Custom Altcoin Radar and Whale Watch ticker displayed to tease future backend updates.</w:t>
+      </w:r>
+    </w:p>
+    <w:p>
+      <w:pPr>
+        <w:rPr>
+          <w:b/>
+          <w:bCs/>
+        </w:rPr>
+      </w:pPr>
+      <w:r>
+        <w:rPr>
+          <w:b/>
+          <w:bCs/>
+        </w:rPr>
+        <w:t>EXECUTION ROADMAP &amp; PROGRESS:</w:t>
+      </w:r>
+    </w:p>
+    <w:p>
+      <w:pPr>
+        <w:rPr>
+          <w:b/>
+          <w:bCs/>
+        </w:rPr>
+      </w:pPr>
+      <w:r>
+        <w:rPr>
+          <w:rFonts w:ascii="Segoe UI Emoji" w:hAnsi="Segoe UI Emoji" w:cs="Segoe UI Emoji"/>
+          <w:b/>
+          <w:bCs/>
+        </w:rPr>
+        <w:t>🟢</w:t>
+      </w:r>
+      <w:r>
+        <w:rPr>
+          <w:b/>
+          <w:bCs/>
+        </w:rPr>
+        <w:t xml:space="preserve"> PHASE 1: PROVE THE BRAIN (Google AI Studio)</w:t>
+      </w:r>
+    </w:p>
+    <w:p>
+      <w:pPr>
+        <w:rPr>
+          <w:b/>
+          <w:bCs/>
+        </w:rPr>
+      </w:pPr>
+      <w:proofErr w:type="gramStart"/>
       <w:r>
         <w:rPr>
           <w:b/>
@@ -484,7 +675,17 @@
           <w:i/>
           <w:iCs/>
         </w:rPr>
-        <w:t>Status: [COMPLETED - April 29, 2026]</w:t>
+        <w:t>Status:[</w:t>
+      </w:r>
+      <w:proofErr w:type="gramEnd"/>
+      <w:r>
+        <w:rPr>
+          <w:b/>
+          <w:bCs/>
+          <w:i/>
+          <w:iCs/>
+        </w:rPr>
+        <w:t>COMPLETED - April 29, 2026]</w:t>
       </w:r>
     </w:p>
     <w:p>
@@ -547,6 +748,7 @@
           <w:bCs/>
         </w:rPr>
       </w:pPr>
+      <w:proofErr w:type="gramStart"/>
       <w:r>
         <w:rPr>
           <w:b/>
@@ -554,7 +756,17 @@
           <w:i/>
           <w:iCs/>
         </w:rPr>
-        <w:t>Status: [COMPLETED - May 2, 2026]</w:t>
+        <w:t>Status:[</w:t>
+      </w:r>
+      <w:proofErr w:type="gramEnd"/>
+      <w:r>
+        <w:rPr>
+          <w:b/>
+          <w:bCs/>
+          <w:i/>
+          <w:iCs/>
+        </w:rPr>
+        <w:t>COMPLETED - May 2, 2026]</w:t>
       </w:r>
     </w:p>
     <w:p>
@@ -620,46 +832,6 @@
         </w:rPr>
         <w:t>.</w:t>
       </w:r>
-      <w:r>
-        <w:rPr>
-          <w:b/>
-          <w:bCs/>
-        </w:rPr>
-        <w:br/>
-        <w:t xml:space="preserve">*[X] Executed live test. Pipeline successfully fetched </w:t>
-      </w:r>
-      <w:proofErr w:type="spellStart"/>
-      <w:r>
-        <w:rPr>
-          <w:b/>
-          <w:bCs/>
-        </w:rPr>
-        <w:t>CoinGecko</w:t>
-      </w:r>
-      <w:proofErr w:type="spellEnd"/>
-      <w:r>
-        <w:rPr>
-          <w:b/>
-          <w:bCs/>
-        </w:rPr>
-        <w:t xml:space="preserve"> data, bypassed </w:t>
-      </w:r>
-      <w:proofErr w:type="spellStart"/>
-      <w:r>
-        <w:rPr>
-          <w:b/>
-          <w:bCs/>
-        </w:rPr>
-        <w:t>Farside</w:t>
-      </w:r>
-      <w:proofErr w:type="spellEnd"/>
-      <w:r>
-        <w:rPr>
-          <w:b/>
-          <w:bCs/>
-        </w:rPr>
-        <w:t xml:space="preserve"> Cloudflare block, and communicated with Gemini API.</w:t>
-      </w:r>
     </w:p>
     <w:p>
       <w:pPr>
@@ -673,7 +845,40 @@
           <w:b/>
           <w:bCs/>
         </w:rPr>
-        <w:t>Re-calibrated System Prompt to force strict JSON output and multi-asset (BTC, ETH, SOL) tracking.</w:t>
+        <w:lastRenderedPageBreak/>
+        <w:t xml:space="preserve">Executed live test. Pipeline successfully fetched </w:t>
+      </w:r>
+      <w:proofErr w:type="spellStart"/>
+      <w:r>
+        <w:rPr>
+          <w:b/>
+          <w:bCs/>
+        </w:rPr>
+        <w:t>CoinGecko</w:t>
+      </w:r>
+      <w:proofErr w:type="spellEnd"/>
+      <w:r>
+        <w:rPr>
+          <w:b/>
+          <w:bCs/>
+        </w:rPr>
+        <w:t xml:space="preserve"> data, bypassed </w:t>
+      </w:r>
+      <w:proofErr w:type="spellStart"/>
+      <w:r>
+        <w:rPr>
+          <w:b/>
+          <w:bCs/>
+        </w:rPr>
+        <w:t>Farside</w:t>
+      </w:r>
+      <w:proofErr w:type="spellEnd"/>
+      <w:r>
+        <w:rPr>
+          <w:b/>
+          <w:bCs/>
+        </w:rPr>
+        <w:t xml:space="preserve"> Cloudflare block, and communicated with Gemini API.</w:t>
       </w:r>
     </w:p>
     <w:p>
@@ -685,18 +890,10 @@
       </w:pPr>
       <w:r>
         <w:rPr>
-          <w:rFonts w:ascii="Segoe UI Emoji" w:hAnsi="Segoe UI Emoji" w:cs="Segoe UI Emoji"/>
-          <w:b/>
-          <w:bCs/>
-        </w:rPr>
-        <w:t>🟢</w:t>
-      </w:r>
-      <w:r>
-        <w:rPr>
-          <w:b/>
-          <w:bCs/>
-        </w:rPr>
-        <w:t xml:space="preserve"> PHASE 3: THE FRONTEND BUILD (React UI)</w:t>
+          <w:b/>
+          <w:bCs/>
+        </w:rPr>
+        <w:t>Re-calibrated System Prompt to force strict JSON output and multi-asset (BTC, ETH, SOL) tracking.</w:t>
       </w:r>
     </w:p>
     <w:p>
@@ -710,10 +907,48 @@
         <w:rPr>
           <w:b/>
           <w:bCs/>
+        </w:rPr>
+        <w:t>Deployed backend to Render.com.</w:t>
+      </w:r>
+    </w:p>
+    <w:p>
+      <w:pPr>
+        <w:rPr>
+          <w:b/>
+          <w:bCs/>
+        </w:rPr>
+      </w:pPr>
+      <w:r>
+        <w:rPr>
+          <w:rFonts w:ascii="Segoe UI Emoji" w:hAnsi="Segoe UI Emoji" w:cs="Segoe UI Emoji"/>
+          <w:b/>
+          <w:bCs/>
+        </w:rPr>
+        <w:t>🟢</w:t>
+      </w:r>
+      <w:r>
+        <w:rPr>
+          <w:b/>
+          <w:bCs/>
+        </w:rPr>
+        <w:t xml:space="preserve"> PHASE 3: THE FRONTEND BUILD (React UI)</w:t>
+      </w:r>
+    </w:p>
+    <w:p>
+      <w:pPr>
+        <w:rPr>
+          <w:b/>
+          <w:bCs/>
+        </w:rPr>
+      </w:pPr>
+      <w:r>
+        <w:rPr>
+          <w:b/>
+          <w:bCs/>
           <w:i/>
           <w:iCs/>
         </w:rPr>
-        <w:t>Status: [COMPLETED - May 2, 2026]</w:t>
+        <w:t>Status: [COMPLETED - May 3, 2026]</w:t>
       </w:r>
     </w:p>
     <w:p>
@@ -791,14 +1026,6 @@
         </w:rPr>
         <w:t>Implemented Freemium Paywall (Blur/Padlock) and Dev Toggle.</w:t>
       </w:r>
-      <w:r>
-        <w:rPr>
-          <w:b/>
-          <w:bCs/>
-        </w:rPr>
-        <w:br/>
-        <w:t>*[X] Added Legal Disclaimer and Copyright Footer.</w:t>
-      </w:r>
     </w:p>
     <w:p>
       <w:pPr>
@@ -809,18 +1036,10 @@
       </w:pPr>
       <w:r>
         <w:rPr>
-          <w:rFonts w:ascii="Segoe UI Emoji" w:hAnsi="Segoe UI Emoji" w:cs="Segoe UI Emoji"/>
-          <w:b/>
-          <w:bCs/>
-        </w:rPr>
-        <w:t>🟡</w:t>
-      </w:r>
-      <w:r>
-        <w:rPr>
-          <w:b/>
-          <w:bCs/>
-        </w:rPr>
-        <w:t xml:space="preserve"> PHASE 4: THE SHIELD &amp; LAUNCH (Legal &amp; Go-To-Market)</w:t>
+          <w:b/>
+          <w:bCs/>
+        </w:rPr>
+        <w:t>Added Legal Disclaimer and Copyright Footer.</w:t>
       </w:r>
     </w:p>
     <w:p>
@@ -834,6 +1053,60 @@
         <w:rPr>
           <w:b/>
           <w:bCs/>
+        </w:rPr>
+        <w:t xml:space="preserve">Deployed frontend to </w:t>
+      </w:r>
+      <w:proofErr w:type="spellStart"/>
+      <w:r>
+        <w:rPr>
+          <w:b/>
+          <w:bCs/>
+        </w:rPr>
+        <w:t>Vercel</w:t>
+      </w:r>
+      <w:proofErr w:type="spellEnd"/>
+      <w:r>
+        <w:rPr>
+          <w:b/>
+          <w:bCs/>
+        </w:rPr>
+        <w:t>.</w:t>
+      </w:r>
+    </w:p>
+    <w:p>
+      <w:pPr>
+        <w:rPr>
+          <w:b/>
+          <w:bCs/>
+        </w:rPr>
+      </w:pPr>
+      <w:r>
+        <w:rPr>
+          <w:rFonts w:ascii="Segoe UI Emoji" w:hAnsi="Segoe UI Emoji" w:cs="Segoe UI Emoji"/>
+          <w:b/>
+          <w:bCs/>
+        </w:rPr>
+        <w:t>🟡</w:t>
+      </w:r>
+      <w:r>
+        <w:rPr>
+          <w:b/>
+          <w:bCs/>
+        </w:rPr>
+        <w:t xml:space="preserve"> PHASE 4: THE SHIELD &amp; LAUNCH (Legal &amp; Go-To-Market)</w:t>
+      </w:r>
+    </w:p>
+    <w:p>
+      <w:pPr>
+        <w:rPr>
+          <w:b/>
+          <w:bCs/>
+        </w:rPr>
+      </w:pPr>
+      <w:r>
+        <w:rPr>
+          <w:b/>
+          <w:bCs/>
           <w:i/>
           <w:iCs/>
         </w:rPr>
@@ -883,7 +1156,7 @@
           <w:b/>
           <w:bCs/>
         </w:rPr>
-        <w:t xml:space="preserve">Step 2: Deploy local React build to </w:t>
+        <w:t xml:space="preserve">Step 2: Initiated Beta Bounty on </w:t>
       </w:r>
       <w:proofErr w:type="spellStart"/>
       <w:r>
@@ -891,7 +1164,7 @@
           <w:b/>
           <w:bCs/>
         </w:rPr>
-        <w:t>Vercel</w:t>
+        <w:t>Zealy</w:t>
       </w:r>
       <w:proofErr w:type="spellEnd"/>
       <w:r>
@@ -899,7 +1172,31 @@
           <w:b/>
           <w:bCs/>
         </w:rPr>
-        <w:t xml:space="preserve"> for public URL hosting (Scheduled for Sunday morning).</w:t>
+        <w:t xml:space="preserve"> to recruit 5 testers for $10 each.</w:t>
+      </w:r>
+      <w:r>
+        <w:rPr>
+          <w:b/>
+          <w:bCs/>
+        </w:rPr>
+        <w:br/>
+        <w:t>*</w:t>
+      </w:r>
+      <w:proofErr w:type="gramStart"/>
+      <w:r>
+        <w:rPr>
+          <w:b/>
+          <w:bCs/>
+        </w:rPr>
+        <w:t>[ ]</w:t>
+      </w:r>
+      <w:proofErr w:type="gramEnd"/>
+      <w:r>
+        <w:rPr>
+          <w:b/>
+          <w:bCs/>
+        </w:rPr>
+        <w:t> Step 3: Form the LLC (e.g., Stripe Atlas) to establish the Corporate Veil.</w:t>
       </w:r>
     </w:p>
     <w:p>
@@ -914,8 +1211,7 @@
           <w:b/>
           <w:bCs/>
         </w:rPr>
-        <w:lastRenderedPageBreak/>
-        <w:t>Step 3: Form the LLC to protect personal assets (Scheduled for Monday).</w:t>
+        <w:t>Step 4: Draft Terms of Service and Privacy Policy (As-Is clause, no financial advice).</w:t>
       </w:r>
     </w:p>
     <w:p>
@@ -930,7 +1226,54 @@
           <w:b/>
           <w:bCs/>
         </w:rPr>
-        <w:t>Step 4: Activate the Stripe payment gateway ($29/month) after Beta testing concludes.</w:t>
+        <w:t xml:space="preserve">Step 5: Activate the Stripe payment gateway ($29/month) with 1-click cancel portal and mandatory </w:t>
+      </w:r>
+      <w:proofErr w:type="spellStart"/>
+      <w:r>
+        <w:rPr>
+          <w:b/>
+          <w:bCs/>
+        </w:rPr>
+        <w:t>ToS</w:t>
+      </w:r>
+      <w:proofErr w:type="spellEnd"/>
+      <w:r>
+        <w:rPr>
+          <w:b/>
+          <w:bCs/>
+        </w:rPr>
+        <w:t xml:space="preserve"> checkbox.</w:t>
+      </w:r>
+    </w:p>
+    <w:p>
+      <w:pPr>
+        <w:rPr>
+          <w:b/>
+          <w:bCs/>
+        </w:rPr>
+      </w:pPr>
+      <w:r>
+        <w:rPr>
+          <w:b/>
+          <w:bCs/>
+        </w:rPr>
+        <w:t>Step 6: Transition from web scraping to official paid APIs upon reaching $600/</w:t>
+      </w:r>
+      <w:proofErr w:type="spellStart"/>
+      <w:r>
+        <w:rPr>
+          <w:b/>
+          <w:bCs/>
+        </w:rPr>
+        <w:t>mo</w:t>
+      </w:r>
+      <w:proofErr w:type="spellEnd"/>
+      <w:r>
+        <w:rPr>
+          <w:b/>
+          <w:bCs/>
+        </w:rPr>
+        <w:t xml:space="preserve"> MRR.</w:t>
       </w:r>
     </w:p>
     <w:p/>
@@ -1692,6 +2035,268 @@
     </w:lvl>
   </w:abstractNum>
   <w:abstractNum w:abstractNumId="5" w15:restartNumberingAfterBreak="0">
+    <w:nsid w:val="164A3EED"/>
+    <w:multiLevelType w:val="multilevel"/>
+    <w:tmpl w:val="BB54FAE8"/>
+    <w:lvl w:ilvl="0">
+      <w:start w:val="1"/>
+      <w:numFmt w:val="bullet"/>
+      <w:lvlText w:val=""/>
+      <w:lvlJc w:val="left"/>
+      <w:pPr>
+        <w:tabs>
+          <w:tab w:val="num" w:pos="720"/>
+        </w:tabs>
+        <w:ind w:left="720" w:hanging="360"/>
+      </w:pPr>
+      <w:rPr>
+        <w:rFonts w:ascii="Symbol" w:hAnsi="Symbol" w:hint="default"/>
+        <w:sz w:val="20"/>
+      </w:rPr>
+    </w:lvl>
+    <w:lvl w:ilvl="1" w:tentative="1">
+      <w:start w:val="1"/>
+      <w:numFmt w:val="bullet"/>
+      <w:lvlText w:val="o"/>
+      <w:lvlJc w:val="left"/>
+      <w:pPr>
+        <w:tabs>
+          <w:tab w:val="num" w:pos="1440"/>
+        </w:tabs>
+        <w:ind w:left="1440" w:hanging="360"/>
+      </w:pPr>
+      <w:rPr>
+        <w:rFonts w:ascii="Courier New" w:hAnsi="Courier New" w:hint="default"/>
+        <w:sz w:val="20"/>
+      </w:rPr>
+    </w:lvl>
+    <w:lvl w:ilvl="2" w:tentative="1">
+      <w:start w:val="1"/>
+      <w:numFmt w:val="bullet"/>
+      <w:lvlText w:val=""/>
+      <w:lvlJc w:val="left"/>
+      <w:pPr>
+        <w:tabs>
+          <w:tab w:val="num" w:pos="2160"/>
+        </w:tabs>
+        <w:ind w:left="2160" w:hanging="360"/>
+      </w:pPr>
+      <w:rPr>
+        <w:rFonts w:ascii="Wingdings" w:hAnsi="Wingdings" w:hint="default"/>
+        <w:sz w:val="20"/>
+      </w:rPr>
+    </w:lvl>
+    <w:lvl w:ilvl="3" w:tentative="1">
+      <w:start w:val="1"/>
+      <w:numFmt w:val="bullet"/>
+      <w:lvlText w:val=""/>
+      <w:lvlJc w:val="left"/>
+      <w:pPr>
+        <w:tabs>
+          <w:tab w:val="num" w:pos="2880"/>
+        </w:tabs>
+        <w:ind w:left="2880" w:hanging="360"/>
+      </w:pPr>
+      <w:rPr>
+        <w:rFonts w:ascii="Wingdings" w:hAnsi="Wingdings" w:hint="default"/>
+        <w:sz w:val="20"/>
+      </w:rPr>
+    </w:lvl>
+    <w:lvl w:ilvl="4" w:tentative="1">
+      <w:start w:val="1"/>
+      <w:numFmt w:val="bullet"/>
+      <w:lvlText w:val=""/>
+      <w:lvlJc w:val="left"/>
+      <w:pPr>
+        <w:tabs>
+          <w:tab w:val="num" w:pos="3600"/>
+        </w:tabs>
+        <w:ind w:left="3600" w:hanging="360"/>
+      </w:pPr>
+      <w:rPr>
+        <w:rFonts w:ascii="Wingdings" w:hAnsi="Wingdings" w:hint="default"/>
+        <w:sz w:val="20"/>
+      </w:rPr>
+    </w:lvl>
+    <w:lvl w:ilvl="5" w:tentative="1">
+      <w:start w:val="1"/>
+      <w:numFmt w:val="bullet"/>
+      <w:lvlText w:val=""/>
+      <w:lvlJc w:val="left"/>
+      <w:pPr>
+        <w:tabs>
+          <w:tab w:val="num" w:pos="4320"/>
+        </w:tabs>
+        <w:ind w:left="4320" w:hanging="360"/>
+      </w:pPr>
+      <w:rPr>
+        <w:rFonts w:ascii="Wingdings" w:hAnsi="Wingdings" w:hint="default"/>
+        <w:sz w:val="20"/>
+      </w:rPr>
+    </w:lvl>
+    <w:lvl w:ilvl="6" w:tentative="1">
+      <w:start w:val="1"/>
+      <w:numFmt w:val="bullet"/>
+      <w:lvlText w:val=""/>
+      <w:lvlJc w:val="left"/>
+      <w:pPr>
+        <w:tabs>
+          <w:tab w:val="num" w:pos="5040"/>
+        </w:tabs>
+        <w:ind w:left="5040" w:hanging="360"/>
+      </w:pPr>
+      <w:rPr>
+        <w:rFonts w:ascii="Wingdings" w:hAnsi="Wingdings" w:hint="default"/>
+        <w:sz w:val="20"/>
+      </w:rPr>
+    </w:lvl>
+    <w:lvl w:ilvl="7" w:tentative="1">
+      <w:start w:val="1"/>
+      <w:numFmt w:val="bullet"/>
+      <w:lvlText w:val=""/>
+      <w:lvlJc w:val="left"/>
+      <w:pPr>
+        <w:tabs>
+          <w:tab w:val="num" w:pos="5760"/>
+        </w:tabs>
+        <w:ind w:left="5760" w:hanging="360"/>
+      </w:pPr>
+      <w:rPr>
+        <w:rFonts w:ascii="Wingdings" w:hAnsi="Wingdings" w:hint="default"/>
+        <w:sz w:val="20"/>
+      </w:rPr>
+    </w:lvl>
+    <w:lvl w:ilvl="8" w:tentative="1">
+      <w:start w:val="1"/>
+      <w:numFmt w:val="bullet"/>
+      <w:lvlText w:val=""/>
+      <w:lvlJc w:val="left"/>
+      <w:pPr>
+        <w:tabs>
+          <w:tab w:val="num" w:pos="6480"/>
+        </w:tabs>
+        <w:ind w:left="6480" w:hanging="360"/>
+      </w:pPr>
+      <w:rPr>
+        <w:rFonts w:ascii="Wingdings" w:hAnsi="Wingdings" w:hint="default"/>
+        <w:sz w:val="20"/>
+      </w:rPr>
+    </w:lvl>
+  </w:abstractNum>
+  <w:abstractNum w:abstractNumId="6" w15:restartNumberingAfterBreak="0">
+    <w:nsid w:val="19CB364E"/>
+    <w:multiLevelType w:val="multilevel"/>
+    <w:tmpl w:val="04B01474"/>
+    <w:lvl w:ilvl="0">
+      <w:start w:val="1"/>
+      <w:numFmt w:val="decimal"/>
+      <w:lvlText w:val="%1."/>
+      <w:lvlJc w:val="left"/>
+      <w:pPr>
+        <w:tabs>
+          <w:tab w:val="num" w:pos="720"/>
+        </w:tabs>
+        <w:ind w:left="720" w:hanging="360"/>
+      </w:pPr>
+    </w:lvl>
+    <w:lvl w:ilvl="1" w:tentative="1">
+      <w:start w:val="1"/>
+      <w:numFmt w:val="decimal"/>
+      <w:lvlText w:val="%2."/>
+      <w:lvlJc w:val="left"/>
+      <w:pPr>
+        <w:tabs>
+          <w:tab w:val="num" w:pos="1440"/>
+        </w:tabs>
+        <w:ind w:left="1440" w:hanging="360"/>
+      </w:pPr>
+    </w:lvl>
+    <w:lvl w:ilvl="2" w:tentative="1">
+      <w:start w:val="1"/>
+      <w:numFmt w:val="decimal"/>
+      <w:lvlText w:val="%3."/>
+      <w:lvlJc w:val="left"/>
+      <w:pPr>
+        <w:tabs>
+          <w:tab w:val="num" w:pos="2160"/>
+        </w:tabs>
+        <w:ind w:left="2160" w:hanging="360"/>
+      </w:pPr>
+    </w:lvl>
+    <w:lvl w:ilvl="3" w:tentative="1">
+      <w:start w:val="1"/>
+      <w:numFmt w:val="decimal"/>
+      <w:lvlText w:val="%4."/>
+      <w:lvlJc w:val="left"/>
+      <w:pPr>
+        <w:tabs>
+          <w:tab w:val="num" w:pos="2880"/>
+        </w:tabs>
+        <w:ind w:left="2880" w:hanging="360"/>
+      </w:pPr>
+    </w:lvl>
+    <w:lvl w:ilvl="4" w:tentative="1">
+      <w:start w:val="1"/>
+      <w:numFmt w:val="decimal"/>
+      <w:lvlText w:val="%5."/>
+      <w:lvlJc w:val="left"/>
+      <w:pPr>
+        <w:tabs>
+          <w:tab w:val="num" w:pos="3600"/>
+        </w:tabs>
+        <w:ind w:left="3600" w:hanging="360"/>
+      </w:pPr>
+    </w:lvl>
+    <w:lvl w:ilvl="5" w:tentative="1">
+      <w:start w:val="1"/>
+      <w:numFmt w:val="decimal"/>
+      <w:lvlText w:val="%6."/>
+      <w:lvlJc w:val="left"/>
+      <w:pPr>
+        <w:tabs>
+          <w:tab w:val="num" w:pos="4320"/>
+        </w:tabs>
+        <w:ind w:left="4320" w:hanging="360"/>
+      </w:pPr>
+    </w:lvl>
+    <w:lvl w:ilvl="6" w:tentative="1">
+      <w:start w:val="1"/>
+      <w:numFmt w:val="decimal"/>
+      <w:lvlText w:val="%7."/>
+      <w:lvlJc w:val="left"/>
+      <w:pPr>
+        <w:tabs>
+          <w:tab w:val="num" w:pos="5040"/>
+        </w:tabs>
+        <w:ind w:left="5040" w:hanging="360"/>
+      </w:pPr>
+    </w:lvl>
+    <w:lvl w:ilvl="7" w:tentative="1">
+      <w:start w:val="1"/>
+      <w:numFmt w:val="decimal"/>
+      <w:lvlText w:val="%8."/>
+      <w:lvlJc w:val="left"/>
+      <w:pPr>
+        <w:tabs>
+          <w:tab w:val="num" w:pos="5760"/>
+        </w:tabs>
+        <w:ind w:left="5760" w:hanging="360"/>
+      </w:pPr>
+    </w:lvl>
+    <w:lvl w:ilvl="8" w:tentative="1">
+      <w:start w:val="1"/>
+      <w:numFmt w:val="decimal"/>
+      <w:lvlText w:val="%9."/>
+      <w:lvlJc w:val="left"/>
+      <w:pPr>
+        <w:tabs>
+          <w:tab w:val="num" w:pos="6480"/>
+        </w:tabs>
+        <w:ind w:left="6480" w:hanging="360"/>
+      </w:pPr>
+    </w:lvl>
+  </w:abstractNum>
+  <w:abstractNum w:abstractNumId="7" w15:restartNumberingAfterBreak="0">
     <w:nsid w:val="1B42700F"/>
     <w:multiLevelType w:val="multilevel"/>
     <w:tmpl w:val="7C427FBC"/>
@@ -1840,7 +2445,269 @@
       </w:rPr>
     </w:lvl>
   </w:abstractNum>
-  <w:abstractNum w:abstractNumId="6" w15:restartNumberingAfterBreak="0">
+  <w:abstractNum w:abstractNumId="8" w15:restartNumberingAfterBreak="0">
+    <w:nsid w:val="1EF72939"/>
+    <w:multiLevelType w:val="multilevel"/>
+    <w:tmpl w:val="5E50B286"/>
+    <w:lvl w:ilvl="0">
+      <w:start w:val="1"/>
+      <w:numFmt w:val="decimal"/>
+      <w:lvlText w:val="%1."/>
+      <w:lvlJc w:val="left"/>
+      <w:pPr>
+        <w:tabs>
+          <w:tab w:val="num" w:pos="720"/>
+        </w:tabs>
+        <w:ind w:left="720" w:hanging="360"/>
+      </w:pPr>
+    </w:lvl>
+    <w:lvl w:ilvl="1" w:tentative="1">
+      <w:start w:val="1"/>
+      <w:numFmt w:val="decimal"/>
+      <w:lvlText w:val="%2."/>
+      <w:lvlJc w:val="left"/>
+      <w:pPr>
+        <w:tabs>
+          <w:tab w:val="num" w:pos="1440"/>
+        </w:tabs>
+        <w:ind w:left="1440" w:hanging="360"/>
+      </w:pPr>
+    </w:lvl>
+    <w:lvl w:ilvl="2" w:tentative="1">
+      <w:start w:val="1"/>
+      <w:numFmt w:val="decimal"/>
+      <w:lvlText w:val="%3."/>
+      <w:lvlJc w:val="left"/>
+      <w:pPr>
+        <w:tabs>
+          <w:tab w:val="num" w:pos="2160"/>
+        </w:tabs>
+        <w:ind w:left="2160" w:hanging="360"/>
+      </w:pPr>
+    </w:lvl>
+    <w:lvl w:ilvl="3" w:tentative="1">
+      <w:start w:val="1"/>
+      <w:numFmt w:val="decimal"/>
+      <w:lvlText w:val="%4."/>
+      <w:lvlJc w:val="left"/>
+      <w:pPr>
+        <w:tabs>
+          <w:tab w:val="num" w:pos="2880"/>
+        </w:tabs>
+        <w:ind w:left="2880" w:hanging="360"/>
+      </w:pPr>
+    </w:lvl>
+    <w:lvl w:ilvl="4" w:tentative="1">
+      <w:start w:val="1"/>
+      <w:numFmt w:val="decimal"/>
+      <w:lvlText w:val="%5."/>
+      <w:lvlJc w:val="left"/>
+      <w:pPr>
+        <w:tabs>
+          <w:tab w:val="num" w:pos="3600"/>
+        </w:tabs>
+        <w:ind w:left="3600" w:hanging="360"/>
+      </w:pPr>
+    </w:lvl>
+    <w:lvl w:ilvl="5" w:tentative="1">
+      <w:start w:val="1"/>
+      <w:numFmt w:val="decimal"/>
+      <w:lvlText w:val="%6."/>
+      <w:lvlJc w:val="left"/>
+      <w:pPr>
+        <w:tabs>
+          <w:tab w:val="num" w:pos="4320"/>
+        </w:tabs>
+        <w:ind w:left="4320" w:hanging="360"/>
+      </w:pPr>
+    </w:lvl>
+    <w:lvl w:ilvl="6" w:tentative="1">
+      <w:start w:val="1"/>
+      <w:numFmt w:val="decimal"/>
+      <w:lvlText w:val="%7."/>
+      <w:lvlJc w:val="left"/>
+      <w:pPr>
+        <w:tabs>
+          <w:tab w:val="num" w:pos="5040"/>
+        </w:tabs>
+        <w:ind w:left="5040" w:hanging="360"/>
+      </w:pPr>
+    </w:lvl>
+    <w:lvl w:ilvl="7" w:tentative="1">
+      <w:start w:val="1"/>
+      <w:numFmt w:val="decimal"/>
+      <w:lvlText w:val="%8."/>
+      <w:lvlJc w:val="left"/>
+      <w:pPr>
+        <w:tabs>
+          <w:tab w:val="num" w:pos="5760"/>
+        </w:tabs>
+        <w:ind w:left="5760" w:hanging="360"/>
+      </w:pPr>
+    </w:lvl>
+    <w:lvl w:ilvl="8" w:tentative="1">
+      <w:start w:val="1"/>
+      <w:numFmt w:val="decimal"/>
+      <w:lvlText w:val="%9."/>
+      <w:lvlJc w:val="left"/>
+      <w:pPr>
+        <w:tabs>
+          <w:tab w:val="num" w:pos="6480"/>
+        </w:tabs>
+        <w:ind w:left="6480" w:hanging="360"/>
+      </w:pPr>
+    </w:lvl>
+  </w:abstractNum>
+  <w:abstractNum w:abstractNumId="9" w15:restartNumberingAfterBreak="0">
+    <w:nsid w:val="29794AF3"/>
+    <w:multiLevelType w:val="multilevel"/>
+    <w:tmpl w:val="2040802E"/>
+    <w:lvl w:ilvl="0">
+      <w:start w:val="1"/>
+      <w:numFmt w:val="bullet"/>
+      <w:lvlText w:val=""/>
+      <w:lvlJc w:val="left"/>
+      <w:pPr>
+        <w:tabs>
+          <w:tab w:val="num" w:pos="720"/>
+        </w:tabs>
+        <w:ind w:left="720" w:hanging="360"/>
+      </w:pPr>
+      <w:rPr>
+        <w:rFonts w:ascii="Symbol" w:hAnsi="Symbol" w:hint="default"/>
+        <w:sz w:val="20"/>
+      </w:rPr>
+    </w:lvl>
+    <w:lvl w:ilvl="1" w:tentative="1">
+      <w:start w:val="1"/>
+      <w:numFmt w:val="bullet"/>
+      <w:lvlText w:val="o"/>
+      <w:lvlJc w:val="left"/>
+      <w:pPr>
+        <w:tabs>
+          <w:tab w:val="num" w:pos="1440"/>
+        </w:tabs>
+        <w:ind w:left="1440" w:hanging="360"/>
+      </w:pPr>
+      <w:rPr>
+        <w:rFonts w:ascii="Courier New" w:hAnsi="Courier New" w:hint="default"/>
+        <w:sz w:val="20"/>
+      </w:rPr>
+    </w:lvl>
+    <w:lvl w:ilvl="2" w:tentative="1">
+      <w:start w:val="1"/>
+      <w:numFmt w:val="bullet"/>
+      <w:lvlText w:val=""/>
+      <w:lvlJc w:val="left"/>
+      <w:pPr>
+        <w:tabs>
+          <w:tab w:val="num" w:pos="2160"/>
+        </w:tabs>
+        <w:ind w:left="2160" w:hanging="360"/>
+      </w:pPr>
+      <w:rPr>
+        <w:rFonts w:ascii="Wingdings" w:hAnsi="Wingdings" w:hint="default"/>
+        <w:sz w:val="20"/>
+      </w:rPr>
+    </w:lvl>
+    <w:lvl w:ilvl="3" w:tentative="1">
+      <w:start w:val="1"/>
+      <w:numFmt w:val="bullet"/>
+      <w:lvlText w:val=""/>
+      <w:lvlJc w:val="left"/>
+      <w:pPr>
+        <w:tabs>
+          <w:tab w:val="num" w:pos="2880"/>
+        </w:tabs>
+        <w:ind w:left="2880" w:hanging="360"/>
+      </w:pPr>
+      <w:rPr>
+        <w:rFonts w:ascii="Wingdings" w:hAnsi="Wingdings" w:hint="default"/>
+        <w:sz w:val="20"/>
+      </w:rPr>
+    </w:lvl>
+    <w:lvl w:ilvl="4" w:tentative="1">
+      <w:start w:val="1"/>
+      <w:numFmt w:val="bullet"/>
+      <w:lvlText w:val=""/>
+      <w:lvlJc w:val="left"/>
+      <w:pPr>
+        <w:tabs>
+          <w:tab w:val="num" w:pos="3600"/>
+        </w:tabs>
+        <w:ind w:left="3600" w:hanging="360"/>
+      </w:pPr>
+      <w:rPr>
+        <w:rFonts w:ascii="Wingdings" w:hAnsi="Wingdings" w:hint="default"/>
+        <w:sz w:val="20"/>
+      </w:rPr>
+    </w:lvl>
+    <w:lvl w:ilvl="5" w:tentative="1">
+      <w:start w:val="1"/>
+      <w:numFmt w:val="bullet"/>
+      <w:lvlText w:val=""/>
+      <w:lvlJc w:val="left"/>
+      <w:pPr>
+        <w:tabs>
+          <w:tab w:val="num" w:pos="4320"/>
+        </w:tabs>
+        <w:ind w:left="4320" w:hanging="360"/>
+      </w:pPr>
+      <w:rPr>
+        <w:rFonts w:ascii="Wingdings" w:hAnsi="Wingdings" w:hint="default"/>
+        <w:sz w:val="20"/>
+      </w:rPr>
+    </w:lvl>
+    <w:lvl w:ilvl="6" w:tentative="1">
+      <w:start w:val="1"/>
+      <w:numFmt w:val="bullet"/>
+      <w:lvlText w:val=""/>
+      <w:lvlJc w:val="left"/>
+      <w:pPr>
+        <w:tabs>
+          <w:tab w:val="num" w:pos="5040"/>
+        </w:tabs>
+        <w:ind w:left="5040" w:hanging="360"/>
+      </w:pPr>
+      <w:rPr>
+        <w:rFonts w:ascii="Wingdings" w:hAnsi="Wingdings" w:hint="default"/>
+        <w:sz w:val="20"/>
+      </w:rPr>
+    </w:lvl>
+    <w:lvl w:ilvl="7" w:tentative="1">
+      <w:start w:val="1"/>
+      <w:numFmt w:val="bullet"/>
+      <w:lvlText w:val=""/>
+      <w:lvlJc w:val="left"/>
+      <w:pPr>
+        <w:tabs>
+          <w:tab w:val="num" w:pos="5760"/>
+        </w:tabs>
+        <w:ind w:left="5760" w:hanging="360"/>
+      </w:pPr>
+      <w:rPr>
+        <w:rFonts w:ascii="Wingdings" w:hAnsi="Wingdings" w:hint="default"/>
+        <w:sz w:val="20"/>
+      </w:rPr>
+    </w:lvl>
+    <w:lvl w:ilvl="8" w:tentative="1">
+      <w:start w:val="1"/>
+      <w:numFmt w:val="bullet"/>
+      <w:lvlText w:val=""/>
+      <w:lvlJc w:val="left"/>
+      <w:pPr>
+        <w:tabs>
+          <w:tab w:val="num" w:pos="6480"/>
+        </w:tabs>
+        <w:ind w:left="6480" w:hanging="360"/>
+      </w:pPr>
+      <w:rPr>
+        <w:rFonts w:ascii="Wingdings" w:hAnsi="Wingdings" w:hint="default"/>
+        <w:sz w:val="20"/>
+      </w:rPr>
+    </w:lvl>
+  </w:abstractNum>
+  <w:abstractNum w:abstractNumId="10" w15:restartNumberingAfterBreak="0">
     <w:nsid w:val="3EC96FB4"/>
     <w:multiLevelType w:val="multilevel"/>
     <w:tmpl w:val="5CF0F000"/>
@@ -1989,7 +2856,7 @@
       </w:rPr>
     </w:lvl>
   </w:abstractNum>
-  <w:abstractNum w:abstractNumId="7" w15:restartNumberingAfterBreak="0">
+  <w:abstractNum w:abstractNumId="11" w15:restartNumberingAfterBreak="0">
     <w:nsid w:val="3ECC4647"/>
     <w:multiLevelType w:val="multilevel"/>
     <w:tmpl w:val="ABEE4BA2"/>
@@ -2102,7 +2969,7 @@
       </w:pPr>
     </w:lvl>
   </w:abstractNum>
-  <w:abstractNum w:abstractNumId="8" w15:restartNumberingAfterBreak="0">
+  <w:abstractNum w:abstractNumId="12" w15:restartNumberingAfterBreak="0">
     <w:nsid w:val="47CC1A89"/>
     <w:multiLevelType w:val="multilevel"/>
     <w:tmpl w:val="650CEE58"/>
@@ -2251,7 +3118,7 @@
       </w:rPr>
     </w:lvl>
   </w:abstractNum>
-  <w:abstractNum w:abstractNumId="9" w15:restartNumberingAfterBreak="0">
+  <w:abstractNum w:abstractNumId="13" w15:restartNumberingAfterBreak="0">
     <w:nsid w:val="48397FB2"/>
     <w:multiLevelType w:val="multilevel"/>
     <w:tmpl w:val="3B3E1206"/>
@@ -2364,7 +3231,156 @@
       </w:pPr>
     </w:lvl>
   </w:abstractNum>
-  <w:abstractNum w:abstractNumId="10" w15:restartNumberingAfterBreak="0">
+  <w:abstractNum w:abstractNumId="14" w15:restartNumberingAfterBreak="0">
+    <w:nsid w:val="4F064C07"/>
+    <w:multiLevelType w:val="multilevel"/>
+    <w:tmpl w:val="D174CC7C"/>
+    <w:lvl w:ilvl="0">
+      <w:start w:val="1"/>
+      <w:numFmt w:val="bullet"/>
+      <w:lvlText w:val=""/>
+      <w:lvlJc w:val="left"/>
+      <w:pPr>
+        <w:tabs>
+          <w:tab w:val="num" w:pos="720"/>
+        </w:tabs>
+        <w:ind w:left="720" w:hanging="360"/>
+      </w:pPr>
+      <w:rPr>
+        <w:rFonts w:ascii="Symbol" w:hAnsi="Symbol" w:hint="default"/>
+        <w:sz w:val="20"/>
+      </w:rPr>
+    </w:lvl>
+    <w:lvl w:ilvl="1" w:tentative="1">
+      <w:start w:val="1"/>
+      <w:numFmt w:val="bullet"/>
+      <w:lvlText w:val="o"/>
+      <w:lvlJc w:val="left"/>
+      <w:pPr>
+        <w:tabs>
+          <w:tab w:val="num" w:pos="1440"/>
+        </w:tabs>
+        <w:ind w:left="1440" w:hanging="360"/>
+      </w:pPr>
+      <w:rPr>
+        <w:rFonts w:ascii="Courier New" w:hAnsi="Courier New" w:hint="default"/>
+        <w:sz w:val="20"/>
+      </w:rPr>
+    </w:lvl>
+    <w:lvl w:ilvl="2" w:tentative="1">
+      <w:start w:val="1"/>
+      <w:numFmt w:val="bullet"/>
+      <w:lvlText w:val=""/>
+      <w:lvlJc w:val="left"/>
+      <w:pPr>
+        <w:tabs>
+          <w:tab w:val="num" w:pos="2160"/>
+        </w:tabs>
+        <w:ind w:left="2160" w:hanging="360"/>
+      </w:pPr>
+      <w:rPr>
+        <w:rFonts w:ascii="Wingdings" w:hAnsi="Wingdings" w:hint="default"/>
+        <w:sz w:val="20"/>
+      </w:rPr>
+    </w:lvl>
+    <w:lvl w:ilvl="3" w:tentative="1">
+      <w:start w:val="1"/>
+      <w:numFmt w:val="bullet"/>
+      <w:lvlText w:val=""/>
+      <w:lvlJc w:val="left"/>
+      <w:pPr>
+        <w:tabs>
+          <w:tab w:val="num" w:pos="2880"/>
+        </w:tabs>
+        <w:ind w:left="2880" w:hanging="360"/>
+      </w:pPr>
+      <w:rPr>
+        <w:rFonts w:ascii="Wingdings" w:hAnsi="Wingdings" w:hint="default"/>
+        <w:sz w:val="20"/>
+      </w:rPr>
+    </w:lvl>
+    <w:lvl w:ilvl="4" w:tentative="1">
+      <w:start w:val="1"/>
+      <w:numFmt w:val="bullet"/>
+      <w:lvlText w:val=""/>
+      <w:lvlJc w:val="left"/>
+      <w:pPr>
+        <w:tabs>
+          <w:tab w:val="num" w:pos="3600"/>
+        </w:tabs>
+        <w:ind w:left="3600" w:hanging="360"/>
+      </w:pPr>
+      <w:rPr>
+        <w:rFonts w:ascii="Wingdings" w:hAnsi="Wingdings" w:hint="default"/>
+        <w:sz w:val="20"/>
+      </w:rPr>
+    </w:lvl>
+    <w:lvl w:ilvl="5" w:tentative="1">
+      <w:start w:val="1"/>
+      <w:numFmt w:val="bullet"/>
+      <w:lvlText w:val=""/>
+      <w:lvlJc w:val="left"/>
+      <w:pPr>
+        <w:tabs>
+          <w:tab w:val="num" w:pos="4320"/>
+        </w:tabs>
+        <w:ind w:left="4320" w:hanging="360"/>
+      </w:pPr>
+      <w:rPr>
+        <w:rFonts w:ascii="Wingdings" w:hAnsi="Wingdings" w:hint="default"/>
+        <w:sz w:val="20"/>
+      </w:rPr>
+    </w:lvl>
+    <w:lvl w:ilvl="6" w:tentative="1">
+      <w:start w:val="1"/>
+      <w:numFmt w:val="bullet"/>
+      <w:lvlText w:val=""/>
+      <w:lvlJc w:val="left"/>
+      <w:pPr>
+        <w:tabs>
+          <w:tab w:val="num" w:pos="5040"/>
+        </w:tabs>
+        <w:ind w:left="5040" w:hanging="360"/>
+      </w:pPr>
+      <w:rPr>
+        <w:rFonts w:ascii="Wingdings" w:hAnsi="Wingdings" w:hint="default"/>
+        <w:sz w:val="20"/>
+      </w:rPr>
+    </w:lvl>
+    <w:lvl w:ilvl="7" w:tentative="1">
+      <w:start w:val="1"/>
+      <w:numFmt w:val="bullet"/>
+      <w:lvlText w:val=""/>
+      <w:lvlJc w:val="left"/>
+      <w:pPr>
+        <w:tabs>
+          <w:tab w:val="num" w:pos="5760"/>
+        </w:tabs>
+        <w:ind w:left="5760" w:hanging="360"/>
+      </w:pPr>
+      <w:rPr>
+        <w:rFonts w:ascii="Wingdings" w:hAnsi="Wingdings" w:hint="default"/>
+        <w:sz w:val="20"/>
+      </w:rPr>
+    </w:lvl>
+    <w:lvl w:ilvl="8" w:tentative="1">
+      <w:start w:val="1"/>
+      <w:numFmt w:val="bullet"/>
+      <w:lvlText w:val=""/>
+      <w:lvlJc w:val="left"/>
+      <w:pPr>
+        <w:tabs>
+          <w:tab w:val="num" w:pos="6480"/>
+        </w:tabs>
+        <w:ind w:left="6480" w:hanging="360"/>
+      </w:pPr>
+      <w:rPr>
+        <w:rFonts w:ascii="Wingdings" w:hAnsi="Wingdings" w:hint="default"/>
+        <w:sz w:val="20"/>
+      </w:rPr>
+    </w:lvl>
+  </w:abstractNum>
+  <w:abstractNum w:abstractNumId="15" w15:restartNumberingAfterBreak="0">
     <w:nsid w:val="516C695D"/>
     <w:multiLevelType w:val="multilevel"/>
     <w:tmpl w:val="C7D849C8"/>
@@ -2477,7 +3493,269 @@
       </w:pPr>
     </w:lvl>
   </w:abstractNum>
-  <w:abstractNum w:abstractNumId="11" w15:restartNumberingAfterBreak="0">
+  <w:abstractNum w:abstractNumId="16" w15:restartNumberingAfterBreak="0">
+    <w:nsid w:val="545F13AB"/>
+    <w:multiLevelType w:val="multilevel"/>
+    <w:tmpl w:val="58C01EAA"/>
+    <w:lvl w:ilvl="0">
+      <w:start w:val="1"/>
+      <w:numFmt w:val="decimal"/>
+      <w:lvlText w:val="%1."/>
+      <w:lvlJc w:val="left"/>
+      <w:pPr>
+        <w:tabs>
+          <w:tab w:val="num" w:pos="720"/>
+        </w:tabs>
+        <w:ind w:left="720" w:hanging="360"/>
+      </w:pPr>
+    </w:lvl>
+    <w:lvl w:ilvl="1" w:tentative="1">
+      <w:start w:val="1"/>
+      <w:numFmt w:val="decimal"/>
+      <w:lvlText w:val="%2."/>
+      <w:lvlJc w:val="left"/>
+      <w:pPr>
+        <w:tabs>
+          <w:tab w:val="num" w:pos="1440"/>
+        </w:tabs>
+        <w:ind w:left="1440" w:hanging="360"/>
+      </w:pPr>
+    </w:lvl>
+    <w:lvl w:ilvl="2" w:tentative="1">
+      <w:start w:val="1"/>
+      <w:numFmt w:val="decimal"/>
+      <w:lvlText w:val="%3."/>
+      <w:lvlJc w:val="left"/>
+      <w:pPr>
+        <w:tabs>
+          <w:tab w:val="num" w:pos="2160"/>
+        </w:tabs>
+        <w:ind w:left="2160" w:hanging="360"/>
+      </w:pPr>
+    </w:lvl>
+    <w:lvl w:ilvl="3" w:tentative="1">
+      <w:start w:val="1"/>
+      <w:numFmt w:val="decimal"/>
+      <w:lvlText w:val="%4."/>
+      <w:lvlJc w:val="left"/>
+      <w:pPr>
+        <w:tabs>
+          <w:tab w:val="num" w:pos="2880"/>
+        </w:tabs>
+        <w:ind w:left="2880" w:hanging="360"/>
+      </w:pPr>
+    </w:lvl>
+    <w:lvl w:ilvl="4" w:tentative="1">
+      <w:start w:val="1"/>
+      <w:numFmt w:val="decimal"/>
+      <w:lvlText w:val="%5."/>
+      <w:lvlJc w:val="left"/>
+      <w:pPr>
+        <w:tabs>
+          <w:tab w:val="num" w:pos="3600"/>
+        </w:tabs>
+        <w:ind w:left="3600" w:hanging="360"/>
+      </w:pPr>
+    </w:lvl>
+    <w:lvl w:ilvl="5" w:tentative="1">
+      <w:start w:val="1"/>
+      <w:numFmt w:val="decimal"/>
+      <w:lvlText w:val="%6."/>
+      <w:lvlJc w:val="left"/>
+      <w:pPr>
+        <w:tabs>
+          <w:tab w:val="num" w:pos="4320"/>
+        </w:tabs>
+        <w:ind w:left="4320" w:hanging="360"/>
+      </w:pPr>
+    </w:lvl>
+    <w:lvl w:ilvl="6" w:tentative="1">
+      <w:start w:val="1"/>
+      <w:numFmt w:val="decimal"/>
+      <w:lvlText w:val="%7."/>
+      <w:lvlJc w:val="left"/>
+      <w:pPr>
+        <w:tabs>
+          <w:tab w:val="num" w:pos="5040"/>
+        </w:tabs>
+        <w:ind w:left="5040" w:hanging="360"/>
+      </w:pPr>
+    </w:lvl>
+    <w:lvl w:ilvl="7" w:tentative="1">
+      <w:start w:val="1"/>
+      <w:numFmt w:val="decimal"/>
+      <w:lvlText w:val="%8."/>
+      <w:lvlJc w:val="left"/>
+      <w:pPr>
+        <w:tabs>
+          <w:tab w:val="num" w:pos="5760"/>
+        </w:tabs>
+        <w:ind w:left="5760" w:hanging="360"/>
+      </w:pPr>
+    </w:lvl>
+    <w:lvl w:ilvl="8" w:tentative="1">
+      <w:start w:val="1"/>
+      <w:numFmt w:val="decimal"/>
+      <w:lvlText w:val="%9."/>
+      <w:lvlJc w:val="left"/>
+      <w:pPr>
+        <w:tabs>
+          <w:tab w:val="num" w:pos="6480"/>
+        </w:tabs>
+        <w:ind w:left="6480" w:hanging="360"/>
+      </w:pPr>
+    </w:lvl>
+  </w:abstractNum>
+  <w:abstractNum w:abstractNumId="17" w15:restartNumberingAfterBreak="0">
+    <w:nsid w:val="56B17E38"/>
+    <w:multiLevelType w:val="multilevel"/>
+    <w:tmpl w:val="17E0525A"/>
+    <w:lvl w:ilvl="0">
+      <w:start w:val="1"/>
+      <w:numFmt w:val="bullet"/>
+      <w:lvlText w:val=""/>
+      <w:lvlJc w:val="left"/>
+      <w:pPr>
+        <w:tabs>
+          <w:tab w:val="num" w:pos="720"/>
+        </w:tabs>
+        <w:ind w:left="720" w:hanging="360"/>
+      </w:pPr>
+      <w:rPr>
+        <w:rFonts w:ascii="Symbol" w:hAnsi="Symbol" w:hint="default"/>
+        <w:sz w:val="20"/>
+      </w:rPr>
+    </w:lvl>
+    <w:lvl w:ilvl="1" w:tentative="1">
+      <w:start w:val="1"/>
+      <w:numFmt w:val="bullet"/>
+      <w:lvlText w:val="o"/>
+      <w:lvlJc w:val="left"/>
+      <w:pPr>
+        <w:tabs>
+          <w:tab w:val="num" w:pos="1440"/>
+        </w:tabs>
+        <w:ind w:left="1440" w:hanging="360"/>
+      </w:pPr>
+      <w:rPr>
+        <w:rFonts w:ascii="Courier New" w:hAnsi="Courier New" w:hint="default"/>
+        <w:sz w:val="20"/>
+      </w:rPr>
+    </w:lvl>
+    <w:lvl w:ilvl="2" w:tentative="1">
+      <w:start w:val="1"/>
+      <w:numFmt w:val="bullet"/>
+      <w:lvlText w:val=""/>
+      <w:lvlJc w:val="left"/>
+      <w:pPr>
+        <w:tabs>
+          <w:tab w:val="num" w:pos="2160"/>
+        </w:tabs>
+        <w:ind w:left="2160" w:hanging="360"/>
+      </w:pPr>
+      <w:rPr>
+        <w:rFonts w:ascii="Wingdings" w:hAnsi="Wingdings" w:hint="default"/>
+        <w:sz w:val="20"/>
+      </w:rPr>
+    </w:lvl>
+    <w:lvl w:ilvl="3" w:tentative="1">
+      <w:start w:val="1"/>
+      <w:numFmt w:val="bullet"/>
+      <w:lvlText w:val=""/>
+      <w:lvlJc w:val="left"/>
+      <w:pPr>
+        <w:tabs>
+          <w:tab w:val="num" w:pos="2880"/>
+        </w:tabs>
+        <w:ind w:left="2880" w:hanging="360"/>
+      </w:pPr>
+      <w:rPr>
+        <w:rFonts w:ascii="Wingdings" w:hAnsi="Wingdings" w:hint="default"/>
+        <w:sz w:val="20"/>
+      </w:rPr>
+    </w:lvl>
+    <w:lvl w:ilvl="4" w:tentative="1">
+      <w:start w:val="1"/>
+      <w:numFmt w:val="bullet"/>
+      <w:lvlText w:val=""/>
+      <w:lvlJc w:val="left"/>
+      <w:pPr>
+        <w:tabs>
+          <w:tab w:val="num" w:pos="3600"/>
+        </w:tabs>
+        <w:ind w:left="3600" w:hanging="360"/>
+      </w:pPr>
+      <w:rPr>
+        <w:rFonts w:ascii="Wingdings" w:hAnsi="Wingdings" w:hint="default"/>
+        <w:sz w:val="20"/>
+      </w:rPr>
+    </w:lvl>
+    <w:lvl w:ilvl="5" w:tentative="1">
+      <w:start w:val="1"/>
+      <w:numFmt w:val="bullet"/>
+      <w:lvlText w:val=""/>
+      <w:lvlJc w:val="left"/>
+      <w:pPr>
+        <w:tabs>
+          <w:tab w:val="num" w:pos="4320"/>
+        </w:tabs>
+        <w:ind w:left="4320" w:hanging="360"/>
+      </w:pPr>
+      <w:rPr>
+        <w:rFonts w:ascii="Wingdings" w:hAnsi="Wingdings" w:hint="default"/>
+        <w:sz w:val="20"/>
+      </w:rPr>
+    </w:lvl>
+    <w:lvl w:ilvl="6" w:tentative="1">
+      <w:start w:val="1"/>
+      <w:numFmt w:val="bullet"/>
+      <w:lvlText w:val=""/>
+      <w:lvlJc w:val="left"/>
+      <w:pPr>
+        <w:tabs>
+          <w:tab w:val="num" w:pos="5040"/>
+        </w:tabs>
+        <w:ind w:left="5040" w:hanging="360"/>
+      </w:pPr>
+      <w:rPr>
+        <w:rFonts w:ascii="Wingdings" w:hAnsi="Wingdings" w:hint="default"/>
+        <w:sz w:val="20"/>
+      </w:rPr>
+    </w:lvl>
+    <w:lvl w:ilvl="7" w:tentative="1">
+      <w:start w:val="1"/>
+      <w:numFmt w:val="bullet"/>
+      <w:lvlText w:val=""/>
+      <w:lvlJc w:val="left"/>
+      <w:pPr>
+        <w:tabs>
+          <w:tab w:val="num" w:pos="5760"/>
+        </w:tabs>
+        <w:ind w:left="5760" w:hanging="360"/>
+      </w:pPr>
+      <w:rPr>
+        <w:rFonts w:ascii="Wingdings" w:hAnsi="Wingdings" w:hint="default"/>
+        <w:sz w:val="20"/>
+      </w:rPr>
+    </w:lvl>
+    <w:lvl w:ilvl="8" w:tentative="1">
+      <w:start w:val="1"/>
+      <w:numFmt w:val="bullet"/>
+      <w:lvlText w:val=""/>
+      <w:lvlJc w:val="left"/>
+      <w:pPr>
+        <w:tabs>
+          <w:tab w:val="num" w:pos="6480"/>
+        </w:tabs>
+        <w:ind w:left="6480" w:hanging="360"/>
+      </w:pPr>
+      <w:rPr>
+        <w:rFonts w:ascii="Wingdings" w:hAnsi="Wingdings" w:hint="default"/>
+        <w:sz w:val="20"/>
+      </w:rPr>
+    </w:lvl>
+  </w:abstractNum>
+  <w:abstractNum w:abstractNumId="18" w15:restartNumberingAfterBreak="0">
     <w:nsid w:val="5DE023C2"/>
     <w:multiLevelType w:val="multilevel"/>
     <w:tmpl w:val="225C8F1A"/>
@@ -2590,7 +3868,7 @@
       </w:pPr>
     </w:lvl>
   </w:abstractNum>
-  <w:abstractNum w:abstractNumId="12" w15:restartNumberingAfterBreak="0">
+  <w:abstractNum w:abstractNumId="19" w15:restartNumberingAfterBreak="0">
     <w:nsid w:val="5FD83B9C"/>
     <w:multiLevelType w:val="multilevel"/>
     <w:tmpl w:val="243091DE"/>
@@ -2739,7 +4017,7 @@
       </w:rPr>
     </w:lvl>
   </w:abstractNum>
-  <w:abstractNum w:abstractNumId="13" w15:restartNumberingAfterBreak="0">
+  <w:abstractNum w:abstractNumId="20" w15:restartNumberingAfterBreak="0">
     <w:nsid w:val="775138DB"/>
     <w:multiLevelType w:val="multilevel"/>
     <w:tmpl w:val="BB16D816"/>
@@ -2889,7 +4167,7 @@
     </w:lvl>
   </w:abstractNum>
   <w:num w:numId="1" w16cid:durableId="789280021">
-    <w:abstractNumId w:val="8"/>
+    <w:abstractNumId w:val="12"/>
   </w:num>
   <w:num w:numId="2" w16cid:durableId="137504928">
     <w:abstractNumId w:val="1"/>
@@ -2898,10 +4176,10 @@
     <w:abstractNumId w:val="0"/>
   </w:num>
   <w:num w:numId="4" w16cid:durableId="2078428977">
-    <w:abstractNumId w:val="5"/>
+    <w:abstractNumId w:val="7"/>
   </w:num>
   <w:num w:numId="5" w16cid:durableId="1702243630">
-    <w:abstractNumId w:val="10"/>
+    <w:abstractNumId w:val="15"/>
   </w:num>
   <w:num w:numId="6" w16cid:durableId="1139302666">
     <w:abstractNumId w:val="2"/>
@@ -2910,25 +4188,46 @@
     <w:abstractNumId w:val="4"/>
   </w:num>
   <w:num w:numId="8" w16cid:durableId="640118813">
-    <w:abstractNumId w:val="11"/>
+    <w:abstractNumId w:val="18"/>
   </w:num>
   <w:num w:numId="9" w16cid:durableId="342441912">
     <w:abstractNumId w:val="3"/>
   </w:num>
   <w:num w:numId="10" w16cid:durableId="1509635353">
-    <w:abstractNumId w:val="6"/>
+    <w:abstractNumId w:val="10"/>
   </w:num>
   <w:num w:numId="11" w16cid:durableId="1744329482">
+    <w:abstractNumId w:val="13"/>
+  </w:num>
+  <w:num w:numId="12" w16cid:durableId="766316797">
+    <w:abstractNumId w:val="20"/>
+  </w:num>
+  <w:num w:numId="13" w16cid:durableId="1252855900">
+    <w:abstractNumId w:val="19"/>
+  </w:num>
+  <w:num w:numId="14" w16cid:durableId="216819548">
+    <w:abstractNumId w:val="11"/>
+  </w:num>
+  <w:num w:numId="15" w16cid:durableId="482507873">
+    <w:abstractNumId w:val="14"/>
+  </w:num>
+  <w:num w:numId="16" w16cid:durableId="1311985462">
+    <w:abstractNumId w:val="17"/>
+  </w:num>
+  <w:num w:numId="17" w16cid:durableId="808939429">
+    <w:abstractNumId w:val="8"/>
+  </w:num>
+  <w:num w:numId="18" w16cid:durableId="1713189035">
     <w:abstractNumId w:val="9"/>
   </w:num>
-  <w:num w:numId="12" w16cid:durableId="766316797">
-    <w:abstractNumId w:val="13"/>
+  <w:num w:numId="19" w16cid:durableId="1482308862">
+    <w:abstractNumId w:val="16"/>
   </w:num>
-  <w:num w:numId="13" w16cid:durableId="1252855900">
-    <w:abstractNumId w:val="12"/>
+  <w:num w:numId="20" w16cid:durableId="685987202">
+    <w:abstractNumId w:val="5"/>
   </w:num>
-  <w:num w:numId="14" w16cid:durableId="216819548">
-    <w:abstractNumId w:val="7"/>
+  <w:num w:numId="21" w16cid:durableId="259603926">
+    <w:abstractNumId w:val="6"/>
   </w:num>
 </w:numbering>
 </file>

</xml_diff>

<commit_message>
Live Stripe Integration and MVP Auth lock
</commit_message>
<xml_diff>
--- a/Project ARES Recovery Prompt.docx
+++ b/Project ARES Recovery Prompt.docx
@@ -14,7 +14,7 @@
           <w:b/>
           <w:bCs/>
         </w:rPr>
-        <w:t>FILE 3: PROJECT ARES - BUSINESS BLUEPRINT &amp; PROGRESS (Updated May 3, 2026)</w:t>
+        <w:t>FILE 3: PROJECT ARES - BUSINESS BLUEPRINT &amp; PROGRESS (Updated)</w:t>
       </w:r>
     </w:p>
     <w:p>
@@ -59,7 +59,7 @@
       <w:pPr>
         <w:numPr>
           <w:ilvl w:val="0"/>
-          <w:numId w:val="18"/>
+          <w:numId w:val="22"/>
         </w:numPr>
         <w:rPr>
           <w:b/>
@@ -78,7 +78,7 @@
       <w:pPr>
         <w:numPr>
           <w:ilvl w:val="0"/>
-          <w:numId w:val="18"/>
+          <w:numId w:val="22"/>
         </w:numPr>
         <w:rPr>
           <w:b/>
@@ -97,7 +97,7 @@
       <w:pPr>
         <w:numPr>
           <w:ilvl w:val="0"/>
-          <w:numId w:val="18"/>
+          <w:numId w:val="22"/>
         </w:numPr>
         <w:rPr>
           <w:b/>
@@ -116,7 +116,7 @@
       <w:pPr>
         <w:numPr>
           <w:ilvl w:val="0"/>
-          <w:numId w:val="18"/>
+          <w:numId w:val="22"/>
         </w:numPr>
         <w:rPr>
           <w:b/>
@@ -143,180 +143,6 @@
           <w:b/>
           <w:bCs/>
         </w:rPr>
-        <w:t>LEGAL &amp; COMPLIANCE DOCTRINE (The Corporate Armor):</w:t>
-      </w:r>
-    </w:p>
-    <w:p>
-      <w:pPr>
-        <w:numPr>
-          <w:ilvl w:val="0"/>
-          <w:numId w:val="19"/>
-        </w:numPr>
-        <w:rPr>
-          <w:b/>
-          <w:bCs/>
-        </w:rPr>
-      </w:pPr>
-      <w:r>
-        <w:rPr>
-          <w:b/>
-          <w:bCs/>
-        </w:rPr>
-        <w:t>Lexicon Control (SEC Shield): The app and marketing materials will never use the words "Buy," "Sell," "Long," or "Short." Output is strictly limited to "Support Zones," "Liquidation Clusters," and "Market Posture."</w:t>
-      </w:r>
-    </w:p>
-    <w:p>
-      <w:pPr>
-        <w:numPr>
-          <w:ilvl w:val="0"/>
-          <w:numId w:val="19"/>
-        </w:numPr>
-        <w:rPr>
-          <w:b/>
-          <w:bCs/>
-        </w:rPr>
-      </w:pPr>
-      <w:r>
-        <w:rPr>
-          <w:b/>
-          <w:bCs/>
-        </w:rPr>
-        <w:t>The Corporate Veil (Civil Shield): Operations will be conducted under a registered LLC to completely isolate the Founder's personal crypto wealth from business liability.</w:t>
-      </w:r>
-    </w:p>
-    <w:p>
-      <w:pPr>
-        <w:numPr>
-          <w:ilvl w:val="0"/>
-          <w:numId w:val="19"/>
-        </w:numPr>
-        <w:rPr>
-          <w:b/>
-          <w:bCs/>
-        </w:rPr>
-      </w:pPr>
-      <w:r>
-        <w:rPr>
-          <w:b/>
-          <w:bCs/>
-        </w:rPr>
-        <w:t>The Click-Wrap Agreement: Users must physically check a box agreeing to the Terms of Service (stating the app is an "As-Is" educational data tool, not financial advice, and the AI is prone to errors) before the Stripe checkout loads.</w:t>
-      </w:r>
-    </w:p>
-    <w:p>
-      <w:pPr>
-        <w:numPr>
-          <w:ilvl w:val="0"/>
-          <w:numId w:val="19"/>
-        </w:numPr>
-        <w:rPr>
-          <w:b/>
-          <w:bCs/>
-        </w:rPr>
-      </w:pPr>
-      <w:r>
-        <w:rPr>
-          <w:b/>
-          <w:bCs/>
-        </w:rPr>
-        <w:t>FTC Compliance: The Stripe Customer Portal will be integrated to allow mandatory 1-click subscription cancellations.</w:t>
-      </w:r>
-    </w:p>
-    <w:p>
-      <w:pPr>
-        <w:numPr>
-          <w:ilvl w:val="0"/>
-          <w:numId w:val="19"/>
-        </w:numPr>
-        <w:rPr>
-          <w:b/>
-          <w:bCs/>
-        </w:rPr>
-      </w:pPr>
-      <w:r>
-        <w:rPr>
-          <w:b/>
-          <w:bCs/>
-        </w:rPr>
-        <w:t xml:space="preserve">Data Legitimacy Pivot: Web scraping (Puppeteer) is authorized for </w:t>
-      </w:r>
-      <w:proofErr w:type="gramStart"/>
-      <w:r>
-        <w:rPr>
-          <w:b/>
-          <w:bCs/>
-        </w:rPr>
-        <w:t>the free</w:t>
-      </w:r>
-      <w:proofErr w:type="gramEnd"/>
-      <w:r>
-        <w:rPr>
-          <w:b/>
-          <w:bCs/>
-        </w:rPr>
-        <w:t xml:space="preserve"> Beta. Upon reaching 20 paying users ($600/</w:t>
-      </w:r>
-      <w:proofErr w:type="spellStart"/>
-      <w:r>
-        <w:rPr>
-          <w:b/>
-          <w:bCs/>
-        </w:rPr>
-        <w:t>mo</w:t>
-      </w:r>
-      <w:proofErr w:type="spellEnd"/>
-      <w:r>
-        <w:rPr>
-          <w:b/>
-          <w:bCs/>
-        </w:rPr>
-        <w:t xml:space="preserve"> MRR), revenue will be diverted to purchase official, commercial API licenses from </w:t>
-      </w:r>
-      <w:proofErr w:type="spellStart"/>
-      <w:r>
-        <w:rPr>
-          <w:b/>
-          <w:bCs/>
-        </w:rPr>
-        <w:t>Coinglass</w:t>
-      </w:r>
-      <w:proofErr w:type="spellEnd"/>
-      <w:r>
-        <w:rPr>
-          <w:b/>
-          <w:bCs/>
-        </w:rPr>
-        <w:t xml:space="preserve"> and </w:t>
-      </w:r>
-      <w:proofErr w:type="spellStart"/>
-      <w:r>
-        <w:rPr>
-          <w:b/>
-          <w:bCs/>
-        </w:rPr>
-        <w:t>Farside</w:t>
-      </w:r>
-      <w:proofErr w:type="spellEnd"/>
-      <w:r>
-        <w:rPr>
-          <w:b/>
-          <w:bCs/>
-        </w:rPr>
-        <w:t xml:space="preserve"> to prevent IP lawsuits and IP bans.</w:t>
-      </w:r>
-    </w:p>
-    <w:p>
-      <w:pPr>
-        <w:rPr>
-          <w:b/>
-          <w:bCs/>
-        </w:rPr>
-      </w:pPr>
-      <w:r>
-        <w:rPr>
-          <w:b/>
-          <w:bCs/>
-        </w:rPr>
         <w:t>THE TECH STACK (Antigravity Protocol):</w:t>
       </w:r>
     </w:p>
@@ -324,7 +150,7 @@
       <w:pPr>
         <w:numPr>
           <w:ilvl w:val="0"/>
-          <w:numId w:val="20"/>
+          <w:numId w:val="23"/>
         </w:numPr>
         <w:rPr>
           <w:b/>
@@ -343,7 +169,7 @@
       <w:pPr>
         <w:numPr>
           <w:ilvl w:val="0"/>
-          <w:numId w:val="20"/>
+          <w:numId w:val="23"/>
         </w:numPr>
         <w:rPr>
           <w:b/>
@@ -355,7 +181,6 @@
           <w:b/>
           <w:bCs/>
         </w:rPr>
-        <w:lastRenderedPageBreak/>
         <w:t>The IDE / Development Team: Google Antigravity (Autonomous Agent Manager).</w:t>
       </w:r>
     </w:p>
@@ -363,7 +188,7 @@
       <w:pPr>
         <w:numPr>
           <w:ilvl w:val="0"/>
-          <w:numId w:val="20"/>
+          <w:numId w:val="23"/>
         </w:numPr>
         <w:rPr>
           <w:b/>
@@ -382,7 +207,7 @@
       <w:pPr>
         <w:numPr>
           <w:ilvl w:val="0"/>
-          <w:numId w:val="20"/>
+          <w:numId w:val="23"/>
         </w:numPr>
         <w:rPr>
           <w:b/>
@@ -394,62 +219,14 @@
           <w:b/>
           <w:bCs/>
         </w:rPr>
-        <w:t>The Sensors: </w:t>
-      </w:r>
-      <w:proofErr w:type="spellStart"/>
-      <w:r>
-        <w:rPr>
-          <w:b/>
-          <w:bCs/>
-        </w:rPr>
-        <w:t>CoinGecko</w:t>
-      </w:r>
-      <w:proofErr w:type="spellEnd"/>
-      <w:r>
-        <w:rPr>
-          <w:b/>
-          <w:bCs/>
-        </w:rPr>
-        <w:t xml:space="preserve"> API (Prices/Fear Index), Puppeteer/Browser Agent (Scraping </w:t>
-      </w:r>
-      <w:proofErr w:type="spellStart"/>
-      <w:r>
-        <w:rPr>
-          <w:b/>
-          <w:bCs/>
-        </w:rPr>
-        <w:t>Farside</w:t>
-      </w:r>
-      <w:proofErr w:type="spellEnd"/>
-      <w:r>
-        <w:rPr>
-          <w:b/>
-          <w:bCs/>
-        </w:rPr>
-        <w:t xml:space="preserve"> ETF Flows and </w:t>
-      </w:r>
-      <w:proofErr w:type="spellStart"/>
-      <w:r>
-        <w:rPr>
-          <w:b/>
-          <w:bCs/>
-        </w:rPr>
-        <w:t>Coinglass</w:t>
-      </w:r>
-      <w:proofErr w:type="spellEnd"/>
-      <w:r>
-        <w:rPr>
-          <w:b/>
-          <w:bCs/>
-        </w:rPr>
-        <w:t xml:space="preserve"> Heatmaps).</w:t>
+        <w:t>The Sensors: CoinGecko API (Prices/Fear Index), Puppeteer/Browser Agent (Scraping Farside ETF Flows and Coinglass Heatmaps).</w:t>
       </w:r>
     </w:p>
     <w:p>
       <w:pPr>
         <w:numPr>
           <w:ilvl w:val="0"/>
-          <w:numId w:val="20"/>
+          <w:numId w:val="23"/>
         </w:numPr>
         <w:rPr>
           <w:b/>
@@ -461,165 +238,7 @@
           <w:b/>
           <w:bCs/>
         </w:rPr>
-        <w:t xml:space="preserve">The Body: React Web App (Tailwind CSS, </w:t>
-      </w:r>
-      <w:proofErr w:type="spellStart"/>
-      <w:r>
-        <w:rPr>
-          <w:b/>
-          <w:bCs/>
-        </w:rPr>
-        <w:t>Glassmorphism</w:t>
-      </w:r>
-      <w:proofErr w:type="spellEnd"/>
-      <w:r>
-        <w:rPr>
-          <w:b/>
-          <w:bCs/>
-        </w:rPr>
-        <w:t xml:space="preserve"> UI). Hosted on </w:t>
-      </w:r>
-      <w:proofErr w:type="spellStart"/>
-      <w:r>
-        <w:rPr>
-          <w:b/>
-          <w:bCs/>
-        </w:rPr>
-        <w:t>Vercel</w:t>
-      </w:r>
-      <w:proofErr w:type="spellEnd"/>
-      <w:r>
-        <w:rPr>
-          <w:b/>
-          <w:bCs/>
-        </w:rPr>
-        <w:t>.</w:t>
-      </w:r>
-    </w:p>
-    <w:p>
-      <w:pPr>
-        <w:rPr>
-          <w:b/>
-          <w:bCs/>
-        </w:rPr>
-      </w:pPr>
-      <w:r>
-        <w:rPr>
-          <w:b/>
-          <w:bCs/>
-        </w:rPr>
-        <w:t>CORE APP FEATURES:</w:t>
-      </w:r>
-    </w:p>
-    <w:p>
-      <w:pPr>
-        <w:numPr>
-          <w:ilvl w:val="0"/>
-          <w:numId w:val="21"/>
-        </w:numPr>
-        <w:rPr>
-          <w:b/>
-          <w:bCs/>
-        </w:rPr>
-      </w:pPr>
-      <w:r>
-        <w:rPr>
-          <w:b/>
-          <w:bCs/>
-        </w:rPr>
-        <w:t>The Posture Shield: AI-driven market stance (Defensive/Aggressive/Danger).</w:t>
-      </w:r>
-    </w:p>
-    <w:p>
-      <w:pPr>
-        <w:numPr>
-          <w:ilvl w:val="0"/>
-          <w:numId w:val="21"/>
-        </w:numPr>
-        <w:rPr>
-          <w:b/>
-          <w:bCs/>
-        </w:rPr>
-      </w:pPr>
-      <w:r>
-        <w:rPr>
-          <w:b/>
-          <w:bCs/>
-        </w:rPr>
-        <w:t>The Kill Zone Targets: Exact limit order coordinates based on liquidation heatmaps.</w:t>
-      </w:r>
-    </w:p>
-    <w:p>
-      <w:pPr>
-        <w:numPr>
-          <w:ilvl w:val="0"/>
-          <w:numId w:val="21"/>
-        </w:numPr>
-        <w:rPr>
-          <w:b/>
-          <w:bCs/>
-        </w:rPr>
-      </w:pPr>
-      <w:r>
-        <w:rPr>
-          <w:b/>
-          <w:bCs/>
-        </w:rPr>
-        <w:t>The Field Manual: Built-in educational onboarding for users.</w:t>
-      </w:r>
-    </w:p>
-    <w:p>
-      <w:pPr>
-        <w:numPr>
-          <w:ilvl w:val="0"/>
-          <w:numId w:val="21"/>
-        </w:numPr>
-        <w:rPr>
-          <w:b/>
-          <w:bCs/>
-        </w:rPr>
-      </w:pPr>
-      <w:r>
-        <w:rPr>
-          <w:b/>
-          <w:bCs/>
-        </w:rPr>
-        <w:t>The Freemium Paywall: Blurred targets and padlock UI for free users to drive $29/</w:t>
-      </w:r>
-      <w:proofErr w:type="spellStart"/>
-      <w:r>
-        <w:rPr>
-          <w:b/>
-          <w:bCs/>
-        </w:rPr>
-        <w:t>mo</w:t>
-      </w:r>
-      <w:proofErr w:type="spellEnd"/>
-      <w:r>
-        <w:rPr>
-          <w:b/>
-          <w:bCs/>
-        </w:rPr>
-        <w:t xml:space="preserve"> conversions.</w:t>
-      </w:r>
-    </w:p>
-    <w:p>
-      <w:pPr>
-        <w:numPr>
-          <w:ilvl w:val="0"/>
-          <w:numId w:val="21"/>
-        </w:numPr>
-        <w:rPr>
-          <w:b/>
-          <w:bCs/>
-        </w:rPr>
-      </w:pPr>
-      <w:r>
-        <w:rPr>
-          <w:b/>
-          <w:bCs/>
-        </w:rPr>
-        <w:t>Pro Teasers (UI Mockups): Custom Altcoin Radar and Whale Watch ticker displayed to tease future backend updates.</w:t>
+        <w:t>The Body: React Web App (Tailwind CSS, Glassmorphism UI). Hosted on Vercel.</w:t>
       </w:r>
     </w:p>
     <w:p>
@@ -667,7 +286,6 @@
           <w:bCs/>
         </w:rPr>
       </w:pPr>
-      <w:proofErr w:type="gramStart"/>
       <w:r>
         <w:rPr>
           <w:b/>
@@ -675,17 +293,7 @@
           <w:i/>
           <w:iCs/>
         </w:rPr>
-        <w:t>Status:[</w:t>
-      </w:r>
-      <w:proofErr w:type="gramEnd"/>
-      <w:r>
-        <w:rPr>
-          <w:b/>
-          <w:bCs/>
-          <w:i/>
-          <w:iCs/>
-        </w:rPr>
-        <w:t>COMPLETED - April 29, 2026]</w:t>
+        <w:t>Status:[COMPLETED - April 29, 2026]</w:t>
       </w:r>
     </w:p>
     <w:p>
@@ -748,7 +356,6 @@
           <w:bCs/>
         </w:rPr>
       </w:pPr>
-      <w:proofErr w:type="gramStart"/>
       <w:r>
         <w:rPr>
           <w:b/>
@@ -756,17 +363,7 @@
           <w:i/>
           <w:iCs/>
         </w:rPr>
-        <w:t>Status:[</w:t>
-      </w:r>
-      <w:proofErr w:type="gramEnd"/>
-      <w:r>
-        <w:rPr>
-          <w:b/>
-          <w:bCs/>
-          <w:i/>
-          <w:iCs/>
-        </w:rPr>
-        <w:t>COMPLETED - May 2, 2026]</w:t>
+        <w:t>Status:[COMPLETED - May 2, 2026]</w:t>
       </w:r>
     </w:p>
     <w:p>
@@ -781,23 +378,8 @@
           <w:b/>
           <w:bCs/>
         </w:rPr>
-        <w:t xml:space="preserve">Secured </w:t>
-      </w:r>
-      <w:proofErr w:type="spellStart"/>
-      <w:r>
-        <w:rPr>
-          <w:b/>
-          <w:bCs/>
-        </w:rPr>
-        <w:t>CoinGecko</w:t>
-      </w:r>
-      <w:proofErr w:type="spellEnd"/>
-      <w:r>
-        <w:rPr>
-          <w:b/>
-          <w:bCs/>
-        </w:rPr>
-        <w:t xml:space="preserve"> API Key (Demo Tier).</w:t>
+        <w:lastRenderedPageBreak/>
+        <w:t>Secured CoinGecko API Key (Demo Tier).</w:t>
       </w:r>
     </w:p>
     <w:p>
@@ -812,25 +394,7 @@
           <w:b/>
           <w:bCs/>
         </w:rPr>
-        <w:t>Deployed Agent 1 (Backend Engineer). Agent successfully wrote index.js and </w:t>
-      </w:r>
-      <w:proofErr w:type="spellStart"/>
-      <w:proofErr w:type="gramStart"/>
-      <w:r>
-        <w:rPr>
-          <w:b/>
-          <w:bCs/>
-        </w:rPr>
-        <w:t>package.json</w:t>
-      </w:r>
-      <w:proofErr w:type="spellEnd"/>
-      <w:proofErr w:type="gramEnd"/>
-      <w:r>
-        <w:rPr>
-          <w:b/>
-          <w:bCs/>
-        </w:rPr>
-        <w:t>.</w:t>
+        <w:t>Deployed Agent 1 (Backend Engineer). Agent successfully wrote index.js and package.json.</w:t>
       </w:r>
     </w:p>
     <w:p>
@@ -845,55 +409,7 @@
           <w:b/>
           <w:bCs/>
         </w:rPr>
-        <w:lastRenderedPageBreak/>
-        <w:t xml:space="preserve">Executed live test. Pipeline successfully fetched </w:t>
-      </w:r>
-      <w:proofErr w:type="spellStart"/>
-      <w:r>
-        <w:rPr>
-          <w:b/>
-          <w:bCs/>
-        </w:rPr>
-        <w:t>CoinGecko</w:t>
-      </w:r>
-      <w:proofErr w:type="spellEnd"/>
-      <w:r>
-        <w:rPr>
-          <w:b/>
-          <w:bCs/>
-        </w:rPr>
-        <w:t xml:space="preserve"> data, bypassed </w:t>
-      </w:r>
-      <w:proofErr w:type="spellStart"/>
-      <w:r>
-        <w:rPr>
-          <w:b/>
-          <w:bCs/>
-        </w:rPr>
-        <w:t>Farside</w:t>
-      </w:r>
-      <w:proofErr w:type="spellEnd"/>
-      <w:r>
-        <w:rPr>
-          <w:b/>
-          <w:bCs/>
-        </w:rPr>
-        <w:t xml:space="preserve"> Cloudflare block, and communicated with Gemini API.</w:t>
-      </w:r>
-    </w:p>
-    <w:p>
-      <w:pPr>
-        <w:rPr>
-          <w:b/>
-          <w:bCs/>
-        </w:rPr>
-      </w:pPr>
-      <w:r>
-        <w:rPr>
-          <w:b/>
-          <w:bCs/>
-        </w:rPr>
-        <w:t>Re-calibrated System Prompt to force strict JSON output and multi-asset (BTC, ETH, SOL) tracking.</w:t>
+        <w:t>Executed live test. Pipeline successfully fetched CoinGecko data, bypassed Farside Cloudflare block, and communicated with Gemini API.</w:t>
       </w:r>
     </w:p>
     <w:p>
@@ -948,7 +464,7 @@
           <w:i/>
           <w:iCs/>
         </w:rPr>
-        <w:t>Status: [COMPLETED - May 3, 2026]</w:t>
+        <w:t>Status: [COMPLETED - May 4, 2026]</w:t>
       </w:r>
     </w:p>
     <w:p>
@@ -978,23 +494,7 @@
           <w:b/>
           <w:bCs/>
         </w:rPr>
-        <w:t xml:space="preserve">Built dark-mode React dashboard with </w:t>
-      </w:r>
-      <w:proofErr w:type="spellStart"/>
-      <w:r>
-        <w:rPr>
-          <w:b/>
-          <w:bCs/>
-        </w:rPr>
-        <w:t>Glassmorphism</w:t>
-      </w:r>
-      <w:proofErr w:type="spellEnd"/>
-      <w:r>
-        <w:rPr>
-          <w:b/>
-          <w:bCs/>
-        </w:rPr>
-        <w:t xml:space="preserve"> and military-grade typography.</w:t>
+        <w:t>Built dark-mode React dashboard with Glassmorphism and military-grade typography.</w:t>
       </w:r>
     </w:p>
     <w:p>
@@ -1054,23 +554,22 @@
           <w:b/>
           <w:bCs/>
         </w:rPr>
-        <w:t xml:space="preserve">Deployed frontend to </w:t>
+        <w:t>Deployed frontend to Vercel.</w:t>
       </w:r>
-      <w:proofErr w:type="spellStart"/>
+    </w:p>
+    <w:p>
+      <w:pPr>
+        <w:rPr>
+          <w:b/>
+          <w:bCs/>
+        </w:rPr>
+      </w:pPr>
       <w:r>
         <w:rPr>
           <w:b/>
           <w:bCs/>
         </w:rPr>
-        <w:t>Vercel</w:t>
-      </w:r>
-      <w:proofErr w:type="spellEnd"/>
-      <w:r>
-        <w:rPr>
-          <w:b/>
-          <w:bCs/>
-        </w:rPr>
-        <w:t>.</w:t>
+        <w:t>Post-Beta Patch: Reordered mobile layout, fixed overflow scrolling, and added educational tooltips based on user feedback.</w:t>
       </w:r>
     </w:p>
     <w:p>
@@ -1125,23 +624,7 @@
           <w:b/>
           <w:bCs/>
         </w:rPr>
-        <w:t xml:space="preserve">Step 1: Launched X (Twitter) </w:t>
-      </w:r>
-      <w:proofErr w:type="gramStart"/>
-      <w:r>
-        <w:rPr>
-          <w:b/>
-          <w:bCs/>
-        </w:rPr>
-        <w:t>brand @</w:t>
-      </w:r>
-      <w:proofErr w:type="gramEnd"/>
-      <w:r>
-        <w:rPr>
-          <w:b/>
-          <w:bCs/>
-        </w:rPr>
-        <w:t>AresQuant and posted Beta Platoon recruitment thread.</w:t>
+        <w:t>Step 1: Launched X (Twitter) brand @AresQuant and posted Beta Platoon recruitment thread.</w:t>
       </w:r>
     </w:p>
     <w:p>
@@ -1156,47 +639,7 @@
           <w:b/>
           <w:bCs/>
         </w:rPr>
-        <w:t xml:space="preserve">Step 2: Initiated Beta Bounty on </w:t>
-      </w:r>
-      <w:proofErr w:type="spellStart"/>
-      <w:r>
-        <w:rPr>
-          <w:b/>
-          <w:bCs/>
-        </w:rPr>
-        <w:t>Zealy</w:t>
-      </w:r>
-      <w:proofErr w:type="spellEnd"/>
-      <w:r>
-        <w:rPr>
-          <w:b/>
-          <w:bCs/>
-        </w:rPr>
-        <w:t xml:space="preserve"> to recruit 5 testers for $10 each.</w:t>
-      </w:r>
-      <w:r>
-        <w:rPr>
-          <w:b/>
-          <w:bCs/>
-        </w:rPr>
-        <w:br/>
-        <w:t>*</w:t>
-      </w:r>
-      <w:proofErr w:type="gramStart"/>
-      <w:r>
-        <w:rPr>
-          <w:b/>
-          <w:bCs/>
-        </w:rPr>
-        <w:t>[ ]</w:t>
-      </w:r>
-      <w:proofErr w:type="gramEnd"/>
-      <w:r>
-        <w:rPr>
-          <w:b/>
-          <w:bCs/>
-        </w:rPr>
-        <w:t> Step 3: Form the LLC (e.g., Stripe Atlas) to establish the Corporate Veil.</w:t>
+        <w:t>Step 2: Initiated Beta Bounty on Zealy and BetaTesting.com.</w:t>
       </w:r>
     </w:p>
     <w:p>
@@ -1211,7 +654,7 @@
           <w:b/>
           <w:bCs/>
         </w:rPr>
-        <w:t>Step 4: Draft Terms of Service and Privacy Policy (As-Is clause, no financial advice).</w:t>
+        <w:t>Step 3: Form the LLC (e.g., Stripe Atlas) to establish the Corporate Veil.</w:t>
       </w:r>
     </w:p>
     <w:p>
@@ -1226,54 +669,15 @@
           <w:b/>
           <w:bCs/>
         </w:rPr>
-        <w:t xml:space="preserve">Step 5: Activate the Stripe payment gateway ($29/month) with 1-click cancel portal and mandatory </w:t>
+        <w:t>Step 4: Draft Terms of Service and Privacy Policy (As-Is clause, no financial advice).</w:t>
       </w:r>
-      <w:proofErr w:type="spellStart"/>
       <w:r>
         <w:rPr>
           <w:b/>
           <w:bCs/>
         </w:rPr>
-        <w:t>ToS</w:t>
-      </w:r>
-      <w:proofErr w:type="spellEnd"/>
-      <w:r>
-        <w:rPr>
-          <w:b/>
-          <w:bCs/>
-        </w:rPr>
-        <w:t xml:space="preserve"> checkbox.</w:t>
-      </w:r>
-    </w:p>
-    <w:p>
-      <w:pPr>
-        <w:rPr>
-          <w:b/>
-          <w:bCs/>
-        </w:rPr>
-      </w:pPr>
-      <w:r>
-        <w:rPr>
-          <w:b/>
-          <w:bCs/>
-        </w:rPr>
-        <w:t>Step 6: Transition from web scraping to official paid APIs upon reaching $600/</w:t>
-      </w:r>
-      <w:proofErr w:type="spellStart"/>
-      <w:r>
-        <w:rPr>
-          <w:b/>
-          <w:bCs/>
-        </w:rPr>
-        <w:t>mo</w:t>
-      </w:r>
-      <w:proofErr w:type="spellEnd"/>
-      <w:r>
-        <w:rPr>
-          <w:b/>
-          <w:bCs/>
-        </w:rPr>
-        <w:t xml:space="preserve"> MRR.</w:t>
+        <w:br/>
+        <w:t>*[ ] Step 5: Activate the Stripe payment gateway ($29/month) with 1-click cancel portal and mandatory ToS checkbox.</w:t>
       </w:r>
     </w:p>
     <w:p/>
@@ -3756,6 +3160,155 @@
     </w:lvl>
   </w:abstractNum>
   <w:abstractNum w:abstractNumId="18" w15:restartNumberingAfterBreak="0">
+    <w:nsid w:val="57505B68"/>
+    <w:multiLevelType w:val="multilevel"/>
+    <w:tmpl w:val="C23295CA"/>
+    <w:lvl w:ilvl="0">
+      <w:start w:val="1"/>
+      <w:numFmt w:val="bullet"/>
+      <w:lvlText w:val=""/>
+      <w:lvlJc w:val="left"/>
+      <w:pPr>
+        <w:tabs>
+          <w:tab w:val="num" w:pos="720"/>
+        </w:tabs>
+        <w:ind w:left="720" w:hanging="360"/>
+      </w:pPr>
+      <w:rPr>
+        <w:rFonts w:ascii="Symbol" w:hAnsi="Symbol" w:hint="default"/>
+        <w:sz w:val="20"/>
+      </w:rPr>
+    </w:lvl>
+    <w:lvl w:ilvl="1" w:tentative="1">
+      <w:start w:val="1"/>
+      <w:numFmt w:val="bullet"/>
+      <w:lvlText w:val="o"/>
+      <w:lvlJc w:val="left"/>
+      <w:pPr>
+        <w:tabs>
+          <w:tab w:val="num" w:pos="1440"/>
+        </w:tabs>
+        <w:ind w:left="1440" w:hanging="360"/>
+      </w:pPr>
+      <w:rPr>
+        <w:rFonts w:ascii="Courier New" w:hAnsi="Courier New" w:hint="default"/>
+        <w:sz w:val="20"/>
+      </w:rPr>
+    </w:lvl>
+    <w:lvl w:ilvl="2" w:tentative="1">
+      <w:start w:val="1"/>
+      <w:numFmt w:val="bullet"/>
+      <w:lvlText w:val=""/>
+      <w:lvlJc w:val="left"/>
+      <w:pPr>
+        <w:tabs>
+          <w:tab w:val="num" w:pos="2160"/>
+        </w:tabs>
+        <w:ind w:left="2160" w:hanging="360"/>
+      </w:pPr>
+      <w:rPr>
+        <w:rFonts w:ascii="Wingdings" w:hAnsi="Wingdings" w:hint="default"/>
+        <w:sz w:val="20"/>
+      </w:rPr>
+    </w:lvl>
+    <w:lvl w:ilvl="3" w:tentative="1">
+      <w:start w:val="1"/>
+      <w:numFmt w:val="bullet"/>
+      <w:lvlText w:val=""/>
+      <w:lvlJc w:val="left"/>
+      <w:pPr>
+        <w:tabs>
+          <w:tab w:val="num" w:pos="2880"/>
+        </w:tabs>
+        <w:ind w:left="2880" w:hanging="360"/>
+      </w:pPr>
+      <w:rPr>
+        <w:rFonts w:ascii="Wingdings" w:hAnsi="Wingdings" w:hint="default"/>
+        <w:sz w:val="20"/>
+      </w:rPr>
+    </w:lvl>
+    <w:lvl w:ilvl="4" w:tentative="1">
+      <w:start w:val="1"/>
+      <w:numFmt w:val="bullet"/>
+      <w:lvlText w:val=""/>
+      <w:lvlJc w:val="left"/>
+      <w:pPr>
+        <w:tabs>
+          <w:tab w:val="num" w:pos="3600"/>
+        </w:tabs>
+        <w:ind w:left="3600" w:hanging="360"/>
+      </w:pPr>
+      <w:rPr>
+        <w:rFonts w:ascii="Wingdings" w:hAnsi="Wingdings" w:hint="default"/>
+        <w:sz w:val="20"/>
+      </w:rPr>
+    </w:lvl>
+    <w:lvl w:ilvl="5" w:tentative="1">
+      <w:start w:val="1"/>
+      <w:numFmt w:val="bullet"/>
+      <w:lvlText w:val=""/>
+      <w:lvlJc w:val="left"/>
+      <w:pPr>
+        <w:tabs>
+          <w:tab w:val="num" w:pos="4320"/>
+        </w:tabs>
+        <w:ind w:left="4320" w:hanging="360"/>
+      </w:pPr>
+      <w:rPr>
+        <w:rFonts w:ascii="Wingdings" w:hAnsi="Wingdings" w:hint="default"/>
+        <w:sz w:val="20"/>
+      </w:rPr>
+    </w:lvl>
+    <w:lvl w:ilvl="6" w:tentative="1">
+      <w:start w:val="1"/>
+      <w:numFmt w:val="bullet"/>
+      <w:lvlText w:val=""/>
+      <w:lvlJc w:val="left"/>
+      <w:pPr>
+        <w:tabs>
+          <w:tab w:val="num" w:pos="5040"/>
+        </w:tabs>
+        <w:ind w:left="5040" w:hanging="360"/>
+      </w:pPr>
+      <w:rPr>
+        <w:rFonts w:ascii="Wingdings" w:hAnsi="Wingdings" w:hint="default"/>
+        <w:sz w:val="20"/>
+      </w:rPr>
+    </w:lvl>
+    <w:lvl w:ilvl="7" w:tentative="1">
+      <w:start w:val="1"/>
+      <w:numFmt w:val="bullet"/>
+      <w:lvlText w:val=""/>
+      <w:lvlJc w:val="left"/>
+      <w:pPr>
+        <w:tabs>
+          <w:tab w:val="num" w:pos="5760"/>
+        </w:tabs>
+        <w:ind w:left="5760" w:hanging="360"/>
+      </w:pPr>
+      <w:rPr>
+        <w:rFonts w:ascii="Wingdings" w:hAnsi="Wingdings" w:hint="default"/>
+        <w:sz w:val="20"/>
+      </w:rPr>
+    </w:lvl>
+    <w:lvl w:ilvl="8" w:tentative="1">
+      <w:start w:val="1"/>
+      <w:numFmt w:val="bullet"/>
+      <w:lvlText w:val=""/>
+      <w:lvlJc w:val="left"/>
+      <w:pPr>
+        <w:tabs>
+          <w:tab w:val="num" w:pos="6480"/>
+        </w:tabs>
+        <w:ind w:left="6480" w:hanging="360"/>
+      </w:pPr>
+      <w:rPr>
+        <w:rFonts w:ascii="Wingdings" w:hAnsi="Wingdings" w:hint="default"/>
+        <w:sz w:val="20"/>
+      </w:rPr>
+    </w:lvl>
+  </w:abstractNum>
+  <w:abstractNum w:abstractNumId="19" w15:restartNumberingAfterBreak="0">
     <w:nsid w:val="5DE023C2"/>
     <w:multiLevelType w:val="multilevel"/>
     <w:tmpl w:val="225C8F1A"/>
@@ -3868,7 +3421,7 @@
       </w:pPr>
     </w:lvl>
   </w:abstractNum>
-  <w:abstractNum w:abstractNumId="19" w15:restartNumberingAfterBreak="0">
+  <w:abstractNum w:abstractNumId="20" w15:restartNumberingAfterBreak="0">
     <w:nsid w:val="5FD83B9C"/>
     <w:multiLevelType w:val="multilevel"/>
     <w:tmpl w:val="243091DE"/>
@@ -4017,7 +3570,156 @@
       </w:rPr>
     </w:lvl>
   </w:abstractNum>
-  <w:abstractNum w:abstractNumId="20" w15:restartNumberingAfterBreak="0">
+  <w:abstractNum w:abstractNumId="21" w15:restartNumberingAfterBreak="0">
+    <w:nsid w:val="677F3F01"/>
+    <w:multiLevelType w:val="multilevel"/>
+    <w:tmpl w:val="A28A0798"/>
+    <w:lvl w:ilvl="0">
+      <w:start w:val="1"/>
+      <w:numFmt w:val="bullet"/>
+      <w:lvlText w:val=""/>
+      <w:lvlJc w:val="left"/>
+      <w:pPr>
+        <w:tabs>
+          <w:tab w:val="num" w:pos="720"/>
+        </w:tabs>
+        <w:ind w:left="720" w:hanging="360"/>
+      </w:pPr>
+      <w:rPr>
+        <w:rFonts w:ascii="Symbol" w:hAnsi="Symbol" w:hint="default"/>
+        <w:sz w:val="20"/>
+      </w:rPr>
+    </w:lvl>
+    <w:lvl w:ilvl="1" w:tentative="1">
+      <w:start w:val="1"/>
+      <w:numFmt w:val="bullet"/>
+      <w:lvlText w:val="o"/>
+      <w:lvlJc w:val="left"/>
+      <w:pPr>
+        <w:tabs>
+          <w:tab w:val="num" w:pos="1440"/>
+        </w:tabs>
+        <w:ind w:left="1440" w:hanging="360"/>
+      </w:pPr>
+      <w:rPr>
+        <w:rFonts w:ascii="Courier New" w:hAnsi="Courier New" w:hint="default"/>
+        <w:sz w:val="20"/>
+      </w:rPr>
+    </w:lvl>
+    <w:lvl w:ilvl="2" w:tentative="1">
+      <w:start w:val="1"/>
+      <w:numFmt w:val="bullet"/>
+      <w:lvlText w:val=""/>
+      <w:lvlJc w:val="left"/>
+      <w:pPr>
+        <w:tabs>
+          <w:tab w:val="num" w:pos="2160"/>
+        </w:tabs>
+        <w:ind w:left="2160" w:hanging="360"/>
+      </w:pPr>
+      <w:rPr>
+        <w:rFonts w:ascii="Wingdings" w:hAnsi="Wingdings" w:hint="default"/>
+        <w:sz w:val="20"/>
+      </w:rPr>
+    </w:lvl>
+    <w:lvl w:ilvl="3" w:tentative="1">
+      <w:start w:val="1"/>
+      <w:numFmt w:val="bullet"/>
+      <w:lvlText w:val=""/>
+      <w:lvlJc w:val="left"/>
+      <w:pPr>
+        <w:tabs>
+          <w:tab w:val="num" w:pos="2880"/>
+        </w:tabs>
+        <w:ind w:left="2880" w:hanging="360"/>
+      </w:pPr>
+      <w:rPr>
+        <w:rFonts w:ascii="Wingdings" w:hAnsi="Wingdings" w:hint="default"/>
+        <w:sz w:val="20"/>
+      </w:rPr>
+    </w:lvl>
+    <w:lvl w:ilvl="4" w:tentative="1">
+      <w:start w:val="1"/>
+      <w:numFmt w:val="bullet"/>
+      <w:lvlText w:val=""/>
+      <w:lvlJc w:val="left"/>
+      <w:pPr>
+        <w:tabs>
+          <w:tab w:val="num" w:pos="3600"/>
+        </w:tabs>
+        <w:ind w:left="3600" w:hanging="360"/>
+      </w:pPr>
+      <w:rPr>
+        <w:rFonts w:ascii="Wingdings" w:hAnsi="Wingdings" w:hint="default"/>
+        <w:sz w:val="20"/>
+      </w:rPr>
+    </w:lvl>
+    <w:lvl w:ilvl="5" w:tentative="1">
+      <w:start w:val="1"/>
+      <w:numFmt w:val="bullet"/>
+      <w:lvlText w:val=""/>
+      <w:lvlJc w:val="left"/>
+      <w:pPr>
+        <w:tabs>
+          <w:tab w:val="num" w:pos="4320"/>
+        </w:tabs>
+        <w:ind w:left="4320" w:hanging="360"/>
+      </w:pPr>
+      <w:rPr>
+        <w:rFonts w:ascii="Wingdings" w:hAnsi="Wingdings" w:hint="default"/>
+        <w:sz w:val="20"/>
+      </w:rPr>
+    </w:lvl>
+    <w:lvl w:ilvl="6" w:tentative="1">
+      <w:start w:val="1"/>
+      <w:numFmt w:val="bullet"/>
+      <w:lvlText w:val=""/>
+      <w:lvlJc w:val="left"/>
+      <w:pPr>
+        <w:tabs>
+          <w:tab w:val="num" w:pos="5040"/>
+        </w:tabs>
+        <w:ind w:left="5040" w:hanging="360"/>
+      </w:pPr>
+      <w:rPr>
+        <w:rFonts w:ascii="Wingdings" w:hAnsi="Wingdings" w:hint="default"/>
+        <w:sz w:val="20"/>
+      </w:rPr>
+    </w:lvl>
+    <w:lvl w:ilvl="7" w:tentative="1">
+      <w:start w:val="1"/>
+      <w:numFmt w:val="bullet"/>
+      <w:lvlText w:val=""/>
+      <w:lvlJc w:val="left"/>
+      <w:pPr>
+        <w:tabs>
+          <w:tab w:val="num" w:pos="5760"/>
+        </w:tabs>
+        <w:ind w:left="5760" w:hanging="360"/>
+      </w:pPr>
+      <w:rPr>
+        <w:rFonts w:ascii="Wingdings" w:hAnsi="Wingdings" w:hint="default"/>
+        <w:sz w:val="20"/>
+      </w:rPr>
+    </w:lvl>
+    <w:lvl w:ilvl="8" w:tentative="1">
+      <w:start w:val="1"/>
+      <w:numFmt w:val="bullet"/>
+      <w:lvlText w:val=""/>
+      <w:lvlJc w:val="left"/>
+      <w:pPr>
+        <w:tabs>
+          <w:tab w:val="num" w:pos="6480"/>
+        </w:tabs>
+        <w:ind w:left="6480" w:hanging="360"/>
+      </w:pPr>
+      <w:rPr>
+        <w:rFonts w:ascii="Wingdings" w:hAnsi="Wingdings" w:hint="default"/>
+        <w:sz w:val="20"/>
+      </w:rPr>
+    </w:lvl>
+  </w:abstractNum>
+  <w:abstractNum w:abstractNumId="22" w15:restartNumberingAfterBreak="0">
     <w:nsid w:val="775138DB"/>
     <w:multiLevelType w:val="multilevel"/>
     <w:tmpl w:val="BB16D816"/>
@@ -4188,7 +3890,7 @@
     <w:abstractNumId w:val="4"/>
   </w:num>
   <w:num w:numId="8" w16cid:durableId="640118813">
-    <w:abstractNumId w:val="18"/>
+    <w:abstractNumId w:val="19"/>
   </w:num>
   <w:num w:numId="9" w16cid:durableId="342441912">
     <w:abstractNumId w:val="3"/>
@@ -4200,10 +3902,10 @@
     <w:abstractNumId w:val="13"/>
   </w:num>
   <w:num w:numId="12" w16cid:durableId="766316797">
-    <w:abstractNumId w:val="20"/>
+    <w:abstractNumId w:val="22"/>
   </w:num>
   <w:num w:numId="13" w16cid:durableId="1252855900">
-    <w:abstractNumId w:val="19"/>
+    <w:abstractNumId w:val="20"/>
   </w:num>
   <w:num w:numId="14" w16cid:durableId="216819548">
     <w:abstractNumId w:val="11"/>
@@ -4228,6 +3930,12 @@
   </w:num>
   <w:num w:numId="21" w16cid:durableId="259603926">
     <w:abstractNumId w:val="6"/>
+  </w:num>
+  <w:num w:numId="22" w16cid:durableId="1768227695">
+    <w:abstractNumId w:val="18"/>
+  </w:num>
+  <w:num w:numId="23" w16cid:durableId="1535000397">
+    <w:abstractNumId w:val="21"/>
   </w:num>
 </w:numbering>
 </file>

</xml_diff>

<commit_message>
Deployed dynamic Altcoin Radar and dedicated API endpoint
</commit_message>
<xml_diff>
--- a/Project ARES Recovery Prompt.docx
+++ b/Project ARES Recovery Prompt.docx
@@ -37,7 +37,7 @@
           <w:bCs/>
         </w:rPr>
         <w:br/>
-        <w:t>Build a Quantitative Risk Engine (SaaS) that translates complex institutional data (Heatmaps, ETF flows) AND retail behavioral data into simple, emotionless tactical commands for retail traders, preventing them from being used as exit liquidity.</w:t>
+        <w:t>Build a Quantitative Risk Engine (SaaS) that translates complex institutional data (Heatmaps, ETF flows) AND retail behavioral data into simple, emotionless tactical commands for retail traders and institutions.</w:t>
       </w:r>
     </w:p>
     <w:p>
@@ -59,7 +59,7 @@
       <w:pPr>
         <w:numPr>
           <w:ilvl w:val="0"/>
-          <w:numId w:val="22"/>
+          <w:numId w:val="24"/>
         </w:numPr>
         <w:rPr>
           <w:b/>
@@ -71,14 +71,14 @@
           <w:b/>
           <w:bCs/>
         </w:rPr>
-        <w:t>Target Audience (SOM): 10,000 active retail traders.</w:t>
+        <w:t>Target Audience 1 (Retail): 10,000 active global retail traders.</w:t>
       </w:r>
     </w:p>
     <w:p>
       <w:pPr>
         <w:numPr>
           <w:ilvl w:val="0"/>
-          <w:numId w:val="22"/>
+          <w:numId w:val="24"/>
         </w:numPr>
         <w:rPr>
           <w:b/>
@@ -90,14 +90,14 @@
           <w:b/>
           <w:bCs/>
         </w:rPr>
-        <w:t>Pricing: Freemium model. Pro Tier at $29/month.</w:t>
+        <w:t>Target Audience 2 (Enterprise): Family Offices, Prop Trading Desks, Wealth Management.</w:t>
       </w:r>
     </w:p>
     <w:p>
       <w:pPr>
         <w:numPr>
           <w:ilvl w:val="0"/>
-          <w:numId w:val="22"/>
+          <w:numId w:val="24"/>
         </w:numPr>
         <w:rPr>
           <w:b/>
@@ -109,14 +109,14 @@
           <w:b/>
           <w:bCs/>
         </w:rPr>
-        <w:t>Target ARR (Annual Recurring Revenue): $3.48 Million USD.</w:t>
+        <w:t>Pricing: Freemium model. Pro Tier at $29/month. Enterprise API at $5,000/month.</w:t>
       </w:r>
     </w:p>
     <w:p>
       <w:pPr>
         <w:numPr>
           <w:ilvl w:val="0"/>
-          <w:numId w:val="22"/>
+          <w:numId w:val="24"/>
         </w:numPr>
         <w:rPr>
           <w:b/>
@@ -128,29 +128,48 @@
           <w:b/>
           <w:bCs/>
         </w:rPr>
-        <w:t>Exit Valuation Target: $20M+ (5x to 8x ARR multiplier).</w:t>
+        <w:t>Target ARR (Annual Recurring Revenue): $3.48 Million+ USD.</w:t>
       </w:r>
     </w:p>
     <w:p>
       <w:pPr>
-        <w:rPr>
-          <w:b/>
-          <w:bCs/>
-        </w:rPr>
-      </w:pPr>
-      <w:r>
-        <w:rPr>
-          <w:b/>
-          <w:bCs/>
-        </w:rPr>
-        <w:t>THE TECH STACK (Antigravity Protocol):</w:t>
+        <w:numPr>
+          <w:ilvl w:val="0"/>
+          <w:numId w:val="24"/>
+        </w:numPr>
+        <w:rPr>
+          <w:b/>
+          <w:bCs/>
+        </w:rPr>
+      </w:pPr>
+      <w:r>
+        <w:rPr>
+          <w:b/>
+          <w:bCs/>
+        </w:rPr>
+        <w:t>Exit Valuation Target: $20M+ (5x to 8x ARR multiplier).</w:t>
       </w:r>
     </w:p>
     <w:p>
       <w:pPr>
+        <w:rPr>
+          <w:b/>
+          <w:bCs/>
+        </w:rPr>
+      </w:pPr>
+      <w:r>
+        <w:rPr>
+          <w:b/>
+          <w:bCs/>
+        </w:rPr>
+        <w:t>LEGAL &amp; COMPLIANCE DOCTRINE (The Corporate Armor):</w:t>
+      </w:r>
+    </w:p>
+    <w:p>
+      <w:pPr>
         <w:numPr>
           <w:ilvl w:val="0"/>
-          <w:numId w:val="23"/>
+          <w:numId w:val="25"/>
         </w:numPr>
         <w:rPr>
           <w:b/>
@@ -162,14 +181,14 @@
           <w:b/>
           <w:bCs/>
         </w:rPr>
-        <w:t>The Brain: Google AI Studio (Gemini 1.5 Pro).</w:t>
+        <w:t>Lexicon Control (SEC Shield): The app never uses the words "Buy," "Sell," "Long," or "Short." Output is strictly limited to "Support Zones," "Liquidation Clusters," and "Market Posture."</w:t>
       </w:r>
     </w:p>
     <w:p>
       <w:pPr>
         <w:numPr>
           <w:ilvl w:val="0"/>
-          <w:numId w:val="23"/>
+          <w:numId w:val="25"/>
         </w:numPr>
         <w:rPr>
           <w:b/>
@@ -181,14 +200,14 @@
           <w:b/>
           <w:bCs/>
         </w:rPr>
-        <w:t>The IDE / Development Team: Google Antigravity (Autonomous Agent Manager).</w:t>
+        <w:t>The Corporate Veil (Civil Shield): Operations conducted under CVEV Strategies LLC (via DBA) to isolate personal crypto wealth from business liability.</w:t>
       </w:r>
     </w:p>
     <w:p>
       <w:pPr>
         <w:numPr>
           <w:ilvl w:val="0"/>
-          <w:numId w:val="23"/>
+          <w:numId w:val="25"/>
         </w:numPr>
         <w:rPr>
           <w:b/>
@@ -200,14 +219,29 @@
           <w:b/>
           <w:bCs/>
         </w:rPr>
-        <w:t>The Backend: Node.js (Custom script written by Antigravity Agent). Hosted on Render.com.</w:t>
+        <w:t>The Click-Wrap Agreement: Users must agree to the Terms of Service (stating the app is an "As-Is" educational data tool) before Stripe checkout.</w:t>
       </w:r>
     </w:p>
     <w:p>
       <w:pPr>
+        <w:rPr>
+          <w:b/>
+          <w:bCs/>
+        </w:rPr>
+      </w:pPr>
+      <w:r>
+        <w:rPr>
+          <w:b/>
+          <w:bCs/>
+        </w:rPr>
+        <w:t>THE TECH STACK (Antigravity Protocol):</w:t>
+      </w:r>
+    </w:p>
+    <w:p>
+      <w:pPr>
         <w:numPr>
           <w:ilvl w:val="0"/>
-          <w:numId w:val="23"/>
+          <w:numId w:val="26"/>
         </w:numPr>
         <w:rPr>
           <w:b/>
@@ -219,14 +253,14 @@
           <w:b/>
           <w:bCs/>
         </w:rPr>
-        <w:t>The Sensors: CoinGecko API (Prices/Fear Index), Puppeteer/Browser Agent (Scraping Farside ETF Flows and Coinglass Heatmaps).</w:t>
+        <w:t>The Brain: Google AI Studio (Gemini 1.5 Pro).</w:t>
       </w:r>
     </w:p>
     <w:p>
       <w:pPr>
         <w:numPr>
           <w:ilvl w:val="0"/>
-          <w:numId w:val="23"/>
+          <w:numId w:val="26"/>
         </w:numPr>
         <w:rPr>
           <w:b/>
@@ -238,54 +272,193 @@
           <w:b/>
           <w:bCs/>
         </w:rPr>
-        <w:t>The Body: React Web App (Tailwind CSS, Glassmorphism UI). Hosted on Vercel.</w:t>
+        <w:t>The IDE / Development Team: Google Antigravity (Autonomous Agent Manager).</w:t>
       </w:r>
     </w:p>
     <w:p>
       <w:pPr>
-        <w:rPr>
-          <w:b/>
-          <w:bCs/>
-        </w:rPr>
-      </w:pPr>
-      <w:r>
-        <w:rPr>
-          <w:b/>
-          <w:bCs/>
-        </w:rPr>
-        <w:t>EXECUTION ROADMAP &amp; PROGRESS:</w:t>
+        <w:numPr>
+          <w:ilvl w:val="0"/>
+          <w:numId w:val="26"/>
+        </w:numPr>
+        <w:rPr>
+          <w:b/>
+          <w:bCs/>
+        </w:rPr>
+      </w:pPr>
+      <w:r>
+        <w:rPr>
+          <w:b/>
+          <w:bCs/>
+        </w:rPr>
+        <w:t>The Backend: Node.js (Custom script written by Antigravity Agent). Hosted on Render.com.</w:t>
       </w:r>
     </w:p>
     <w:p>
       <w:pPr>
-        <w:rPr>
-          <w:b/>
-          <w:bCs/>
-        </w:rPr>
-      </w:pPr>
-      <w:r>
-        <w:rPr>
-          <w:rFonts w:ascii="Segoe UI Emoji" w:hAnsi="Segoe UI Emoji" w:cs="Segoe UI Emoji"/>
-          <w:b/>
-          <w:bCs/>
-        </w:rPr>
-        <w:t>🟢</w:t>
-      </w:r>
-      <w:r>
-        <w:rPr>
-          <w:b/>
-          <w:bCs/>
-        </w:rPr>
-        <w:t xml:space="preserve"> PHASE 1: PROVE THE BRAIN (Google AI Studio)</w:t>
+        <w:numPr>
+          <w:ilvl w:val="0"/>
+          <w:numId w:val="26"/>
+        </w:numPr>
+        <w:rPr>
+          <w:b/>
+          <w:bCs/>
+        </w:rPr>
+      </w:pPr>
+      <w:r>
+        <w:rPr>
+          <w:b/>
+          <w:bCs/>
+        </w:rPr>
+        <w:t>The Sensors: </w:t>
+      </w:r>
+      <w:proofErr w:type="spellStart"/>
+      <w:r>
+        <w:rPr>
+          <w:b/>
+          <w:bCs/>
+        </w:rPr>
+        <w:t>CoinGecko</w:t>
+      </w:r>
+      <w:proofErr w:type="spellEnd"/>
+      <w:r>
+        <w:rPr>
+          <w:b/>
+          <w:bCs/>
+        </w:rPr>
+        <w:t xml:space="preserve"> API, Puppeteer/Browser Agent (Scraping </w:t>
+      </w:r>
+      <w:proofErr w:type="spellStart"/>
+      <w:r>
+        <w:rPr>
+          <w:b/>
+          <w:bCs/>
+        </w:rPr>
+        <w:t>Farside</w:t>
+      </w:r>
+      <w:proofErr w:type="spellEnd"/>
+      <w:r>
+        <w:rPr>
+          <w:b/>
+          <w:bCs/>
+        </w:rPr>
+        <w:t xml:space="preserve"> ETF Flows and </w:t>
+      </w:r>
+      <w:proofErr w:type="spellStart"/>
+      <w:r>
+        <w:rPr>
+          <w:b/>
+          <w:bCs/>
+        </w:rPr>
+        <w:t>Coinglass</w:t>
+      </w:r>
+      <w:proofErr w:type="spellEnd"/>
+      <w:r>
+        <w:rPr>
+          <w:b/>
+          <w:bCs/>
+        </w:rPr>
+        <w:t xml:space="preserve"> Heatmaps).</w:t>
       </w:r>
     </w:p>
     <w:p>
       <w:pPr>
-        <w:rPr>
-          <w:b/>
-          <w:bCs/>
-        </w:rPr>
-      </w:pPr>
+        <w:numPr>
+          <w:ilvl w:val="0"/>
+          <w:numId w:val="26"/>
+        </w:numPr>
+        <w:rPr>
+          <w:b/>
+          <w:bCs/>
+        </w:rPr>
+      </w:pPr>
+      <w:r>
+        <w:rPr>
+          <w:b/>
+          <w:bCs/>
+        </w:rPr>
+        <w:lastRenderedPageBreak/>
+        <w:t xml:space="preserve">The Body: React Web App (Tailwind CSS, </w:t>
+      </w:r>
+      <w:proofErr w:type="spellStart"/>
+      <w:r>
+        <w:rPr>
+          <w:b/>
+          <w:bCs/>
+        </w:rPr>
+        <w:t>Glassmorphism</w:t>
+      </w:r>
+      <w:proofErr w:type="spellEnd"/>
+      <w:r>
+        <w:rPr>
+          <w:b/>
+          <w:bCs/>
+        </w:rPr>
+        <w:t xml:space="preserve"> UI). Hosted on </w:t>
+      </w:r>
+      <w:proofErr w:type="spellStart"/>
+      <w:r>
+        <w:rPr>
+          <w:b/>
+          <w:bCs/>
+        </w:rPr>
+        <w:t>Vercel</w:t>
+      </w:r>
+      <w:proofErr w:type="spellEnd"/>
+      <w:r>
+        <w:rPr>
+          <w:b/>
+          <w:bCs/>
+        </w:rPr>
+        <w:t>.</w:t>
+      </w:r>
+    </w:p>
+    <w:p>
+      <w:pPr>
+        <w:rPr>
+          <w:b/>
+          <w:bCs/>
+        </w:rPr>
+      </w:pPr>
+      <w:r>
+        <w:rPr>
+          <w:b/>
+          <w:bCs/>
+        </w:rPr>
+        <w:t>EXECUTION ROADMAP &amp; PROGRESS:</w:t>
+      </w:r>
+    </w:p>
+    <w:p>
+      <w:pPr>
+        <w:rPr>
+          <w:b/>
+          <w:bCs/>
+        </w:rPr>
+      </w:pPr>
+      <w:r>
+        <w:rPr>
+          <w:rFonts w:ascii="Segoe UI Emoji" w:hAnsi="Segoe UI Emoji" w:cs="Segoe UI Emoji"/>
+          <w:b/>
+          <w:bCs/>
+        </w:rPr>
+        <w:t>🟢</w:t>
+      </w:r>
+      <w:r>
+        <w:rPr>
+          <w:b/>
+          <w:bCs/>
+        </w:rPr>
+        <w:t xml:space="preserve"> PHASE 1: PROVE THE BRAIN (Google AI Studio)</w:t>
+      </w:r>
+    </w:p>
+    <w:p>
+      <w:pPr>
+        <w:rPr>
+          <w:b/>
+          <w:bCs/>
+        </w:rPr>
+      </w:pPr>
+      <w:proofErr w:type="gramStart"/>
       <w:r>
         <w:rPr>
           <w:b/>
@@ -293,7 +466,17 @@
           <w:i/>
           <w:iCs/>
         </w:rPr>
-        <w:t>Status:[COMPLETED - April 29, 2026]</w:t>
+        <w:t>Status:[</w:t>
+      </w:r>
+      <w:proofErr w:type="gramEnd"/>
+      <w:r>
+        <w:rPr>
+          <w:b/>
+          <w:bCs/>
+          <w:i/>
+          <w:iCs/>
+        </w:rPr>
+        <w:t>COMPLETED]</w:t>
       </w:r>
     </w:p>
     <w:p>
@@ -305,10 +488,18 @@
       </w:pPr>
       <w:r>
         <w:rPr>
-          <w:b/>
-          <w:bCs/>
-        </w:rPr>
-        <w:t>Programmed the "ARES" System Prompt.</w:t>
+          <w:rFonts w:ascii="Segoe UI Emoji" w:hAnsi="Segoe UI Emoji" w:cs="Segoe UI Emoji"/>
+          <w:b/>
+          <w:bCs/>
+        </w:rPr>
+        <w:t>🟢</w:t>
+      </w:r>
+      <w:r>
+        <w:rPr>
+          <w:b/>
+          <w:bCs/>
+        </w:rPr>
+        <w:t xml:space="preserve"> PHASE 2: THE ANTIGRAVITY DEPLOYMENT (Backend Pipeline)</w:t>
       </w:r>
     </w:p>
     <w:p>
@@ -322,8 +513,10 @@
         <w:rPr>
           <w:b/>
           <w:bCs/>
-        </w:rPr>
-        <w:t>Fed fake "Liquidity Winter" data. AI successfully output JSON code targeting $74.8k kill zone.</w:t>
+          <w:i/>
+          <w:iCs/>
+        </w:rPr>
+        <w:t>Status: [COMPLETED]</w:t>
       </w:r>
     </w:p>
     <w:p>
@@ -335,18 +528,10 @@
       </w:pPr>
       <w:r>
         <w:rPr>
-          <w:rFonts w:ascii="Segoe UI Emoji" w:hAnsi="Segoe UI Emoji" w:cs="Segoe UI Emoji"/>
-          <w:b/>
-          <w:bCs/>
-        </w:rPr>
-        <w:t>🟢</w:t>
-      </w:r>
-      <w:r>
-        <w:rPr>
-          <w:b/>
-          <w:bCs/>
-        </w:rPr>
-        <w:t xml:space="preserve"> PHASE 2: THE ANTIGRAVITY DEPLOYMENT (Backend Pipeline)</w:t>
+          <w:b/>
+          <w:bCs/>
+        </w:rPr>
+        <w:t>Deployed Agent 1 (Backend Engineer).</w:t>
       </w:r>
     </w:p>
     <w:p>
@@ -360,10 +545,89 @@
         <w:rPr>
           <w:b/>
           <w:bCs/>
+        </w:rPr>
+        <w:t>Executed live test. Pipeline successfully fetched data and communicated with Gemini API.</w:t>
+      </w:r>
+    </w:p>
+    <w:p>
+      <w:pPr>
+        <w:rPr>
+          <w:b/>
+          <w:bCs/>
+        </w:rPr>
+      </w:pPr>
+      <w:r>
+        <w:rPr>
+          <w:b/>
+          <w:bCs/>
+        </w:rPr>
+        <w:t>Deployed backend to Render.com.</w:t>
+      </w:r>
+    </w:p>
+    <w:p>
+      <w:pPr>
+        <w:rPr>
+          <w:b/>
+          <w:bCs/>
+        </w:rPr>
+      </w:pPr>
+      <w:r>
+        <w:rPr>
+          <w:b/>
+          <w:bCs/>
+        </w:rPr>
+        <w:t>Night Ops Upgrade: Built and merged dynamic Altcoin Scraper into production backend.</w:t>
+      </w:r>
+    </w:p>
+    <w:p>
+      <w:pPr>
+        <w:rPr>
+          <w:b/>
+          <w:bCs/>
+        </w:rPr>
+      </w:pPr>
+      <w:r>
+        <w:rPr>
+          <w:rFonts w:ascii="Segoe UI Emoji" w:hAnsi="Segoe UI Emoji" w:cs="Segoe UI Emoji"/>
+          <w:b/>
+          <w:bCs/>
+        </w:rPr>
+        <w:t>🟢</w:t>
+      </w:r>
+      <w:r>
+        <w:rPr>
+          <w:b/>
+          <w:bCs/>
+        </w:rPr>
+        <w:t xml:space="preserve"> PHASE 3: THE FRONTEND BUILD (React UI)</w:t>
+      </w:r>
+    </w:p>
+    <w:p>
+      <w:pPr>
+        <w:rPr>
+          <w:b/>
+          <w:bCs/>
+        </w:rPr>
+      </w:pPr>
+      <w:proofErr w:type="gramStart"/>
+      <w:r>
+        <w:rPr>
+          <w:b/>
+          <w:bCs/>
           <w:i/>
           <w:iCs/>
         </w:rPr>
-        <w:t>Status:[COMPLETED - May 2, 2026]</w:t>
+        <w:t>Status:[</w:t>
+      </w:r>
+      <w:proofErr w:type="gramEnd"/>
+      <w:r>
+        <w:rPr>
+          <w:b/>
+          <w:bCs/>
+          <w:i/>
+          <w:iCs/>
+        </w:rPr>
+        <w:t>COMPLETED]</w:t>
       </w:r>
     </w:p>
     <w:p>
@@ -378,8 +642,7 @@
           <w:b/>
           <w:bCs/>
         </w:rPr>
-        <w:lastRenderedPageBreak/>
-        <w:t>Secured CoinGecko API Key (Demo Tier).</w:t>
+        <w:t>Deployed Agent 2 (Frontend Designer) in Antigravity.</w:t>
       </w:r>
     </w:p>
     <w:p>
@@ -394,7 +657,39 @@
           <w:b/>
           <w:bCs/>
         </w:rPr>
-        <w:t>Deployed Agent 1 (Backend Engineer). Agent successfully wrote index.js and package.json.</w:t>
+        <w:t xml:space="preserve">Built </w:t>
+      </w:r>
+      <w:proofErr w:type="gramStart"/>
+      <w:r>
+        <w:rPr>
+          <w:b/>
+          <w:bCs/>
+        </w:rPr>
+        <w:t>dark-mode</w:t>
+      </w:r>
+      <w:proofErr w:type="gramEnd"/>
+      <w:r>
+        <w:rPr>
+          <w:b/>
+          <w:bCs/>
+        </w:rPr>
+        <w:t xml:space="preserve"> React dashboard with </w:t>
+      </w:r>
+      <w:proofErr w:type="spellStart"/>
+      <w:r>
+        <w:rPr>
+          <w:b/>
+          <w:bCs/>
+        </w:rPr>
+        <w:t>Glassmorphism</w:t>
+      </w:r>
+      <w:proofErr w:type="spellEnd"/>
+      <w:r>
+        <w:rPr>
+          <w:b/>
+          <w:bCs/>
+        </w:rPr>
+        <w:t>.</w:t>
       </w:r>
     </w:p>
     <w:p>
@@ -409,7 +704,7 @@
           <w:b/>
           <w:bCs/>
         </w:rPr>
-        <w:t>Executed live test. Pipeline successfully fetched CoinGecko data, bypassed Farside Cloudflare block, and communicated with Gemini API.</w:t>
+        <w:t>Implemented Freemium Paywall (Blur/Padlock) and Stripe Redirect.</w:t>
       </w:r>
     </w:p>
     <w:p>
@@ -424,7 +719,23 @@
           <w:b/>
           <w:bCs/>
         </w:rPr>
-        <w:t>Deployed backend to Render.com.</w:t>
+        <w:t xml:space="preserve">Deployed frontend to </w:t>
+      </w:r>
+      <w:proofErr w:type="spellStart"/>
+      <w:r>
+        <w:rPr>
+          <w:b/>
+          <w:bCs/>
+        </w:rPr>
+        <w:t>Vercel</w:t>
+      </w:r>
+      <w:proofErr w:type="spellEnd"/>
+      <w:r>
+        <w:rPr>
+          <w:b/>
+          <w:bCs/>
+        </w:rPr>
+        <w:t>.</w:t>
       </w:r>
     </w:p>
     <w:p>
@@ -436,18 +747,10 @@
       </w:pPr>
       <w:r>
         <w:rPr>
-          <w:rFonts w:ascii="Segoe UI Emoji" w:hAnsi="Segoe UI Emoji" w:cs="Segoe UI Emoji"/>
-          <w:b/>
-          <w:bCs/>
-        </w:rPr>
-        <w:t>🟢</w:t>
-      </w:r>
-      <w:r>
-        <w:rPr>
-          <w:b/>
-          <w:bCs/>
-        </w:rPr>
-        <w:t xml:space="preserve"> PHASE 3: THE FRONTEND BUILD (React UI)</w:t>
+          <w:b/>
+          <w:bCs/>
+        </w:rPr>
+        <w:t>Post-Beta Patch: Reordered mobile layout, fixed overflow scrolling, added educational tooltips.</w:t>
       </w:r>
     </w:p>
     <w:p>
@@ -459,12 +762,35 @@
       </w:pPr>
       <w:r>
         <w:rPr>
+          <w:rFonts w:ascii="Segoe UI Emoji" w:hAnsi="Segoe UI Emoji" w:cs="Segoe UI Emoji"/>
+          <w:b/>
+          <w:bCs/>
+        </w:rPr>
+        <w:t>🟡</w:t>
+      </w:r>
+      <w:r>
+        <w:rPr>
+          <w:b/>
+          <w:bCs/>
+        </w:rPr>
+        <w:t xml:space="preserve"> PHASE 4: THE SHIELD &amp; LAUNCH (Legal &amp; Go-To-Market)</w:t>
+      </w:r>
+    </w:p>
+    <w:p>
+      <w:pPr>
+        <w:rPr>
+          <w:b/>
+          <w:bCs/>
+        </w:rPr>
+      </w:pPr>
+      <w:r>
+        <w:rPr>
           <w:b/>
           <w:bCs/>
           <w:i/>
           <w:iCs/>
         </w:rPr>
-        <w:t>Status: [COMPLETED - May 4, 2026]</w:t>
+        <w:t>Status: [IN PROGRESS]</w:t>
       </w:r>
     </w:p>
     <w:p>
@@ -479,7 +805,23 @@
           <w:b/>
           <w:bCs/>
         </w:rPr>
-        <w:t>Deployed Agent 2 (Frontend Designer) in Antigravity.</w:t>
+        <w:t xml:space="preserve">Launched X (Twitter) </w:t>
+      </w:r>
+      <w:proofErr w:type="gramStart"/>
+      <w:r>
+        <w:rPr>
+          <w:b/>
+          <w:bCs/>
+        </w:rPr>
+        <w:t>brand @</w:t>
+      </w:r>
+      <w:proofErr w:type="gramEnd"/>
+      <w:r>
+        <w:rPr>
+          <w:b/>
+          <w:bCs/>
+        </w:rPr>
+        <w:t>AresQuant and posted Beta Platoon recruitment thread.</w:t>
       </w:r>
     </w:p>
     <w:p>
@@ -494,7 +836,23 @@
           <w:b/>
           <w:bCs/>
         </w:rPr>
-        <w:t>Built dark-mode React dashboard with Glassmorphism and military-grade typography.</w:t>
+        <w:t xml:space="preserve">Initiated Beta Bounty on </w:t>
+      </w:r>
+      <w:proofErr w:type="spellStart"/>
+      <w:r>
+        <w:rPr>
+          <w:b/>
+          <w:bCs/>
+        </w:rPr>
+        <w:t>Zealy</w:t>
+      </w:r>
+      <w:proofErr w:type="spellEnd"/>
+      <w:r>
+        <w:rPr>
+          <w:b/>
+          <w:bCs/>
+        </w:rPr>
+        <w:t xml:space="preserve"> and BetaTesting.com.</w:t>
       </w:r>
     </w:p>
     <w:p>
@@ -509,7 +867,7 @@
           <w:b/>
           <w:bCs/>
         </w:rPr>
-        <w:t>Connected Node.js JSON output to React UI components.</w:t>
+        <w:t>Activated Stripe payment gateway ($29/month) via CVEV Strategies LLC.</w:t>
       </w:r>
     </w:p>
     <w:p>
@@ -524,7 +882,8 @@
           <w:b/>
           <w:bCs/>
         </w:rPr>
-        <w:t>Implemented Freemium Paywall (Blur/Padlock) and Dev Toggle.</w:t>
+        <w:lastRenderedPageBreak/>
+        <w:t>Draft Terms of Service and Privacy Policy.</w:t>
       </w:r>
     </w:p>
     <w:p>
@@ -536,10 +895,18 @@
       </w:pPr>
       <w:r>
         <w:rPr>
-          <w:b/>
-          <w:bCs/>
-        </w:rPr>
-        <w:t>Added Legal Disclaimer and Copyright Footer.</w:t>
+          <w:rFonts w:ascii="Segoe UI Emoji" w:hAnsi="Segoe UI Emoji" w:cs="Segoe UI Emoji"/>
+          <w:b/>
+          <w:bCs/>
+        </w:rPr>
+        <w:t>🔴</w:t>
+      </w:r>
+      <w:r>
+        <w:rPr>
+          <w:b/>
+          <w:bCs/>
+        </w:rPr>
+        <w:t xml:space="preserve"> PHASE 5: GLOBAL LOCALIZATION (The Multilingual Engine)</w:t>
       </w:r>
     </w:p>
     <w:p>
@@ -553,8 +920,10 @@
         <w:rPr>
           <w:b/>
           <w:bCs/>
-        </w:rPr>
-        <w:t>Deployed frontend to Vercel.</w:t>
+          <w:i/>
+          <w:iCs/>
+        </w:rPr>
+        <w:t>Status: [LOCKED - Awaiting 100 Paying Users]</w:t>
       </w:r>
     </w:p>
     <w:p>
@@ -569,7 +938,7 @@
           <w:b/>
           <w:bCs/>
         </w:rPr>
-        <w:t>Post-Beta Patch: Reordered mobile layout, fixed overflow scrolling, and added educational tooltips based on user feedback.</w:t>
+        <w:t>Add language toggle to React UI (EN, KO, ES, JP).</w:t>
       </w:r>
     </w:p>
     <w:p>
@@ -581,18 +950,10 @@
       </w:pPr>
       <w:r>
         <w:rPr>
-          <w:rFonts w:ascii="Segoe UI Emoji" w:hAnsi="Segoe UI Emoji" w:cs="Segoe UI Emoji"/>
-          <w:b/>
-          <w:bCs/>
-        </w:rPr>
-        <w:t>🟡</w:t>
-      </w:r>
-      <w:r>
-        <w:rPr>
-          <w:b/>
-          <w:bCs/>
-        </w:rPr>
-        <w:t xml:space="preserve"> PHASE 4: THE SHIELD &amp; LAUNCH (Legal &amp; Go-To-Market)</w:t>
+          <w:b/>
+          <w:bCs/>
+        </w:rPr>
+        <w:t>Update Node.js backend to pass language parameter to Gemini API.</w:t>
       </w:r>
     </w:p>
     <w:p>
@@ -606,10 +967,59 @@
         <w:rPr>
           <w:b/>
           <w:bCs/>
+        </w:rPr>
+        <w:t>Launch targeted X/Twitter ads in South Korea and Latin America.</w:t>
+      </w:r>
+    </w:p>
+    <w:p>
+      <w:pPr>
+        <w:rPr>
+          <w:b/>
+          <w:bCs/>
+        </w:rPr>
+      </w:pPr>
+      <w:r>
+        <w:rPr>
+          <w:rFonts w:ascii="Segoe UI Emoji" w:hAnsi="Segoe UI Emoji" w:cs="Segoe UI Emoji"/>
+          <w:b/>
+          <w:bCs/>
+        </w:rPr>
+        <w:t>🔴</w:t>
+      </w:r>
+      <w:r>
+        <w:rPr>
+          <w:b/>
+          <w:bCs/>
+        </w:rPr>
+        <w:t xml:space="preserve"> PHASE 6: THE ENTERPRISE B2B PIPELINE</w:t>
+      </w:r>
+    </w:p>
+    <w:p>
+      <w:pPr>
+        <w:rPr>
+          <w:b/>
+          <w:bCs/>
+        </w:rPr>
+      </w:pPr>
+      <w:proofErr w:type="gramStart"/>
+      <w:r>
+        <w:rPr>
+          <w:b/>
+          <w:bCs/>
           <w:i/>
           <w:iCs/>
         </w:rPr>
-        <w:t>Status: [IN PROGRESS]</w:t>
+        <w:t>Status:[</w:t>
+      </w:r>
+      <w:proofErr w:type="gramEnd"/>
+      <w:r>
+        <w:rPr>
+          <w:b/>
+          <w:bCs/>
+          <w:i/>
+          <w:iCs/>
+        </w:rPr>
+        <w:t>LOCKED - Awaiting Phase 5 Completion]</w:t>
       </w:r>
     </w:p>
     <w:p>
@@ -624,7 +1034,7 @@
           <w:b/>
           <w:bCs/>
         </w:rPr>
-        <w:t>Step 1: Launched X (Twitter) brand @AresQuant and posted Beta Platoon recruitment thread.</w:t>
+        <w:t>Build secure API endpoint for institutional algorithmic trading bots.</w:t>
       </w:r>
     </w:p>
     <w:p>
@@ -639,7 +1049,7 @@
           <w:b/>
           <w:bCs/>
         </w:rPr>
-        <w:t>Step 2: Initiated Beta Bounty on Zealy and BetaTesting.com.</w:t>
+        <w:t>Price at $5,000/month + API call volume fees.</w:t>
       </w:r>
     </w:p>
     <w:p>
@@ -654,30 +1064,7 @@
           <w:b/>
           <w:bCs/>
         </w:rPr>
-        <w:t>Step 3: Form the LLC (e.g., Stripe Atlas) to establish the Corporate Veil.</w:t>
-      </w:r>
-    </w:p>
-    <w:p>
-      <w:pPr>
-        <w:rPr>
-          <w:b/>
-          <w:bCs/>
-        </w:rPr>
-      </w:pPr>
-      <w:r>
-        <w:rPr>
-          <w:b/>
-          <w:bCs/>
-        </w:rPr>
-        <w:t>Step 4: Draft Terms of Service and Privacy Policy (As-Is clause, no financial advice).</w:t>
-      </w:r>
-      <w:r>
-        <w:rPr>
-          <w:b/>
-          <w:bCs/>
-        </w:rPr>
-        <w:br/>
-        <w:t>*[ ] Step 5: Activate the Stripe payment gateway ($29/month) with 1-click cancel portal and mandatory ToS checkbox.</w:t>
+        <w:t>Pitch directly to Wealth Management firms as an "Outsourced Chief Risk Officer."</w:t>
       </w:r>
     </w:p>
     <w:p/>
@@ -2112,6 +2499,155 @@
     </w:lvl>
   </w:abstractNum>
   <w:abstractNum w:abstractNumId="10" w15:restartNumberingAfterBreak="0">
+    <w:nsid w:val="3CB53753"/>
+    <w:multiLevelType w:val="multilevel"/>
+    <w:tmpl w:val="3A2AB962"/>
+    <w:lvl w:ilvl="0">
+      <w:start w:val="1"/>
+      <w:numFmt w:val="bullet"/>
+      <w:lvlText w:val=""/>
+      <w:lvlJc w:val="left"/>
+      <w:pPr>
+        <w:tabs>
+          <w:tab w:val="num" w:pos="720"/>
+        </w:tabs>
+        <w:ind w:left="720" w:hanging="360"/>
+      </w:pPr>
+      <w:rPr>
+        <w:rFonts w:ascii="Symbol" w:hAnsi="Symbol" w:hint="default"/>
+        <w:sz w:val="20"/>
+      </w:rPr>
+    </w:lvl>
+    <w:lvl w:ilvl="1" w:tentative="1">
+      <w:start w:val="1"/>
+      <w:numFmt w:val="bullet"/>
+      <w:lvlText w:val="o"/>
+      <w:lvlJc w:val="left"/>
+      <w:pPr>
+        <w:tabs>
+          <w:tab w:val="num" w:pos="1440"/>
+        </w:tabs>
+        <w:ind w:left="1440" w:hanging="360"/>
+      </w:pPr>
+      <w:rPr>
+        <w:rFonts w:ascii="Courier New" w:hAnsi="Courier New" w:hint="default"/>
+        <w:sz w:val="20"/>
+      </w:rPr>
+    </w:lvl>
+    <w:lvl w:ilvl="2" w:tentative="1">
+      <w:start w:val="1"/>
+      <w:numFmt w:val="bullet"/>
+      <w:lvlText w:val=""/>
+      <w:lvlJc w:val="left"/>
+      <w:pPr>
+        <w:tabs>
+          <w:tab w:val="num" w:pos="2160"/>
+        </w:tabs>
+        <w:ind w:left="2160" w:hanging="360"/>
+      </w:pPr>
+      <w:rPr>
+        <w:rFonts w:ascii="Wingdings" w:hAnsi="Wingdings" w:hint="default"/>
+        <w:sz w:val="20"/>
+      </w:rPr>
+    </w:lvl>
+    <w:lvl w:ilvl="3" w:tentative="1">
+      <w:start w:val="1"/>
+      <w:numFmt w:val="bullet"/>
+      <w:lvlText w:val=""/>
+      <w:lvlJc w:val="left"/>
+      <w:pPr>
+        <w:tabs>
+          <w:tab w:val="num" w:pos="2880"/>
+        </w:tabs>
+        <w:ind w:left="2880" w:hanging="360"/>
+      </w:pPr>
+      <w:rPr>
+        <w:rFonts w:ascii="Wingdings" w:hAnsi="Wingdings" w:hint="default"/>
+        <w:sz w:val="20"/>
+      </w:rPr>
+    </w:lvl>
+    <w:lvl w:ilvl="4" w:tentative="1">
+      <w:start w:val="1"/>
+      <w:numFmt w:val="bullet"/>
+      <w:lvlText w:val=""/>
+      <w:lvlJc w:val="left"/>
+      <w:pPr>
+        <w:tabs>
+          <w:tab w:val="num" w:pos="3600"/>
+        </w:tabs>
+        <w:ind w:left="3600" w:hanging="360"/>
+      </w:pPr>
+      <w:rPr>
+        <w:rFonts w:ascii="Wingdings" w:hAnsi="Wingdings" w:hint="default"/>
+        <w:sz w:val="20"/>
+      </w:rPr>
+    </w:lvl>
+    <w:lvl w:ilvl="5" w:tentative="1">
+      <w:start w:val="1"/>
+      <w:numFmt w:val="bullet"/>
+      <w:lvlText w:val=""/>
+      <w:lvlJc w:val="left"/>
+      <w:pPr>
+        <w:tabs>
+          <w:tab w:val="num" w:pos="4320"/>
+        </w:tabs>
+        <w:ind w:left="4320" w:hanging="360"/>
+      </w:pPr>
+      <w:rPr>
+        <w:rFonts w:ascii="Wingdings" w:hAnsi="Wingdings" w:hint="default"/>
+        <w:sz w:val="20"/>
+      </w:rPr>
+    </w:lvl>
+    <w:lvl w:ilvl="6" w:tentative="1">
+      <w:start w:val="1"/>
+      <w:numFmt w:val="bullet"/>
+      <w:lvlText w:val=""/>
+      <w:lvlJc w:val="left"/>
+      <w:pPr>
+        <w:tabs>
+          <w:tab w:val="num" w:pos="5040"/>
+        </w:tabs>
+        <w:ind w:left="5040" w:hanging="360"/>
+      </w:pPr>
+      <w:rPr>
+        <w:rFonts w:ascii="Wingdings" w:hAnsi="Wingdings" w:hint="default"/>
+        <w:sz w:val="20"/>
+      </w:rPr>
+    </w:lvl>
+    <w:lvl w:ilvl="7" w:tentative="1">
+      <w:start w:val="1"/>
+      <w:numFmt w:val="bullet"/>
+      <w:lvlText w:val=""/>
+      <w:lvlJc w:val="left"/>
+      <w:pPr>
+        <w:tabs>
+          <w:tab w:val="num" w:pos="5760"/>
+        </w:tabs>
+        <w:ind w:left="5760" w:hanging="360"/>
+      </w:pPr>
+      <w:rPr>
+        <w:rFonts w:ascii="Wingdings" w:hAnsi="Wingdings" w:hint="default"/>
+        <w:sz w:val="20"/>
+      </w:rPr>
+    </w:lvl>
+    <w:lvl w:ilvl="8" w:tentative="1">
+      <w:start w:val="1"/>
+      <w:numFmt w:val="bullet"/>
+      <w:lvlText w:val=""/>
+      <w:lvlJc w:val="left"/>
+      <w:pPr>
+        <w:tabs>
+          <w:tab w:val="num" w:pos="6480"/>
+        </w:tabs>
+        <w:ind w:left="6480" w:hanging="360"/>
+      </w:pPr>
+      <w:rPr>
+        <w:rFonts w:ascii="Wingdings" w:hAnsi="Wingdings" w:hint="default"/>
+        <w:sz w:val="20"/>
+      </w:rPr>
+    </w:lvl>
+  </w:abstractNum>
+  <w:abstractNum w:abstractNumId="11" w15:restartNumberingAfterBreak="0">
     <w:nsid w:val="3EC96FB4"/>
     <w:multiLevelType w:val="multilevel"/>
     <w:tmpl w:val="5CF0F000"/>
@@ -2260,7 +2796,7 @@
       </w:rPr>
     </w:lvl>
   </w:abstractNum>
-  <w:abstractNum w:abstractNumId="11" w15:restartNumberingAfterBreak="0">
+  <w:abstractNum w:abstractNumId="12" w15:restartNumberingAfterBreak="0">
     <w:nsid w:val="3ECC4647"/>
     <w:multiLevelType w:val="multilevel"/>
     <w:tmpl w:val="ABEE4BA2"/>
@@ -2373,7 +2909,156 @@
       </w:pPr>
     </w:lvl>
   </w:abstractNum>
-  <w:abstractNum w:abstractNumId="12" w15:restartNumberingAfterBreak="0">
+  <w:abstractNum w:abstractNumId="13" w15:restartNumberingAfterBreak="0">
+    <w:nsid w:val="40B5324A"/>
+    <w:multiLevelType w:val="multilevel"/>
+    <w:tmpl w:val="F2BA4C7C"/>
+    <w:lvl w:ilvl="0">
+      <w:start w:val="1"/>
+      <w:numFmt w:val="bullet"/>
+      <w:lvlText w:val=""/>
+      <w:lvlJc w:val="left"/>
+      <w:pPr>
+        <w:tabs>
+          <w:tab w:val="num" w:pos="720"/>
+        </w:tabs>
+        <w:ind w:left="720" w:hanging="360"/>
+      </w:pPr>
+      <w:rPr>
+        <w:rFonts w:ascii="Symbol" w:hAnsi="Symbol" w:hint="default"/>
+        <w:sz w:val="20"/>
+      </w:rPr>
+    </w:lvl>
+    <w:lvl w:ilvl="1" w:tentative="1">
+      <w:start w:val="1"/>
+      <w:numFmt w:val="bullet"/>
+      <w:lvlText w:val="o"/>
+      <w:lvlJc w:val="left"/>
+      <w:pPr>
+        <w:tabs>
+          <w:tab w:val="num" w:pos="1440"/>
+        </w:tabs>
+        <w:ind w:left="1440" w:hanging="360"/>
+      </w:pPr>
+      <w:rPr>
+        <w:rFonts w:ascii="Courier New" w:hAnsi="Courier New" w:hint="default"/>
+        <w:sz w:val="20"/>
+      </w:rPr>
+    </w:lvl>
+    <w:lvl w:ilvl="2" w:tentative="1">
+      <w:start w:val="1"/>
+      <w:numFmt w:val="bullet"/>
+      <w:lvlText w:val=""/>
+      <w:lvlJc w:val="left"/>
+      <w:pPr>
+        <w:tabs>
+          <w:tab w:val="num" w:pos="2160"/>
+        </w:tabs>
+        <w:ind w:left="2160" w:hanging="360"/>
+      </w:pPr>
+      <w:rPr>
+        <w:rFonts w:ascii="Wingdings" w:hAnsi="Wingdings" w:hint="default"/>
+        <w:sz w:val="20"/>
+      </w:rPr>
+    </w:lvl>
+    <w:lvl w:ilvl="3" w:tentative="1">
+      <w:start w:val="1"/>
+      <w:numFmt w:val="bullet"/>
+      <w:lvlText w:val=""/>
+      <w:lvlJc w:val="left"/>
+      <w:pPr>
+        <w:tabs>
+          <w:tab w:val="num" w:pos="2880"/>
+        </w:tabs>
+        <w:ind w:left="2880" w:hanging="360"/>
+      </w:pPr>
+      <w:rPr>
+        <w:rFonts w:ascii="Wingdings" w:hAnsi="Wingdings" w:hint="default"/>
+        <w:sz w:val="20"/>
+      </w:rPr>
+    </w:lvl>
+    <w:lvl w:ilvl="4" w:tentative="1">
+      <w:start w:val="1"/>
+      <w:numFmt w:val="bullet"/>
+      <w:lvlText w:val=""/>
+      <w:lvlJc w:val="left"/>
+      <w:pPr>
+        <w:tabs>
+          <w:tab w:val="num" w:pos="3600"/>
+        </w:tabs>
+        <w:ind w:left="3600" w:hanging="360"/>
+      </w:pPr>
+      <w:rPr>
+        <w:rFonts w:ascii="Wingdings" w:hAnsi="Wingdings" w:hint="default"/>
+        <w:sz w:val="20"/>
+      </w:rPr>
+    </w:lvl>
+    <w:lvl w:ilvl="5" w:tentative="1">
+      <w:start w:val="1"/>
+      <w:numFmt w:val="bullet"/>
+      <w:lvlText w:val=""/>
+      <w:lvlJc w:val="left"/>
+      <w:pPr>
+        <w:tabs>
+          <w:tab w:val="num" w:pos="4320"/>
+        </w:tabs>
+        <w:ind w:left="4320" w:hanging="360"/>
+      </w:pPr>
+      <w:rPr>
+        <w:rFonts w:ascii="Wingdings" w:hAnsi="Wingdings" w:hint="default"/>
+        <w:sz w:val="20"/>
+      </w:rPr>
+    </w:lvl>
+    <w:lvl w:ilvl="6" w:tentative="1">
+      <w:start w:val="1"/>
+      <w:numFmt w:val="bullet"/>
+      <w:lvlText w:val=""/>
+      <w:lvlJc w:val="left"/>
+      <w:pPr>
+        <w:tabs>
+          <w:tab w:val="num" w:pos="5040"/>
+        </w:tabs>
+        <w:ind w:left="5040" w:hanging="360"/>
+      </w:pPr>
+      <w:rPr>
+        <w:rFonts w:ascii="Wingdings" w:hAnsi="Wingdings" w:hint="default"/>
+        <w:sz w:val="20"/>
+      </w:rPr>
+    </w:lvl>
+    <w:lvl w:ilvl="7" w:tentative="1">
+      <w:start w:val="1"/>
+      <w:numFmt w:val="bullet"/>
+      <w:lvlText w:val=""/>
+      <w:lvlJc w:val="left"/>
+      <w:pPr>
+        <w:tabs>
+          <w:tab w:val="num" w:pos="5760"/>
+        </w:tabs>
+        <w:ind w:left="5760" w:hanging="360"/>
+      </w:pPr>
+      <w:rPr>
+        <w:rFonts w:ascii="Wingdings" w:hAnsi="Wingdings" w:hint="default"/>
+        <w:sz w:val="20"/>
+      </w:rPr>
+    </w:lvl>
+    <w:lvl w:ilvl="8" w:tentative="1">
+      <w:start w:val="1"/>
+      <w:numFmt w:val="bullet"/>
+      <w:lvlText w:val=""/>
+      <w:lvlJc w:val="left"/>
+      <w:pPr>
+        <w:tabs>
+          <w:tab w:val="num" w:pos="6480"/>
+        </w:tabs>
+        <w:ind w:left="6480" w:hanging="360"/>
+      </w:pPr>
+      <w:rPr>
+        <w:rFonts w:ascii="Wingdings" w:hAnsi="Wingdings" w:hint="default"/>
+        <w:sz w:val="20"/>
+      </w:rPr>
+    </w:lvl>
+  </w:abstractNum>
+  <w:abstractNum w:abstractNumId="14" w15:restartNumberingAfterBreak="0">
     <w:nsid w:val="47CC1A89"/>
     <w:multiLevelType w:val="multilevel"/>
     <w:tmpl w:val="650CEE58"/>
@@ -2522,7 +3207,7 @@
       </w:rPr>
     </w:lvl>
   </w:abstractNum>
-  <w:abstractNum w:abstractNumId="13" w15:restartNumberingAfterBreak="0">
+  <w:abstractNum w:abstractNumId="15" w15:restartNumberingAfterBreak="0">
     <w:nsid w:val="48397FB2"/>
     <w:multiLevelType w:val="multilevel"/>
     <w:tmpl w:val="3B3E1206"/>
@@ -2635,7 +3320,120 @@
       </w:pPr>
     </w:lvl>
   </w:abstractNum>
-  <w:abstractNum w:abstractNumId="14" w15:restartNumberingAfterBreak="0">
+  <w:abstractNum w:abstractNumId="16" w15:restartNumberingAfterBreak="0">
+    <w:nsid w:val="4BEF63ED"/>
+    <w:multiLevelType w:val="multilevel"/>
+    <w:tmpl w:val="85DCDA0A"/>
+    <w:lvl w:ilvl="0">
+      <w:start w:val="1"/>
+      <w:numFmt w:val="decimal"/>
+      <w:lvlText w:val="%1."/>
+      <w:lvlJc w:val="left"/>
+      <w:pPr>
+        <w:tabs>
+          <w:tab w:val="num" w:pos="720"/>
+        </w:tabs>
+        <w:ind w:left="720" w:hanging="360"/>
+      </w:pPr>
+    </w:lvl>
+    <w:lvl w:ilvl="1" w:tentative="1">
+      <w:start w:val="1"/>
+      <w:numFmt w:val="decimal"/>
+      <w:lvlText w:val="%2."/>
+      <w:lvlJc w:val="left"/>
+      <w:pPr>
+        <w:tabs>
+          <w:tab w:val="num" w:pos="1440"/>
+        </w:tabs>
+        <w:ind w:left="1440" w:hanging="360"/>
+      </w:pPr>
+    </w:lvl>
+    <w:lvl w:ilvl="2" w:tentative="1">
+      <w:start w:val="1"/>
+      <w:numFmt w:val="decimal"/>
+      <w:lvlText w:val="%3."/>
+      <w:lvlJc w:val="left"/>
+      <w:pPr>
+        <w:tabs>
+          <w:tab w:val="num" w:pos="2160"/>
+        </w:tabs>
+        <w:ind w:left="2160" w:hanging="360"/>
+      </w:pPr>
+    </w:lvl>
+    <w:lvl w:ilvl="3" w:tentative="1">
+      <w:start w:val="1"/>
+      <w:numFmt w:val="decimal"/>
+      <w:lvlText w:val="%4."/>
+      <w:lvlJc w:val="left"/>
+      <w:pPr>
+        <w:tabs>
+          <w:tab w:val="num" w:pos="2880"/>
+        </w:tabs>
+        <w:ind w:left="2880" w:hanging="360"/>
+      </w:pPr>
+    </w:lvl>
+    <w:lvl w:ilvl="4" w:tentative="1">
+      <w:start w:val="1"/>
+      <w:numFmt w:val="decimal"/>
+      <w:lvlText w:val="%5."/>
+      <w:lvlJc w:val="left"/>
+      <w:pPr>
+        <w:tabs>
+          <w:tab w:val="num" w:pos="3600"/>
+        </w:tabs>
+        <w:ind w:left="3600" w:hanging="360"/>
+      </w:pPr>
+    </w:lvl>
+    <w:lvl w:ilvl="5" w:tentative="1">
+      <w:start w:val="1"/>
+      <w:numFmt w:val="decimal"/>
+      <w:lvlText w:val="%6."/>
+      <w:lvlJc w:val="left"/>
+      <w:pPr>
+        <w:tabs>
+          <w:tab w:val="num" w:pos="4320"/>
+        </w:tabs>
+        <w:ind w:left="4320" w:hanging="360"/>
+      </w:pPr>
+    </w:lvl>
+    <w:lvl w:ilvl="6" w:tentative="1">
+      <w:start w:val="1"/>
+      <w:numFmt w:val="decimal"/>
+      <w:lvlText w:val="%7."/>
+      <w:lvlJc w:val="left"/>
+      <w:pPr>
+        <w:tabs>
+          <w:tab w:val="num" w:pos="5040"/>
+        </w:tabs>
+        <w:ind w:left="5040" w:hanging="360"/>
+      </w:pPr>
+    </w:lvl>
+    <w:lvl w:ilvl="7" w:tentative="1">
+      <w:start w:val="1"/>
+      <w:numFmt w:val="decimal"/>
+      <w:lvlText w:val="%8."/>
+      <w:lvlJc w:val="left"/>
+      <w:pPr>
+        <w:tabs>
+          <w:tab w:val="num" w:pos="5760"/>
+        </w:tabs>
+        <w:ind w:left="5760" w:hanging="360"/>
+      </w:pPr>
+    </w:lvl>
+    <w:lvl w:ilvl="8" w:tentative="1">
+      <w:start w:val="1"/>
+      <w:numFmt w:val="decimal"/>
+      <w:lvlText w:val="%9."/>
+      <w:lvlJc w:val="left"/>
+      <w:pPr>
+        <w:tabs>
+          <w:tab w:val="num" w:pos="6480"/>
+        </w:tabs>
+        <w:ind w:left="6480" w:hanging="360"/>
+      </w:pPr>
+    </w:lvl>
+  </w:abstractNum>
+  <w:abstractNum w:abstractNumId="17" w15:restartNumberingAfterBreak="0">
     <w:nsid w:val="4F064C07"/>
     <w:multiLevelType w:val="multilevel"/>
     <w:tmpl w:val="D174CC7C"/>
@@ -2784,7 +3582,7 @@
       </w:rPr>
     </w:lvl>
   </w:abstractNum>
-  <w:abstractNum w:abstractNumId="15" w15:restartNumberingAfterBreak="0">
+  <w:abstractNum w:abstractNumId="18" w15:restartNumberingAfterBreak="0">
     <w:nsid w:val="516C695D"/>
     <w:multiLevelType w:val="multilevel"/>
     <w:tmpl w:val="C7D849C8"/>
@@ -2897,7 +3695,7 @@
       </w:pPr>
     </w:lvl>
   </w:abstractNum>
-  <w:abstractNum w:abstractNumId="16" w15:restartNumberingAfterBreak="0">
+  <w:abstractNum w:abstractNumId="19" w15:restartNumberingAfterBreak="0">
     <w:nsid w:val="545F13AB"/>
     <w:multiLevelType w:val="multilevel"/>
     <w:tmpl w:val="58C01EAA"/>
@@ -3010,7 +3808,7 @@
       </w:pPr>
     </w:lvl>
   </w:abstractNum>
-  <w:abstractNum w:abstractNumId="17" w15:restartNumberingAfterBreak="0">
+  <w:abstractNum w:abstractNumId="20" w15:restartNumberingAfterBreak="0">
     <w:nsid w:val="56B17E38"/>
     <w:multiLevelType w:val="multilevel"/>
     <w:tmpl w:val="17E0525A"/>
@@ -3159,7 +3957,7 @@
       </w:rPr>
     </w:lvl>
   </w:abstractNum>
-  <w:abstractNum w:abstractNumId="18" w15:restartNumberingAfterBreak="0">
+  <w:abstractNum w:abstractNumId="21" w15:restartNumberingAfterBreak="0">
     <w:nsid w:val="57505B68"/>
     <w:multiLevelType w:val="multilevel"/>
     <w:tmpl w:val="C23295CA"/>
@@ -3308,7 +4106,7 @@
       </w:rPr>
     </w:lvl>
   </w:abstractNum>
-  <w:abstractNum w:abstractNumId="19" w15:restartNumberingAfterBreak="0">
+  <w:abstractNum w:abstractNumId="22" w15:restartNumberingAfterBreak="0">
     <w:nsid w:val="5DE023C2"/>
     <w:multiLevelType w:val="multilevel"/>
     <w:tmpl w:val="225C8F1A"/>
@@ -3421,7 +4219,7 @@
       </w:pPr>
     </w:lvl>
   </w:abstractNum>
-  <w:abstractNum w:abstractNumId="20" w15:restartNumberingAfterBreak="0">
+  <w:abstractNum w:abstractNumId="23" w15:restartNumberingAfterBreak="0">
     <w:nsid w:val="5FD83B9C"/>
     <w:multiLevelType w:val="multilevel"/>
     <w:tmpl w:val="243091DE"/>
@@ -3570,7 +4368,7 @@
       </w:rPr>
     </w:lvl>
   </w:abstractNum>
-  <w:abstractNum w:abstractNumId="21" w15:restartNumberingAfterBreak="0">
+  <w:abstractNum w:abstractNumId="24" w15:restartNumberingAfterBreak="0">
     <w:nsid w:val="677F3F01"/>
     <w:multiLevelType w:val="multilevel"/>
     <w:tmpl w:val="A28A0798"/>
@@ -3719,7 +4517,7 @@
       </w:rPr>
     </w:lvl>
   </w:abstractNum>
-  <w:abstractNum w:abstractNumId="22" w15:restartNumberingAfterBreak="0">
+  <w:abstractNum w:abstractNumId="25" w15:restartNumberingAfterBreak="0">
     <w:nsid w:val="775138DB"/>
     <w:multiLevelType w:val="multilevel"/>
     <w:tmpl w:val="BB16D816"/>
@@ -3869,7 +4667,7 @@
     </w:lvl>
   </w:abstractNum>
   <w:num w:numId="1" w16cid:durableId="789280021">
-    <w:abstractNumId w:val="12"/>
+    <w:abstractNumId w:val="14"/>
   </w:num>
   <w:num w:numId="2" w16cid:durableId="137504928">
     <w:abstractNumId w:val="1"/>
@@ -3881,7 +4679,7 @@
     <w:abstractNumId w:val="7"/>
   </w:num>
   <w:num w:numId="5" w16cid:durableId="1702243630">
-    <w:abstractNumId w:val="15"/>
+    <w:abstractNumId w:val="18"/>
   </w:num>
   <w:num w:numId="6" w16cid:durableId="1139302666">
     <w:abstractNumId w:val="2"/>
@@ -3890,31 +4688,31 @@
     <w:abstractNumId w:val="4"/>
   </w:num>
   <w:num w:numId="8" w16cid:durableId="640118813">
-    <w:abstractNumId w:val="19"/>
+    <w:abstractNumId w:val="22"/>
   </w:num>
   <w:num w:numId="9" w16cid:durableId="342441912">
     <w:abstractNumId w:val="3"/>
   </w:num>
   <w:num w:numId="10" w16cid:durableId="1509635353">
-    <w:abstractNumId w:val="10"/>
+    <w:abstractNumId w:val="11"/>
   </w:num>
   <w:num w:numId="11" w16cid:durableId="1744329482">
-    <w:abstractNumId w:val="13"/>
+    <w:abstractNumId w:val="15"/>
   </w:num>
   <w:num w:numId="12" w16cid:durableId="766316797">
-    <w:abstractNumId w:val="22"/>
+    <w:abstractNumId w:val="25"/>
   </w:num>
   <w:num w:numId="13" w16cid:durableId="1252855900">
-    <w:abstractNumId w:val="20"/>
+    <w:abstractNumId w:val="23"/>
   </w:num>
   <w:num w:numId="14" w16cid:durableId="216819548">
-    <w:abstractNumId w:val="11"/>
+    <w:abstractNumId w:val="12"/>
   </w:num>
   <w:num w:numId="15" w16cid:durableId="482507873">
-    <w:abstractNumId w:val="14"/>
+    <w:abstractNumId w:val="17"/>
   </w:num>
   <w:num w:numId="16" w16cid:durableId="1311985462">
-    <w:abstractNumId w:val="17"/>
+    <w:abstractNumId w:val="20"/>
   </w:num>
   <w:num w:numId="17" w16cid:durableId="808939429">
     <w:abstractNumId w:val="8"/>
@@ -3923,7 +4721,7 @@
     <w:abstractNumId w:val="9"/>
   </w:num>
   <w:num w:numId="19" w16cid:durableId="1482308862">
-    <w:abstractNumId w:val="16"/>
+    <w:abstractNumId w:val="19"/>
   </w:num>
   <w:num w:numId="20" w16cid:durableId="685987202">
     <w:abstractNumId w:val="5"/>
@@ -3932,10 +4730,19 @@
     <w:abstractNumId w:val="6"/>
   </w:num>
   <w:num w:numId="22" w16cid:durableId="1768227695">
-    <w:abstractNumId w:val="18"/>
+    <w:abstractNumId w:val="21"/>
   </w:num>
   <w:num w:numId="23" w16cid:durableId="1535000397">
-    <w:abstractNumId w:val="21"/>
+    <w:abstractNumId w:val="24"/>
+  </w:num>
+  <w:num w:numId="24" w16cid:durableId="692389035">
+    <w:abstractNumId w:val="10"/>
+  </w:num>
+  <w:num w:numId="25" w16cid:durableId="523708466">
+    <w:abstractNumId w:val="16"/>
+  </w:num>
+  <w:num w:numId="26" w16cid:durableId="1258560676">
+    <w:abstractNumId w:val="13"/>
   </w:num>
 </w:numbering>
 </file>

</xml_diff>

<commit_message>
Translate Actionable_Intel dynamically via Gemini prompt
</commit_message>
<xml_diff>
--- a/Project ARES Recovery Prompt.docx
+++ b/Project ARES Recovery Prompt.docx
@@ -59,7 +59,7 @@
       <w:pPr>
         <w:numPr>
           <w:ilvl w:val="0"/>
-          <w:numId w:val="24"/>
+          <w:numId w:val="27"/>
         </w:numPr>
         <w:rPr>
           <w:b/>
@@ -78,7 +78,7 @@
       <w:pPr>
         <w:numPr>
           <w:ilvl w:val="0"/>
-          <w:numId w:val="24"/>
+          <w:numId w:val="27"/>
         </w:numPr>
         <w:rPr>
           <w:b/>
@@ -97,7 +97,7 @@
       <w:pPr>
         <w:numPr>
           <w:ilvl w:val="0"/>
-          <w:numId w:val="24"/>
+          <w:numId w:val="27"/>
         </w:numPr>
         <w:rPr>
           <w:b/>
@@ -116,7 +116,7 @@
       <w:pPr>
         <w:numPr>
           <w:ilvl w:val="0"/>
-          <w:numId w:val="24"/>
+          <w:numId w:val="27"/>
         </w:numPr>
         <w:rPr>
           <w:b/>
@@ -133,10 +133,6 @@
     </w:p>
     <w:p>
       <w:pPr>
-        <w:numPr>
-          <w:ilvl w:val="0"/>
-          <w:numId w:val="24"/>
-        </w:numPr>
         <w:rPr>
           <w:b/>
           <w:bCs/>
@@ -147,11 +143,15 @@
           <w:b/>
           <w:bCs/>
         </w:rPr>
-        <w:t>Exit Valuation Target: $20M+ (5x to 8x ARR multiplier).</w:t>
+        <w:t>THE GTM (GO-TO-MARKET) STRATEGY:</w:t>
       </w:r>
     </w:p>
     <w:p>
       <w:pPr>
+        <w:numPr>
+          <w:ilvl w:val="0"/>
+          <w:numId w:val="28"/>
+        </w:numPr>
         <w:rPr>
           <w:b/>
           <w:bCs/>
@@ -162,14 +162,14 @@
           <w:b/>
           <w:bCs/>
         </w:rPr>
-        <w:t>LEGAL &amp; COMPLIANCE DOCTRINE (The Corporate Armor):</w:t>
+        <w:t>The Daily Drop: Post daily Kill Zone screenshots on X to build organic authority. Quote-tweet successful trap executions as proof of work.</w:t>
       </w:r>
     </w:p>
     <w:p>
       <w:pPr>
         <w:numPr>
           <w:ilvl w:val="0"/>
-          <w:numId w:val="25"/>
+          <w:numId w:val="28"/>
         </w:numPr>
         <w:rPr>
           <w:b/>
@@ -181,14 +181,14 @@
           <w:b/>
           <w:bCs/>
         </w:rPr>
-        <w:t>Lexicon Control (SEC Shield): The app never uses the words "Buy," "Sell," "Long," or "Short." Output is strictly limited to "Support Zones," "Liquidation Clusters," and "Market Posture."</w:t>
+        <w:t>The Trojan Horse: Gift free lifetime Pro accounts to mid-tier crypto influencers (10k-50k followers) so they use watermarked ARES charts in their content.</w:t>
       </w:r>
     </w:p>
     <w:p>
       <w:pPr>
         <w:numPr>
           <w:ilvl w:val="0"/>
-          <w:numId w:val="25"/>
+          <w:numId w:val="28"/>
         </w:numPr>
         <w:rPr>
           <w:b/>
@@ -200,217 +200,23 @@
           <w:b/>
           <w:bCs/>
         </w:rPr>
-        <w:t>The Corporate Veil (Civil Shield): Operations conducted under CVEV Strategies LLC (via DBA) to isolate personal crypto wealth from business liability.</w:t>
+        <w:t>The Bloodhound Ads: Run targeted X ads </w:t>
       </w:r>
-    </w:p>
-    <w:p>
-      <w:pPr>
-        <w:numPr>
-          <w:ilvl w:val="0"/>
-          <w:numId w:val="25"/>
-        </w:numPr>
-        <w:rPr>
-          <w:b/>
-          <w:bCs/>
-        </w:rPr>
-      </w:pPr>
       <w:r>
         <w:rPr>
           <w:b/>
           <w:bCs/>
-        </w:rPr>
-        <w:t>The Click-Wrap Agreement: Users must agree to the Terms of Service (stating the app is an "As-Is" educational data tool) before Stripe checkout.</w:t>
+          <w:i/>
+          <w:iCs/>
+        </w:rPr>
+        <w:t>only</w:t>
       </w:r>
-    </w:p>
-    <w:p>
-      <w:pPr>
-        <w:rPr>
-          <w:b/>
-          <w:bCs/>
-        </w:rPr>
-      </w:pPr>
       <w:r>
         <w:rPr>
           <w:b/>
           <w:bCs/>
         </w:rPr>
-        <w:t>THE TECH STACK (Antigravity Protocol):</w:t>
-      </w:r>
-    </w:p>
-    <w:p>
-      <w:pPr>
-        <w:numPr>
-          <w:ilvl w:val="0"/>
-          <w:numId w:val="26"/>
-        </w:numPr>
-        <w:rPr>
-          <w:b/>
-          <w:bCs/>
-        </w:rPr>
-      </w:pPr>
-      <w:r>
-        <w:rPr>
-          <w:b/>
-          <w:bCs/>
-        </w:rPr>
-        <w:t>The Brain: Google AI Studio (Gemini 1.5 Pro).</w:t>
-      </w:r>
-    </w:p>
-    <w:p>
-      <w:pPr>
-        <w:numPr>
-          <w:ilvl w:val="0"/>
-          <w:numId w:val="26"/>
-        </w:numPr>
-        <w:rPr>
-          <w:b/>
-          <w:bCs/>
-        </w:rPr>
-      </w:pPr>
-      <w:r>
-        <w:rPr>
-          <w:b/>
-          <w:bCs/>
-        </w:rPr>
-        <w:t>The IDE / Development Team: Google Antigravity (Autonomous Agent Manager).</w:t>
-      </w:r>
-    </w:p>
-    <w:p>
-      <w:pPr>
-        <w:numPr>
-          <w:ilvl w:val="0"/>
-          <w:numId w:val="26"/>
-        </w:numPr>
-        <w:rPr>
-          <w:b/>
-          <w:bCs/>
-        </w:rPr>
-      </w:pPr>
-      <w:r>
-        <w:rPr>
-          <w:b/>
-          <w:bCs/>
-        </w:rPr>
-        <w:t>The Backend: Node.js (Custom script written by Antigravity Agent). Hosted on Render.com.</w:t>
-      </w:r>
-    </w:p>
-    <w:p>
-      <w:pPr>
-        <w:numPr>
-          <w:ilvl w:val="0"/>
-          <w:numId w:val="26"/>
-        </w:numPr>
-        <w:rPr>
-          <w:b/>
-          <w:bCs/>
-        </w:rPr>
-      </w:pPr>
-      <w:r>
-        <w:rPr>
-          <w:b/>
-          <w:bCs/>
-        </w:rPr>
-        <w:t>The Sensors: </w:t>
-      </w:r>
-      <w:proofErr w:type="spellStart"/>
-      <w:r>
-        <w:rPr>
-          <w:b/>
-          <w:bCs/>
-        </w:rPr>
-        <w:t>CoinGecko</w:t>
-      </w:r>
-      <w:proofErr w:type="spellEnd"/>
-      <w:r>
-        <w:rPr>
-          <w:b/>
-          <w:bCs/>
-        </w:rPr>
-        <w:t xml:space="preserve"> API, Puppeteer/Browser Agent (Scraping </w:t>
-      </w:r>
-      <w:proofErr w:type="spellStart"/>
-      <w:r>
-        <w:rPr>
-          <w:b/>
-          <w:bCs/>
-        </w:rPr>
-        <w:t>Farside</w:t>
-      </w:r>
-      <w:proofErr w:type="spellEnd"/>
-      <w:r>
-        <w:rPr>
-          <w:b/>
-          <w:bCs/>
-        </w:rPr>
-        <w:t xml:space="preserve"> ETF Flows and </w:t>
-      </w:r>
-      <w:proofErr w:type="spellStart"/>
-      <w:r>
-        <w:rPr>
-          <w:b/>
-          <w:bCs/>
-        </w:rPr>
-        <w:t>Coinglass</w:t>
-      </w:r>
-      <w:proofErr w:type="spellEnd"/>
-      <w:r>
-        <w:rPr>
-          <w:b/>
-          <w:bCs/>
-        </w:rPr>
-        <w:t xml:space="preserve"> Heatmaps).</w:t>
-      </w:r>
-    </w:p>
-    <w:p>
-      <w:pPr>
-        <w:numPr>
-          <w:ilvl w:val="0"/>
-          <w:numId w:val="26"/>
-        </w:numPr>
-        <w:rPr>
-          <w:b/>
-          <w:bCs/>
-        </w:rPr>
-      </w:pPr>
-      <w:r>
-        <w:rPr>
-          <w:b/>
-          <w:bCs/>
-        </w:rPr>
-        <w:lastRenderedPageBreak/>
-        <w:t xml:space="preserve">The Body: React Web App (Tailwind CSS, </w:t>
-      </w:r>
-      <w:proofErr w:type="spellStart"/>
-      <w:r>
-        <w:rPr>
-          <w:b/>
-          <w:bCs/>
-        </w:rPr>
-        <w:t>Glassmorphism</w:t>
-      </w:r>
-      <w:proofErr w:type="spellEnd"/>
-      <w:r>
-        <w:rPr>
-          <w:b/>
-          <w:bCs/>
-        </w:rPr>
-        <w:t xml:space="preserve"> UI). Hosted on </w:t>
-      </w:r>
-      <w:proofErr w:type="spellStart"/>
-      <w:r>
-        <w:rPr>
-          <w:b/>
-          <w:bCs/>
-        </w:rPr>
-        <w:t>Vercel</w:t>
-      </w:r>
-      <w:proofErr w:type="spellEnd"/>
-      <w:r>
-        <w:rPr>
-          <w:b/>
-          <w:bCs/>
-        </w:rPr>
-        <w:t>.</w:t>
+        <w:t> on days the market crashes &gt;10%, targeting liquidated traders seeking risk management.</w:t>
       </w:r>
     </w:p>
     <w:p>
@@ -458,7 +264,6 @@
           <w:bCs/>
         </w:rPr>
       </w:pPr>
-      <w:proofErr w:type="gramStart"/>
       <w:r>
         <w:rPr>
           <w:b/>
@@ -466,17 +271,7 @@
           <w:i/>
           <w:iCs/>
         </w:rPr>
-        <w:t>Status:[</w:t>
-      </w:r>
-      <w:proofErr w:type="gramEnd"/>
-      <w:r>
-        <w:rPr>
-          <w:b/>
-          <w:bCs/>
-          <w:i/>
-          <w:iCs/>
-        </w:rPr>
-        <w:t>COMPLETED]</w:t>
+        <w:t>Status:[COMPLETED]</w:t>
       </w:r>
     </w:p>
     <w:p>
@@ -531,36 +326,6 @@
           <w:b/>
           <w:bCs/>
         </w:rPr>
-        <w:t>Deployed Agent 1 (Backend Engineer).</w:t>
-      </w:r>
-    </w:p>
-    <w:p>
-      <w:pPr>
-        <w:rPr>
-          <w:b/>
-          <w:bCs/>
-        </w:rPr>
-      </w:pPr>
-      <w:r>
-        <w:rPr>
-          <w:b/>
-          <w:bCs/>
-        </w:rPr>
-        <w:t>Executed live test. Pipeline successfully fetched data and communicated with Gemini API.</w:t>
-      </w:r>
-    </w:p>
-    <w:p>
-      <w:pPr>
-        <w:rPr>
-          <w:b/>
-          <w:bCs/>
-        </w:rPr>
-      </w:pPr>
-      <w:r>
-        <w:rPr>
-          <w:b/>
-          <w:bCs/>
-        </w:rPr>
         <w:t>Deployed backend to Render.com.</w:t>
       </w:r>
     </w:p>
@@ -576,7 +341,7 @@
           <w:b/>
           <w:bCs/>
         </w:rPr>
-        <w:t>Night Ops Upgrade: Built and merged dynamic Altcoin Scraper into production backend.</w:t>
+        <w:t>Built and merged dynamic Altcoin Scraper into production backend.</w:t>
       </w:r>
     </w:p>
     <w:p>
@@ -609,7 +374,6 @@
           <w:bCs/>
         </w:rPr>
       </w:pPr>
-      <w:proofErr w:type="gramStart"/>
       <w:r>
         <w:rPr>
           <w:b/>
@@ -617,17 +381,8 @@
           <w:i/>
           <w:iCs/>
         </w:rPr>
-        <w:t>Status:[</w:t>
-      </w:r>
-      <w:proofErr w:type="gramEnd"/>
-      <w:r>
-        <w:rPr>
-          <w:b/>
-          <w:bCs/>
-          <w:i/>
-          <w:iCs/>
-        </w:rPr>
-        <w:t>COMPLETED]</w:t>
+        <w:lastRenderedPageBreak/>
+        <w:t>Status:[COMPLETED]</w:t>
       </w:r>
     </w:p>
     <w:p>
@@ -642,54 +397,7 @@
           <w:b/>
           <w:bCs/>
         </w:rPr>
-        <w:t>Deployed Agent 2 (Frontend Designer) in Antigravity.</w:t>
-      </w:r>
-    </w:p>
-    <w:p>
-      <w:pPr>
-        <w:rPr>
-          <w:b/>
-          <w:bCs/>
-        </w:rPr>
-      </w:pPr>
-      <w:r>
-        <w:rPr>
-          <w:b/>
-          <w:bCs/>
-        </w:rPr>
-        <w:t xml:space="preserve">Built </w:t>
-      </w:r>
-      <w:proofErr w:type="gramStart"/>
-      <w:r>
-        <w:rPr>
-          <w:b/>
-          <w:bCs/>
-        </w:rPr>
-        <w:t>dark-mode</w:t>
-      </w:r>
-      <w:proofErr w:type="gramEnd"/>
-      <w:r>
-        <w:rPr>
-          <w:b/>
-          <w:bCs/>
-        </w:rPr>
-        <w:t xml:space="preserve"> React dashboard with </w:t>
-      </w:r>
-      <w:proofErr w:type="spellStart"/>
-      <w:r>
-        <w:rPr>
-          <w:b/>
-          <w:bCs/>
-        </w:rPr>
-        <w:t>Glassmorphism</w:t>
-      </w:r>
-      <w:proofErr w:type="spellEnd"/>
-      <w:r>
-        <w:rPr>
-          <w:b/>
-          <w:bCs/>
-        </w:rPr>
-        <w:t>.</w:t>
+        <w:t>Built dark-mode React dashboard with Glassmorphism.</w:t>
       </w:r>
     </w:p>
     <w:p>
@@ -719,38 +427,7 @@
           <w:b/>
           <w:bCs/>
         </w:rPr>
-        <w:t xml:space="preserve">Deployed frontend to </w:t>
-      </w:r>
-      <w:proofErr w:type="spellStart"/>
-      <w:r>
-        <w:rPr>
-          <w:b/>
-          <w:bCs/>
-        </w:rPr>
-        <w:t>Vercel</w:t>
-      </w:r>
-      <w:proofErr w:type="spellEnd"/>
-      <w:r>
-        <w:rPr>
-          <w:b/>
-          <w:bCs/>
-        </w:rPr>
-        <w:t>.</w:t>
-      </w:r>
-    </w:p>
-    <w:p>
-      <w:pPr>
-        <w:rPr>
-          <w:b/>
-          <w:bCs/>
-        </w:rPr>
-      </w:pPr>
-      <w:r>
-        <w:rPr>
-          <w:b/>
-          <w:bCs/>
-        </w:rPr>
-        <w:t>Post-Beta Patch: Reordered mobile layout, fixed overflow scrolling, added educational tooltips.</w:t>
+        <w:t>Deployed frontend to Vercel.</w:t>
       </w:r>
     </w:p>
     <w:p>
@@ -792,67 +469,13 @@
         </w:rPr>
         <w:t>Status: [IN PROGRESS]</w:t>
       </w:r>
-    </w:p>
-    <w:p>
-      <w:pPr>
-        <w:rPr>
-          <w:b/>
-          <w:bCs/>
-        </w:rPr>
-      </w:pPr>
       <w:r>
         <w:rPr>
           <w:b/>
           <w:bCs/>
         </w:rPr>
-        <w:t xml:space="preserve">Launched X (Twitter) </w:t>
-      </w:r>
-      <w:proofErr w:type="gramStart"/>
-      <w:r>
-        <w:rPr>
-          <w:b/>
-          <w:bCs/>
-        </w:rPr>
-        <w:t>brand @</w:t>
-      </w:r>
-      <w:proofErr w:type="gramEnd"/>
-      <w:r>
-        <w:rPr>
-          <w:b/>
-          <w:bCs/>
-        </w:rPr>
-        <w:t>AresQuant and posted Beta Platoon recruitment thread.</w:t>
-      </w:r>
-    </w:p>
-    <w:p>
-      <w:pPr>
-        <w:rPr>
-          <w:b/>
-          <w:bCs/>
-        </w:rPr>
-      </w:pPr>
-      <w:r>
-        <w:rPr>
-          <w:b/>
-          <w:bCs/>
-        </w:rPr>
-        <w:t xml:space="preserve">Initiated Beta Bounty on </w:t>
-      </w:r>
-      <w:proofErr w:type="spellStart"/>
-      <w:r>
-        <w:rPr>
-          <w:b/>
-          <w:bCs/>
-        </w:rPr>
-        <w:t>Zealy</w:t>
-      </w:r>
-      <w:proofErr w:type="spellEnd"/>
-      <w:r>
-        <w:rPr>
-          <w:b/>
-          <w:bCs/>
-        </w:rPr>
-        <w:t xml:space="preserve"> and BetaTesting.com.</w:t>
+        <w:br/>
+        <w:t>*[X] Launched X (Twitter) brand @AresQuant.</w:t>
       </w:r>
     </w:p>
     <w:p>
@@ -882,7 +505,21 @@
           <w:b/>
           <w:bCs/>
         </w:rPr>
-        <w:lastRenderedPageBreak/>
+        <w:t>Execute the 3-Vector Sniper Marketing Doctrine.</w:t>
+      </w:r>
+    </w:p>
+    <w:p>
+      <w:pPr>
+        <w:rPr>
+          <w:b/>
+          <w:bCs/>
+        </w:rPr>
+      </w:pPr>
+      <w:r>
+        <w:rPr>
+          <w:b/>
+          <w:bCs/>
+        </w:rPr>
         <w:t>Draft Terms of Service and Privacy Policy.</w:t>
       </w:r>
     </w:p>
@@ -906,7 +543,7 @@
           <w:b/>
           <w:bCs/>
         </w:rPr>
-        <w:t xml:space="preserve"> PHASE 5: GLOBAL LOCALIZATION (The Multilingual Engine)</w:t>
+        <w:t xml:space="preserve"> PHASE 5: RETENTION &amp; LOCALIZATION (The Churn Killer)</w:t>
       </w:r>
     </w:p>
     <w:p>
@@ -923,7 +560,7 @@
           <w:i/>
           <w:iCs/>
         </w:rPr>
-        <w:t>Status: [LOCKED - Awaiting 100 Paying Users]</w:t>
+        <w:t>Status:[LOCKED - Awaiting 100 Paying Users]</w:t>
       </w:r>
     </w:p>
     <w:p>
@@ -938,7 +575,7 @@
           <w:b/>
           <w:bCs/>
         </w:rPr>
-        <w:t>Add language toggle to React UI (EN, KO, ES, JP).</w:t>
+        <w:t>Build SMS/Email Push Notification backend for Divergence Alerts.</w:t>
       </w:r>
     </w:p>
     <w:p>
@@ -953,22 +590,7 @@
           <w:b/>
           <w:bCs/>
         </w:rPr>
-        <w:t>Update Node.js backend to pass language parameter to Gemini API.</w:t>
-      </w:r>
-    </w:p>
-    <w:p>
-      <w:pPr>
-        <w:rPr>
-          <w:b/>
-          <w:bCs/>
-        </w:rPr>
-      </w:pPr>
-      <w:r>
-        <w:rPr>
-          <w:b/>
-          <w:bCs/>
-        </w:rPr>
-        <w:t>Launch targeted X/Twitter ads in South Korea and Latin America.</w:t>
+        <w:t>Add language toggle to React UI (EN, KO, ES, JP) using Gemini native translation.</w:t>
       </w:r>
     </w:p>
     <w:p>
@@ -1001,7 +623,6 @@
           <w:bCs/>
         </w:rPr>
       </w:pPr>
-      <w:proofErr w:type="gramStart"/>
       <w:r>
         <w:rPr>
           <w:b/>
@@ -1009,17 +630,7 @@
           <w:i/>
           <w:iCs/>
         </w:rPr>
-        <w:t>Status:[</w:t>
-      </w:r>
-      <w:proofErr w:type="gramEnd"/>
-      <w:r>
-        <w:rPr>
-          <w:b/>
-          <w:bCs/>
-          <w:i/>
-          <w:iCs/>
-        </w:rPr>
-        <w:t>LOCKED - Awaiting Phase 5 Completion]</w:t>
+        <w:t>Status:[LOCKED - Awaiting Phase 5 Completion]</w:t>
       </w:r>
     </w:p>
     <w:p>
@@ -1035,21 +646,6 @@
           <w:bCs/>
         </w:rPr>
         <w:t>Build secure API endpoint for institutional algorithmic trading bots.</w:t>
-      </w:r>
-    </w:p>
-    <w:p>
-      <w:pPr>
-        <w:rPr>
-          <w:b/>
-          <w:bCs/>
-        </w:rPr>
-      </w:pPr>
-      <w:r>
-        <w:rPr>
-          <w:b/>
-          <w:bCs/>
-        </w:rPr>
-        <w:t>Price at $5,000/month + API call volume fees.</w:t>
       </w:r>
     </w:p>
     <w:p>
@@ -2350,6 +1946,119 @@
     </w:lvl>
   </w:abstractNum>
   <w:abstractNum w:abstractNumId="9" w15:restartNumberingAfterBreak="0">
+    <w:nsid w:val="25655BEF"/>
+    <w:multiLevelType w:val="multilevel"/>
+    <w:tmpl w:val="53542AB2"/>
+    <w:lvl w:ilvl="0">
+      <w:start w:val="1"/>
+      <w:numFmt w:val="decimal"/>
+      <w:lvlText w:val="%1."/>
+      <w:lvlJc w:val="left"/>
+      <w:pPr>
+        <w:tabs>
+          <w:tab w:val="num" w:pos="720"/>
+        </w:tabs>
+        <w:ind w:left="720" w:hanging="360"/>
+      </w:pPr>
+    </w:lvl>
+    <w:lvl w:ilvl="1" w:tentative="1">
+      <w:start w:val="1"/>
+      <w:numFmt w:val="decimal"/>
+      <w:lvlText w:val="%2."/>
+      <w:lvlJc w:val="left"/>
+      <w:pPr>
+        <w:tabs>
+          <w:tab w:val="num" w:pos="1440"/>
+        </w:tabs>
+        <w:ind w:left="1440" w:hanging="360"/>
+      </w:pPr>
+    </w:lvl>
+    <w:lvl w:ilvl="2" w:tentative="1">
+      <w:start w:val="1"/>
+      <w:numFmt w:val="decimal"/>
+      <w:lvlText w:val="%3."/>
+      <w:lvlJc w:val="left"/>
+      <w:pPr>
+        <w:tabs>
+          <w:tab w:val="num" w:pos="2160"/>
+        </w:tabs>
+        <w:ind w:left="2160" w:hanging="360"/>
+      </w:pPr>
+    </w:lvl>
+    <w:lvl w:ilvl="3" w:tentative="1">
+      <w:start w:val="1"/>
+      <w:numFmt w:val="decimal"/>
+      <w:lvlText w:val="%4."/>
+      <w:lvlJc w:val="left"/>
+      <w:pPr>
+        <w:tabs>
+          <w:tab w:val="num" w:pos="2880"/>
+        </w:tabs>
+        <w:ind w:left="2880" w:hanging="360"/>
+      </w:pPr>
+    </w:lvl>
+    <w:lvl w:ilvl="4" w:tentative="1">
+      <w:start w:val="1"/>
+      <w:numFmt w:val="decimal"/>
+      <w:lvlText w:val="%5."/>
+      <w:lvlJc w:val="left"/>
+      <w:pPr>
+        <w:tabs>
+          <w:tab w:val="num" w:pos="3600"/>
+        </w:tabs>
+        <w:ind w:left="3600" w:hanging="360"/>
+      </w:pPr>
+    </w:lvl>
+    <w:lvl w:ilvl="5" w:tentative="1">
+      <w:start w:val="1"/>
+      <w:numFmt w:val="decimal"/>
+      <w:lvlText w:val="%6."/>
+      <w:lvlJc w:val="left"/>
+      <w:pPr>
+        <w:tabs>
+          <w:tab w:val="num" w:pos="4320"/>
+        </w:tabs>
+        <w:ind w:left="4320" w:hanging="360"/>
+      </w:pPr>
+    </w:lvl>
+    <w:lvl w:ilvl="6" w:tentative="1">
+      <w:start w:val="1"/>
+      <w:numFmt w:val="decimal"/>
+      <w:lvlText w:val="%7."/>
+      <w:lvlJc w:val="left"/>
+      <w:pPr>
+        <w:tabs>
+          <w:tab w:val="num" w:pos="5040"/>
+        </w:tabs>
+        <w:ind w:left="5040" w:hanging="360"/>
+      </w:pPr>
+    </w:lvl>
+    <w:lvl w:ilvl="7" w:tentative="1">
+      <w:start w:val="1"/>
+      <w:numFmt w:val="decimal"/>
+      <w:lvlText w:val="%8."/>
+      <w:lvlJc w:val="left"/>
+      <w:pPr>
+        <w:tabs>
+          <w:tab w:val="num" w:pos="5760"/>
+        </w:tabs>
+        <w:ind w:left="5760" w:hanging="360"/>
+      </w:pPr>
+    </w:lvl>
+    <w:lvl w:ilvl="8" w:tentative="1">
+      <w:start w:val="1"/>
+      <w:numFmt w:val="decimal"/>
+      <w:lvlText w:val="%9."/>
+      <w:lvlJc w:val="left"/>
+      <w:pPr>
+        <w:tabs>
+          <w:tab w:val="num" w:pos="6480"/>
+        </w:tabs>
+        <w:ind w:left="6480" w:hanging="360"/>
+      </w:pPr>
+    </w:lvl>
+  </w:abstractNum>
+  <w:abstractNum w:abstractNumId="10" w15:restartNumberingAfterBreak="0">
     <w:nsid w:val="29794AF3"/>
     <w:multiLevelType w:val="multilevel"/>
     <w:tmpl w:val="2040802E"/>
@@ -2498,7 +2207,156 @@
       </w:rPr>
     </w:lvl>
   </w:abstractNum>
-  <w:abstractNum w:abstractNumId="10" w15:restartNumberingAfterBreak="0">
+  <w:abstractNum w:abstractNumId="11" w15:restartNumberingAfterBreak="0">
+    <w:nsid w:val="2F5F1481"/>
+    <w:multiLevelType w:val="multilevel"/>
+    <w:tmpl w:val="A6441098"/>
+    <w:lvl w:ilvl="0">
+      <w:start w:val="1"/>
+      <w:numFmt w:val="bullet"/>
+      <w:lvlText w:val=""/>
+      <w:lvlJc w:val="left"/>
+      <w:pPr>
+        <w:tabs>
+          <w:tab w:val="num" w:pos="720"/>
+        </w:tabs>
+        <w:ind w:left="720" w:hanging="360"/>
+      </w:pPr>
+      <w:rPr>
+        <w:rFonts w:ascii="Symbol" w:hAnsi="Symbol" w:hint="default"/>
+        <w:sz w:val="20"/>
+      </w:rPr>
+    </w:lvl>
+    <w:lvl w:ilvl="1" w:tentative="1">
+      <w:start w:val="1"/>
+      <w:numFmt w:val="bullet"/>
+      <w:lvlText w:val="o"/>
+      <w:lvlJc w:val="left"/>
+      <w:pPr>
+        <w:tabs>
+          <w:tab w:val="num" w:pos="1440"/>
+        </w:tabs>
+        <w:ind w:left="1440" w:hanging="360"/>
+      </w:pPr>
+      <w:rPr>
+        <w:rFonts w:ascii="Courier New" w:hAnsi="Courier New" w:hint="default"/>
+        <w:sz w:val="20"/>
+      </w:rPr>
+    </w:lvl>
+    <w:lvl w:ilvl="2" w:tentative="1">
+      <w:start w:val="1"/>
+      <w:numFmt w:val="bullet"/>
+      <w:lvlText w:val=""/>
+      <w:lvlJc w:val="left"/>
+      <w:pPr>
+        <w:tabs>
+          <w:tab w:val="num" w:pos="2160"/>
+        </w:tabs>
+        <w:ind w:left="2160" w:hanging="360"/>
+      </w:pPr>
+      <w:rPr>
+        <w:rFonts w:ascii="Wingdings" w:hAnsi="Wingdings" w:hint="default"/>
+        <w:sz w:val="20"/>
+      </w:rPr>
+    </w:lvl>
+    <w:lvl w:ilvl="3" w:tentative="1">
+      <w:start w:val="1"/>
+      <w:numFmt w:val="bullet"/>
+      <w:lvlText w:val=""/>
+      <w:lvlJc w:val="left"/>
+      <w:pPr>
+        <w:tabs>
+          <w:tab w:val="num" w:pos="2880"/>
+        </w:tabs>
+        <w:ind w:left="2880" w:hanging="360"/>
+      </w:pPr>
+      <w:rPr>
+        <w:rFonts w:ascii="Wingdings" w:hAnsi="Wingdings" w:hint="default"/>
+        <w:sz w:val="20"/>
+      </w:rPr>
+    </w:lvl>
+    <w:lvl w:ilvl="4" w:tentative="1">
+      <w:start w:val="1"/>
+      <w:numFmt w:val="bullet"/>
+      <w:lvlText w:val=""/>
+      <w:lvlJc w:val="left"/>
+      <w:pPr>
+        <w:tabs>
+          <w:tab w:val="num" w:pos="3600"/>
+        </w:tabs>
+        <w:ind w:left="3600" w:hanging="360"/>
+      </w:pPr>
+      <w:rPr>
+        <w:rFonts w:ascii="Wingdings" w:hAnsi="Wingdings" w:hint="default"/>
+        <w:sz w:val="20"/>
+      </w:rPr>
+    </w:lvl>
+    <w:lvl w:ilvl="5" w:tentative="1">
+      <w:start w:val="1"/>
+      <w:numFmt w:val="bullet"/>
+      <w:lvlText w:val=""/>
+      <w:lvlJc w:val="left"/>
+      <w:pPr>
+        <w:tabs>
+          <w:tab w:val="num" w:pos="4320"/>
+        </w:tabs>
+        <w:ind w:left="4320" w:hanging="360"/>
+      </w:pPr>
+      <w:rPr>
+        <w:rFonts w:ascii="Wingdings" w:hAnsi="Wingdings" w:hint="default"/>
+        <w:sz w:val="20"/>
+      </w:rPr>
+    </w:lvl>
+    <w:lvl w:ilvl="6" w:tentative="1">
+      <w:start w:val="1"/>
+      <w:numFmt w:val="bullet"/>
+      <w:lvlText w:val=""/>
+      <w:lvlJc w:val="left"/>
+      <w:pPr>
+        <w:tabs>
+          <w:tab w:val="num" w:pos="5040"/>
+        </w:tabs>
+        <w:ind w:left="5040" w:hanging="360"/>
+      </w:pPr>
+      <w:rPr>
+        <w:rFonts w:ascii="Wingdings" w:hAnsi="Wingdings" w:hint="default"/>
+        <w:sz w:val="20"/>
+      </w:rPr>
+    </w:lvl>
+    <w:lvl w:ilvl="7" w:tentative="1">
+      <w:start w:val="1"/>
+      <w:numFmt w:val="bullet"/>
+      <w:lvlText w:val=""/>
+      <w:lvlJc w:val="left"/>
+      <w:pPr>
+        <w:tabs>
+          <w:tab w:val="num" w:pos="5760"/>
+        </w:tabs>
+        <w:ind w:left="5760" w:hanging="360"/>
+      </w:pPr>
+      <w:rPr>
+        <w:rFonts w:ascii="Wingdings" w:hAnsi="Wingdings" w:hint="default"/>
+        <w:sz w:val="20"/>
+      </w:rPr>
+    </w:lvl>
+    <w:lvl w:ilvl="8" w:tentative="1">
+      <w:start w:val="1"/>
+      <w:numFmt w:val="bullet"/>
+      <w:lvlText w:val=""/>
+      <w:lvlJc w:val="left"/>
+      <w:pPr>
+        <w:tabs>
+          <w:tab w:val="num" w:pos="6480"/>
+        </w:tabs>
+        <w:ind w:left="6480" w:hanging="360"/>
+      </w:pPr>
+      <w:rPr>
+        <w:rFonts w:ascii="Wingdings" w:hAnsi="Wingdings" w:hint="default"/>
+        <w:sz w:val="20"/>
+      </w:rPr>
+    </w:lvl>
+  </w:abstractNum>
+  <w:abstractNum w:abstractNumId="12" w15:restartNumberingAfterBreak="0">
     <w:nsid w:val="3CB53753"/>
     <w:multiLevelType w:val="multilevel"/>
     <w:tmpl w:val="3A2AB962"/>
@@ -2647,7 +2505,7 @@
       </w:rPr>
     </w:lvl>
   </w:abstractNum>
-  <w:abstractNum w:abstractNumId="11" w15:restartNumberingAfterBreak="0">
+  <w:abstractNum w:abstractNumId="13" w15:restartNumberingAfterBreak="0">
     <w:nsid w:val="3EC96FB4"/>
     <w:multiLevelType w:val="multilevel"/>
     <w:tmpl w:val="5CF0F000"/>
@@ -2796,7 +2654,7 @@
       </w:rPr>
     </w:lvl>
   </w:abstractNum>
-  <w:abstractNum w:abstractNumId="12" w15:restartNumberingAfterBreak="0">
+  <w:abstractNum w:abstractNumId="14" w15:restartNumberingAfterBreak="0">
     <w:nsid w:val="3ECC4647"/>
     <w:multiLevelType w:val="multilevel"/>
     <w:tmpl w:val="ABEE4BA2"/>
@@ -2909,7 +2767,7 @@
       </w:pPr>
     </w:lvl>
   </w:abstractNum>
-  <w:abstractNum w:abstractNumId="13" w15:restartNumberingAfterBreak="0">
+  <w:abstractNum w:abstractNumId="15" w15:restartNumberingAfterBreak="0">
     <w:nsid w:val="40B5324A"/>
     <w:multiLevelType w:val="multilevel"/>
     <w:tmpl w:val="F2BA4C7C"/>
@@ -3058,7 +2916,7 @@
       </w:rPr>
     </w:lvl>
   </w:abstractNum>
-  <w:abstractNum w:abstractNumId="14" w15:restartNumberingAfterBreak="0">
+  <w:abstractNum w:abstractNumId="16" w15:restartNumberingAfterBreak="0">
     <w:nsid w:val="47CC1A89"/>
     <w:multiLevelType w:val="multilevel"/>
     <w:tmpl w:val="650CEE58"/>
@@ -3207,7 +3065,7 @@
       </w:rPr>
     </w:lvl>
   </w:abstractNum>
-  <w:abstractNum w:abstractNumId="15" w15:restartNumberingAfterBreak="0">
+  <w:abstractNum w:abstractNumId="17" w15:restartNumberingAfterBreak="0">
     <w:nsid w:val="48397FB2"/>
     <w:multiLevelType w:val="multilevel"/>
     <w:tmpl w:val="3B3E1206"/>
@@ -3320,7 +3178,7 @@
       </w:pPr>
     </w:lvl>
   </w:abstractNum>
-  <w:abstractNum w:abstractNumId="16" w15:restartNumberingAfterBreak="0">
+  <w:abstractNum w:abstractNumId="18" w15:restartNumberingAfterBreak="0">
     <w:nsid w:val="4BEF63ED"/>
     <w:multiLevelType w:val="multilevel"/>
     <w:tmpl w:val="85DCDA0A"/>
@@ -3433,7 +3291,7 @@
       </w:pPr>
     </w:lvl>
   </w:abstractNum>
-  <w:abstractNum w:abstractNumId="17" w15:restartNumberingAfterBreak="0">
+  <w:abstractNum w:abstractNumId="19" w15:restartNumberingAfterBreak="0">
     <w:nsid w:val="4F064C07"/>
     <w:multiLevelType w:val="multilevel"/>
     <w:tmpl w:val="D174CC7C"/>
@@ -3582,7 +3440,7 @@
       </w:rPr>
     </w:lvl>
   </w:abstractNum>
-  <w:abstractNum w:abstractNumId="18" w15:restartNumberingAfterBreak="0">
+  <w:abstractNum w:abstractNumId="20" w15:restartNumberingAfterBreak="0">
     <w:nsid w:val="516C695D"/>
     <w:multiLevelType w:val="multilevel"/>
     <w:tmpl w:val="C7D849C8"/>
@@ -3695,7 +3553,7 @@
       </w:pPr>
     </w:lvl>
   </w:abstractNum>
-  <w:abstractNum w:abstractNumId="19" w15:restartNumberingAfterBreak="0">
+  <w:abstractNum w:abstractNumId="21" w15:restartNumberingAfterBreak="0">
     <w:nsid w:val="545F13AB"/>
     <w:multiLevelType w:val="multilevel"/>
     <w:tmpl w:val="58C01EAA"/>
@@ -3808,7 +3666,7 @@
       </w:pPr>
     </w:lvl>
   </w:abstractNum>
-  <w:abstractNum w:abstractNumId="20" w15:restartNumberingAfterBreak="0">
+  <w:abstractNum w:abstractNumId="22" w15:restartNumberingAfterBreak="0">
     <w:nsid w:val="56B17E38"/>
     <w:multiLevelType w:val="multilevel"/>
     <w:tmpl w:val="17E0525A"/>
@@ -3957,7 +3815,7 @@
       </w:rPr>
     </w:lvl>
   </w:abstractNum>
-  <w:abstractNum w:abstractNumId="21" w15:restartNumberingAfterBreak="0">
+  <w:abstractNum w:abstractNumId="23" w15:restartNumberingAfterBreak="0">
     <w:nsid w:val="57505B68"/>
     <w:multiLevelType w:val="multilevel"/>
     <w:tmpl w:val="C23295CA"/>
@@ -4106,7 +3964,7 @@
       </w:rPr>
     </w:lvl>
   </w:abstractNum>
-  <w:abstractNum w:abstractNumId="22" w15:restartNumberingAfterBreak="0">
+  <w:abstractNum w:abstractNumId="24" w15:restartNumberingAfterBreak="0">
     <w:nsid w:val="5DE023C2"/>
     <w:multiLevelType w:val="multilevel"/>
     <w:tmpl w:val="225C8F1A"/>
@@ -4219,7 +4077,7 @@
       </w:pPr>
     </w:lvl>
   </w:abstractNum>
-  <w:abstractNum w:abstractNumId="23" w15:restartNumberingAfterBreak="0">
+  <w:abstractNum w:abstractNumId="25" w15:restartNumberingAfterBreak="0">
     <w:nsid w:val="5FD83B9C"/>
     <w:multiLevelType w:val="multilevel"/>
     <w:tmpl w:val="243091DE"/>
@@ -4368,7 +4226,7 @@
       </w:rPr>
     </w:lvl>
   </w:abstractNum>
-  <w:abstractNum w:abstractNumId="24" w15:restartNumberingAfterBreak="0">
+  <w:abstractNum w:abstractNumId="26" w15:restartNumberingAfterBreak="0">
     <w:nsid w:val="677F3F01"/>
     <w:multiLevelType w:val="multilevel"/>
     <w:tmpl w:val="A28A0798"/>
@@ -4517,7 +4375,7 @@
       </w:rPr>
     </w:lvl>
   </w:abstractNum>
-  <w:abstractNum w:abstractNumId="25" w15:restartNumberingAfterBreak="0">
+  <w:abstractNum w:abstractNumId="27" w15:restartNumberingAfterBreak="0">
     <w:nsid w:val="775138DB"/>
     <w:multiLevelType w:val="multilevel"/>
     <w:tmpl w:val="BB16D816"/>
@@ -4667,7 +4525,7 @@
     </w:lvl>
   </w:abstractNum>
   <w:num w:numId="1" w16cid:durableId="789280021">
-    <w:abstractNumId w:val="14"/>
+    <w:abstractNumId w:val="16"/>
   </w:num>
   <w:num w:numId="2" w16cid:durableId="137504928">
     <w:abstractNumId w:val="1"/>
@@ -4679,7 +4537,7 @@
     <w:abstractNumId w:val="7"/>
   </w:num>
   <w:num w:numId="5" w16cid:durableId="1702243630">
-    <w:abstractNumId w:val="18"/>
+    <w:abstractNumId w:val="20"/>
   </w:num>
   <w:num w:numId="6" w16cid:durableId="1139302666">
     <w:abstractNumId w:val="2"/>
@@ -4688,40 +4546,40 @@
     <w:abstractNumId w:val="4"/>
   </w:num>
   <w:num w:numId="8" w16cid:durableId="640118813">
-    <w:abstractNumId w:val="22"/>
+    <w:abstractNumId w:val="24"/>
   </w:num>
   <w:num w:numId="9" w16cid:durableId="342441912">
     <w:abstractNumId w:val="3"/>
   </w:num>
   <w:num w:numId="10" w16cid:durableId="1509635353">
-    <w:abstractNumId w:val="11"/>
+    <w:abstractNumId w:val="13"/>
   </w:num>
   <w:num w:numId="11" w16cid:durableId="1744329482">
-    <w:abstractNumId w:val="15"/>
+    <w:abstractNumId w:val="17"/>
   </w:num>
   <w:num w:numId="12" w16cid:durableId="766316797">
+    <w:abstractNumId w:val="27"/>
+  </w:num>
+  <w:num w:numId="13" w16cid:durableId="1252855900">
     <w:abstractNumId w:val="25"/>
   </w:num>
-  <w:num w:numId="13" w16cid:durableId="1252855900">
-    <w:abstractNumId w:val="23"/>
-  </w:num>
   <w:num w:numId="14" w16cid:durableId="216819548">
-    <w:abstractNumId w:val="12"/>
+    <w:abstractNumId w:val="14"/>
   </w:num>
   <w:num w:numId="15" w16cid:durableId="482507873">
-    <w:abstractNumId w:val="17"/>
+    <w:abstractNumId w:val="19"/>
   </w:num>
   <w:num w:numId="16" w16cid:durableId="1311985462">
-    <w:abstractNumId w:val="20"/>
+    <w:abstractNumId w:val="22"/>
   </w:num>
   <w:num w:numId="17" w16cid:durableId="808939429">
     <w:abstractNumId w:val="8"/>
   </w:num>
   <w:num w:numId="18" w16cid:durableId="1713189035">
-    <w:abstractNumId w:val="9"/>
+    <w:abstractNumId w:val="10"/>
   </w:num>
   <w:num w:numId="19" w16cid:durableId="1482308862">
-    <w:abstractNumId w:val="19"/>
+    <w:abstractNumId w:val="21"/>
   </w:num>
   <w:num w:numId="20" w16cid:durableId="685987202">
     <w:abstractNumId w:val="5"/>
@@ -4730,19 +4588,25 @@
     <w:abstractNumId w:val="6"/>
   </w:num>
   <w:num w:numId="22" w16cid:durableId="1768227695">
-    <w:abstractNumId w:val="21"/>
+    <w:abstractNumId w:val="23"/>
   </w:num>
   <w:num w:numId="23" w16cid:durableId="1535000397">
-    <w:abstractNumId w:val="24"/>
+    <w:abstractNumId w:val="26"/>
   </w:num>
   <w:num w:numId="24" w16cid:durableId="692389035">
-    <w:abstractNumId w:val="10"/>
+    <w:abstractNumId w:val="12"/>
   </w:num>
   <w:num w:numId="25" w16cid:durableId="523708466">
-    <w:abstractNumId w:val="16"/>
+    <w:abstractNumId w:val="18"/>
   </w:num>
   <w:num w:numId="26" w16cid:durableId="1258560676">
-    <w:abstractNumId w:val="13"/>
+    <w:abstractNumId w:val="15"/>
+  </w:num>
+  <w:num w:numId="27" w16cid:durableId="230240066">
+    <w:abstractNumId w:val="11"/>
+  </w:num>
+  <w:num w:numId="28" w16cid:durableId="486632372">
+    <w:abstractNumId w:val="9"/>
   </w:num>
 </w:numbering>
 </file>

</xml_diff>

<commit_message>
fix: Fetch live spot price to anchor Gemini Altcoin Radar output and prevent hallucinated kill zones
</commit_message>
<xml_diff>
--- a/Project ARES Recovery Prompt.docx
+++ b/Project ARES Recovery Prompt.docx
@@ -14,7 +14,7 @@
           <w:b/>
           <w:bCs/>
         </w:rPr>
-        <w:t>FILE 3: PROJECT ARES - BUSINESS BLUEPRINT &amp; PROGRESS (Updated)</w:t>
+        <w:t> FILE 3: PROJECT ARES - BUSINESS BLUEPRINT &amp; PROGRESS (Updated)</w:t>
       </w:r>
     </w:p>
     <w:p>
@@ -59,7 +59,7 @@
       <w:pPr>
         <w:numPr>
           <w:ilvl w:val="0"/>
-          <w:numId w:val="27"/>
+          <w:numId w:val="31"/>
         </w:numPr>
         <w:rPr>
           <w:b/>
@@ -78,7 +78,7 @@
       <w:pPr>
         <w:numPr>
           <w:ilvl w:val="0"/>
-          <w:numId w:val="27"/>
+          <w:numId w:val="31"/>
         </w:numPr>
         <w:rPr>
           <w:b/>
@@ -97,7 +97,7 @@
       <w:pPr>
         <w:numPr>
           <w:ilvl w:val="0"/>
-          <w:numId w:val="27"/>
+          <w:numId w:val="31"/>
         </w:numPr>
         <w:rPr>
           <w:b/>
@@ -109,14 +109,14 @@
           <w:b/>
           <w:bCs/>
         </w:rPr>
-        <w:t>Pricing: Freemium model. Pro Tier at $29/month. Enterprise API at $5,000/month.</w:t>
+        <w:t>Pricing: Freemium model. Pro Tier at $29/month (with 7-Day Free Trial). Enterprise API at $5,000/month.</w:t>
       </w:r>
     </w:p>
     <w:p>
       <w:pPr>
         <w:numPr>
           <w:ilvl w:val="0"/>
-          <w:numId w:val="27"/>
+          <w:numId w:val="31"/>
         </w:numPr>
         <w:rPr>
           <w:b/>
@@ -150,7 +150,7 @@
       <w:pPr>
         <w:numPr>
           <w:ilvl w:val="0"/>
-          <w:numId w:val="28"/>
+          <w:numId w:val="32"/>
         </w:numPr>
         <w:rPr>
           <w:b/>
@@ -162,14 +162,14 @@
           <w:b/>
           <w:bCs/>
         </w:rPr>
-        <w:t>The Daily Drop: Post daily Kill Zone screenshots on X to build organic authority. Quote-tweet successful trap executions as proof of work.</w:t>
+        <w:t>The Daily Drop: Post daily Kill Zone screenshots on X to build organic authority.</w:t>
       </w:r>
     </w:p>
     <w:p>
       <w:pPr>
         <w:numPr>
           <w:ilvl w:val="0"/>
-          <w:numId w:val="28"/>
+          <w:numId w:val="32"/>
         </w:numPr>
         <w:rPr>
           <w:b/>
@@ -188,7 +188,7 @@
       <w:pPr>
         <w:numPr>
           <w:ilvl w:val="0"/>
-          <w:numId w:val="28"/>
+          <w:numId w:val="32"/>
         </w:numPr>
         <w:rPr>
           <w:b/>
@@ -200,7 +200,7 @@
           <w:b/>
           <w:bCs/>
         </w:rPr>
-        <w:t>The Bloodhound Ads: Run targeted X ads </w:t>
+        <w:t>The Bloodhound Ads: Run targeted X video ads </w:t>
       </w:r>
       <w:r>
         <w:rPr>
@@ -264,6 +264,7 @@
           <w:bCs/>
         </w:rPr>
       </w:pPr>
+      <w:proofErr w:type="gramStart"/>
       <w:r>
         <w:rPr>
           <w:b/>
@@ -271,7 +272,17 @@
           <w:i/>
           <w:iCs/>
         </w:rPr>
-        <w:t>Status:[COMPLETED]</w:t>
+        <w:t>Status:[</w:t>
+      </w:r>
+      <w:proofErr w:type="gramEnd"/>
+      <w:r>
+        <w:rPr>
+          <w:b/>
+          <w:bCs/>
+          <w:i/>
+          <w:iCs/>
+        </w:rPr>
+        <w:t>COMPLETED]</w:t>
       </w:r>
     </w:p>
     <w:p>
@@ -374,6 +385,7 @@
           <w:bCs/>
         </w:rPr>
       </w:pPr>
+      <w:proofErr w:type="gramStart"/>
       <w:r>
         <w:rPr>
           <w:b/>
@@ -382,7 +394,17 @@
           <w:iCs/>
         </w:rPr>
         <w:lastRenderedPageBreak/>
-        <w:t>Status:[COMPLETED]</w:t>
+        <w:t>Status:[</w:t>
+      </w:r>
+      <w:proofErr w:type="gramEnd"/>
+      <w:r>
+        <w:rPr>
+          <w:b/>
+          <w:bCs/>
+          <w:i/>
+          <w:iCs/>
+        </w:rPr>
+        <w:t>COMPLETED]</w:t>
       </w:r>
     </w:p>
     <w:p>
@@ -397,7 +419,39 @@
           <w:b/>
           <w:bCs/>
         </w:rPr>
-        <w:t>Built dark-mode React dashboard with Glassmorphism.</w:t>
+        <w:t xml:space="preserve">Built </w:t>
+      </w:r>
+      <w:proofErr w:type="gramStart"/>
+      <w:r>
+        <w:rPr>
+          <w:b/>
+          <w:bCs/>
+        </w:rPr>
+        <w:t>dark-mode</w:t>
+      </w:r>
+      <w:proofErr w:type="gramEnd"/>
+      <w:r>
+        <w:rPr>
+          <w:b/>
+          <w:bCs/>
+        </w:rPr>
+        <w:t xml:space="preserve"> React dashboard with </w:t>
+      </w:r>
+      <w:proofErr w:type="spellStart"/>
+      <w:r>
+        <w:rPr>
+          <w:b/>
+          <w:bCs/>
+        </w:rPr>
+        <w:t>Glassmorphism</w:t>
+      </w:r>
+      <w:proofErr w:type="spellEnd"/>
+      <w:r>
+        <w:rPr>
+          <w:b/>
+          <w:bCs/>
+        </w:rPr>
+        <w:t>.</w:t>
       </w:r>
     </w:p>
     <w:p>
@@ -427,7 +481,23 @@
           <w:b/>
           <w:bCs/>
         </w:rPr>
-        <w:t>Deployed frontend to Vercel.</w:t>
+        <w:t xml:space="preserve">Deployed frontend to </w:t>
+      </w:r>
+      <w:proofErr w:type="spellStart"/>
+      <w:r>
+        <w:rPr>
+          <w:b/>
+          <w:bCs/>
+        </w:rPr>
+        <w:t>Vercel</w:t>
+      </w:r>
+      <w:proofErr w:type="spellEnd"/>
+      <w:r>
+        <w:rPr>
+          <w:b/>
+          <w:bCs/>
+        </w:rPr>
+        <w:t>.</w:t>
       </w:r>
     </w:p>
     <w:p>
@@ -460,6 +530,7 @@
           <w:bCs/>
         </w:rPr>
       </w:pPr>
+      <w:proofErr w:type="gramStart"/>
       <w:r>
         <w:rPr>
           <w:b/>
@@ -467,15 +538,17 @@
           <w:i/>
           <w:iCs/>
         </w:rPr>
-        <w:t>Status: [IN PROGRESS]</w:t>
+        <w:t>Status:[</w:t>
       </w:r>
+      <w:proofErr w:type="gramEnd"/>
       <w:r>
         <w:rPr>
           <w:b/>
           <w:bCs/>
-        </w:rPr>
-        <w:br/>
-        <w:t>*[X] Launched X (Twitter) brand @AresQuant.</w:t>
+          <w:i/>
+          <w:iCs/>
+        </w:rPr>
+        <w:t>IN PROGRESS]</w:t>
       </w:r>
     </w:p>
     <w:p>
@@ -490,7 +563,31 @@
           <w:b/>
           <w:bCs/>
         </w:rPr>
-        <w:t>Activated Stripe payment gateway ($29/month) via CVEV Strategies LLC.</w:t>
+        <w:t xml:space="preserve">Launched X (Twitter) </w:t>
+      </w:r>
+      <w:proofErr w:type="gramStart"/>
+      <w:r>
+        <w:rPr>
+          <w:b/>
+          <w:bCs/>
+        </w:rPr>
+        <w:t>brand @</w:t>
+      </w:r>
+      <w:proofErr w:type="gramEnd"/>
+      <w:r>
+        <w:rPr>
+          <w:b/>
+          <w:bCs/>
+        </w:rPr>
+        <w:t>AresQuant.</w:t>
+      </w:r>
+      <w:r>
+        <w:rPr>
+          <w:b/>
+          <w:bCs/>
+        </w:rPr>
+        <w:br/>
+        <w:t>*[X] Activated Stripe payment gateway ($29/month) via CVEV Strategies LLC.</w:t>
       </w:r>
     </w:p>
     <w:p>
@@ -505,7 +602,37 @@
           <w:b/>
           <w:bCs/>
         </w:rPr>
-        <w:t>Execute the 3-Vector Sniper Marketing Doctrine.</w:t>
+        <w:t>Activated 7-Day Free Trial and Promo Codes.</w:t>
+      </w:r>
+    </w:p>
+    <w:p>
+      <w:pPr>
+        <w:rPr>
+          <w:b/>
+          <w:bCs/>
+        </w:rPr>
+      </w:pPr>
+      <w:r>
+        <w:rPr>
+          <w:b/>
+          <w:bCs/>
+        </w:rPr>
+        <w:t>Created Tier-1 Vertical Video Ad asset.</w:t>
+      </w:r>
+    </w:p>
+    <w:p>
+      <w:pPr>
+        <w:rPr>
+          <w:b/>
+          <w:bCs/>
+        </w:rPr>
+      </w:pPr>
+      <w:r>
+        <w:rPr>
+          <w:b/>
+          <w:bCs/>
+        </w:rPr>
+        <w:t>Execute the "Bloodhound" Video Ad Campaign during next market crash.</w:t>
       </w:r>
     </w:p>
     <w:p>
@@ -553,6 +680,7 @@
           <w:bCs/>
         </w:rPr>
       </w:pPr>
+      <w:proofErr w:type="gramStart"/>
       <w:r>
         <w:rPr>
           <w:b/>
@@ -560,7 +688,17 @@
           <w:i/>
           <w:iCs/>
         </w:rPr>
-        <w:t>Status:[LOCKED - Awaiting 100 Paying Users]</w:t>
+        <w:t>Status:[</w:t>
+      </w:r>
+      <w:proofErr w:type="gramEnd"/>
+      <w:r>
+        <w:rPr>
+          <w:b/>
+          <w:bCs/>
+          <w:i/>
+          <w:iCs/>
+        </w:rPr>
+        <w:t>LOCKED - Awaiting 100 Paying Users]</w:t>
       </w:r>
     </w:p>
     <w:p>
@@ -623,6 +761,7 @@
           <w:bCs/>
         </w:rPr>
       </w:pPr>
+      <w:proofErr w:type="gramStart"/>
       <w:r>
         <w:rPr>
           <w:b/>
@@ -630,7 +769,17 @@
           <w:i/>
           <w:iCs/>
         </w:rPr>
-        <w:t>Status:[LOCKED - Awaiting Phase 5 Completion]</w:t>
+        <w:t>Status:[</w:t>
+      </w:r>
+      <w:proofErr w:type="gramEnd"/>
+      <w:r>
+        <w:rPr>
+          <w:b/>
+          <w:bCs/>
+          <w:i/>
+          <w:iCs/>
+        </w:rPr>
+        <w:t>LOCKED - Awaiting Phase 5 Completion]</w:t>
       </w:r>
     </w:p>
     <w:p>
@@ -2917,6 +3066,268 @@
     </w:lvl>
   </w:abstractNum>
   <w:abstractNum w:abstractNumId="16" w15:restartNumberingAfterBreak="0">
+    <w:nsid w:val="424F0898"/>
+    <w:multiLevelType w:val="multilevel"/>
+    <w:tmpl w:val="C6A6500E"/>
+    <w:lvl w:ilvl="0">
+      <w:start w:val="1"/>
+      <w:numFmt w:val="bullet"/>
+      <w:lvlText w:val=""/>
+      <w:lvlJc w:val="left"/>
+      <w:pPr>
+        <w:tabs>
+          <w:tab w:val="num" w:pos="720"/>
+        </w:tabs>
+        <w:ind w:left="720" w:hanging="360"/>
+      </w:pPr>
+      <w:rPr>
+        <w:rFonts w:ascii="Symbol" w:hAnsi="Symbol" w:hint="default"/>
+        <w:sz w:val="20"/>
+      </w:rPr>
+    </w:lvl>
+    <w:lvl w:ilvl="1" w:tentative="1">
+      <w:start w:val="1"/>
+      <w:numFmt w:val="bullet"/>
+      <w:lvlText w:val="o"/>
+      <w:lvlJc w:val="left"/>
+      <w:pPr>
+        <w:tabs>
+          <w:tab w:val="num" w:pos="1440"/>
+        </w:tabs>
+        <w:ind w:left="1440" w:hanging="360"/>
+      </w:pPr>
+      <w:rPr>
+        <w:rFonts w:ascii="Courier New" w:hAnsi="Courier New" w:hint="default"/>
+        <w:sz w:val="20"/>
+      </w:rPr>
+    </w:lvl>
+    <w:lvl w:ilvl="2" w:tentative="1">
+      <w:start w:val="1"/>
+      <w:numFmt w:val="bullet"/>
+      <w:lvlText w:val=""/>
+      <w:lvlJc w:val="left"/>
+      <w:pPr>
+        <w:tabs>
+          <w:tab w:val="num" w:pos="2160"/>
+        </w:tabs>
+        <w:ind w:left="2160" w:hanging="360"/>
+      </w:pPr>
+      <w:rPr>
+        <w:rFonts w:ascii="Wingdings" w:hAnsi="Wingdings" w:hint="default"/>
+        <w:sz w:val="20"/>
+      </w:rPr>
+    </w:lvl>
+    <w:lvl w:ilvl="3" w:tentative="1">
+      <w:start w:val="1"/>
+      <w:numFmt w:val="bullet"/>
+      <w:lvlText w:val=""/>
+      <w:lvlJc w:val="left"/>
+      <w:pPr>
+        <w:tabs>
+          <w:tab w:val="num" w:pos="2880"/>
+        </w:tabs>
+        <w:ind w:left="2880" w:hanging="360"/>
+      </w:pPr>
+      <w:rPr>
+        <w:rFonts w:ascii="Wingdings" w:hAnsi="Wingdings" w:hint="default"/>
+        <w:sz w:val="20"/>
+      </w:rPr>
+    </w:lvl>
+    <w:lvl w:ilvl="4" w:tentative="1">
+      <w:start w:val="1"/>
+      <w:numFmt w:val="bullet"/>
+      <w:lvlText w:val=""/>
+      <w:lvlJc w:val="left"/>
+      <w:pPr>
+        <w:tabs>
+          <w:tab w:val="num" w:pos="3600"/>
+        </w:tabs>
+        <w:ind w:left="3600" w:hanging="360"/>
+      </w:pPr>
+      <w:rPr>
+        <w:rFonts w:ascii="Wingdings" w:hAnsi="Wingdings" w:hint="default"/>
+        <w:sz w:val="20"/>
+      </w:rPr>
+    </w:lvl>
+    <w:lvl w:ilvl="5" w:tentative="1">
+      <w:start w:val="1"/>
+      <w:numFmt w:val="bullet"/>
+      <w:lvlText w:val=""/>
+      <w:lvlJc w:val="left"/>
+      <w:pPr>
+        <w:tabs>
+          <w:tab w:val="num" w:pos="4320"/>
+        </w:tabs>
+        <w:ind w:left="4320" w:hanging="360"/>
+      </w:pPr>
+      <w:rPr>
+        <w:rFonts w:ascii="Wingdings" w:hAnsi="Wingdings" w:hint="default"/>
+        <w:sz w:val="20"/>
+      </w:rPr>
+    </w:lvl>
+    <w:lvl w:ilvl="6" w:tentative="1">
+      <w:start w:val="1"/>
+      <w:numFmt w:val="bullet"/>
+      <w:lvlText w:val=""/>
+      <w:lvlJc w:val="left"/>
+      <w:pPr>
+        <w:tabs>
+          <w:tab w:val="num" w:pos="5040"/>
+        </w:tabs>
+        <w:ind w:left="5040" w:hanging="360"/>
+      </w:pPr>
+      <w:rPr>
+        <w:rFonts w:ascii="Wingdings" w:hAnsi="Wingdings" w:hint="default"/>
+        <w:sz w:val="20"/>
+      </w:rPr>
+    </w:lvl>
+    <w:lvl w:ilvl="7" w:tentative="1">
+      <w:start w:val="1"/>
+      <w:numFmt w:val="bullet"/>
+      <w:lvlText w:val=""/>
+      <w:lvlJc w:val="left"/>
+      <w:pPr>
+        <w:tabs>
+          <w:tab w:val="num" w:pos="5760"/>
+        </w:tabs>
+        <w:ind w:left="5760" w:hanging="360"/>
+      </w:pPr>
+      <w:rPr>
+        <w:rFonts w:ascii="Wingdings" w:hAnsi="Wingdings" w:hint="default"/>
+        <w:sz w:val="20"/>
+      </w:rPr>
+    </w:lvl>
+    <w:lvl w:ilvl="8" w:tentative="1">
+      <w:start w:val="1"/>
+      <w:numFmt w:val="bullet"/>
+      <w:lvlText w:val=""/>
+      <w:lvlJc w:val="left"/>
+      <w:pPr>
+        <w:tabs>
+          <w:tab w:val="num" w:pos="6480"/>
+        </w:tabs>
+        <w:ind w:left="6480" w:hanging="360"/>
+      </w:pPr>
+      <w:rPr>
+        <w:rFonts w:ascii="Wingdings" w:hAnsi="Wingdings" w:hint="default"/>
+        <w:sz w:val="20"/>
+      </w:rPr>
+    </w:lvl>
+  </w:abstractNum>
+  <w:abstractNum w:abstractNumId="17" w15:restartNumberingAfterBreak="0">
+    <w:nsid w:val="477F0CE4"/>
+    <w:multiLevelType w:val="multilevel"/>
+    <w:tmpl w:val="6B74BC06"/>
+    <w:lvl w:ilvl="0">
+      <w:start w:val="1"/>
+      <w:numFmt w:val="decimal"/>
+      <w:lvlText w:val="%1."/>
+      <w:lvlJc w:val="left"/>
+      <w:pPr>
+        <w:tabs>
+          <w:tab w:val="num" w:pos="720"/>
+        </w:tabs>
+        <w:ind w:left="720" w:hanging="360"/>
+      </w:pPr>
+    </w:lvl>
+    <w:lvl w:ilvl="1" w:tentative="1">
+      <w:start w:val="1"/>
+      <w:numFmt w:val="decimal"/>
+      <w:lvlText w:val="%2."/>
+      <w:lvlJc w:val="left"/>
+      <w:pPr>
+        <w:tabs>
+          <w:tab w:val="num" w:pos="1440"/>
+        </w:tabs>
+        <w:ind w:left="1440" w:hanging="360"/>
+      </w:pPr>
+    </w:lvl>
+    <w:lvl w:ilvl="2" w:tentative="1">
+      <w:start w:val="1"/>
+      <w:numFmt w:val="decimal"/>
+      <w:lvlText w:val="%3."/>
+      <w:lvlJc w:val="left"/>
+      <w:pPr>
+        <w:tabs>
+          <w:tab w:val="num" w:pos="2160"/>
+        </w:tabs>
+        <w:ind w:left="2160" w:hanging="360"/>
+      </w:pPr>
+    </w:lvl>
+    <w:lvl w:ilvl="3" w:tentative="1">
+      <w:start w:val="1"/>
+      <w:numFmt w:val="decimal"/>
+      <w:lvlText w:val="%4."/>
+      <w:lvlJc w:val="left"/>
+      <w:pPr>
+        <w:tabs>
+          <w:tab w:val="num" w:pos="2880"/>
+        </w:tabs>
+        <w:ind w:left="2880" w:hanging="360"/>
+      </w:pPr>
+    </w:lvl>
+    <w:lvl w:ilvl="4" w:tentative="1">
+      <w:start w:val="1"/>
+      <w:numFmt w:val="decimal"/>
+      <w:lvlText w:val="%5."/>
+      <w:lvlJc w:val="left"/>
+      <w:pPr>
+        <w:tabs>
+          <w:tab w:val="num" w:pos="3600"/>
+        </w:tabs>
+        <w:ind w:left="3600" w:hanging="360"/>
+      </w:pPr>
+    </w:lvl>
+    <w:lvl w:ilvl="5" w:tentative="1">
+      <w:start w:val="1"/>
+      <w:numFmt w:val="decimal"/>
+      <w:lvlText w:val="%6."/>
+      <w:lvlJc w:val="left"/>
+      <w:pPr>
+        <w:tabs>
+          <w:tab w:val="num" w:pos="4320"/>
+        </w:tabs>
+        <w:ind w:left="4320" w:hanging="360"/>
+      </w:pPr>
+    </w:lvl>
+    <w:lvl w:ilvl="6" w:tentative="1">
+      <w:start w:val="1"/>
+      <w:numFmt w:val="decimal"/>
+      <w:lvlText w:val="%7."/>
+      <w:lvlJc w:val="left"/>
+      <w:pPr>
+        <w:tabs>
+          <w:tab w:val="num" w:pos="5040"/>
+        </w:tabs>
+        <w:ind w:left="5040" w:hanging="360"/>
+      </w:pPr>
+    </w:lvl>
+    <w:lvl w:ilvl="7" w:tentative="1">
+      <w:start w:val="1"/>
+      <w:numFmt w:val="decimal"/>
+      <w:lvlText w:val="%8."/>
+      <w:lvlJc w:val="left"/>
+      <w:pPr>
+        <w:tabs>
+          <w:tab w:val="num" w:pos="5760"/>
+        </w:tabs>
+        <w:ind w:left="5760" w:hanging="360"/>
+      </w:pPr>
+    </w:lvl>
+    <w:lvl w:ilvl="8" w:tentative="1">
+      <w:start w:val="1"/>
+      <w:numFmt w:val="decimal"/>
+      <w:lvlText w:val="%9."/>
+      <w:lvlJc w:val="left"/>
+      <w:pPr>
+        <w:tabs>
+          <w:tab w:val="num" w:pos="6480"/>
+        </w:tabs>
+        <w:ind w:left="6480" w:hanging="360"/>
+      </w:pPr>
+    </w:lvl>
+  </w:abstractNum>
+  <w:abstractNum w:abstractNumId="18" w15:restartNumberingAfterBreak="0">
     <w:nsid w:val="47CC1A89"/>
     <w:multiLevelType w:val="multilevel"/>
     <w:tmpl w:val="650CEE58"/>
@@ -3065,7 +3476,7 @@
       </w:rPr>
     </w:lvl>
   </w:abstractNum>
-  <w:abstractNum w:abstractNumId="17" w15:restartNumberingAfterBreak="0">
+  <w:abstractNum w:abstractNumId="19" w15:restartNumberingAfterBreak="0">
     <w:nsid w:val="48397FB2"/>
     <w:multiLevelType w:val="multilevel"/>
     <w:tmpl w:val="3B3E1206"/>
@@ -3178,7 +3589,7 @@
       </w:pPr>
     </w:lvl>
   </w:abstractNum>
-  <w:abstractNum w:abstractNumId="18" w15:restartNumberingAfterBreak="0">
+  <w:abstractNum w:abstractNumId="20" w15:restartNumberingAfterBreak="0">
     <w:nsid w:val="4BEF63ED"/>
     <w:multiLevelType w:val="multilevel"/>
     <w:tmpl w:val="85DCDA0A"/>
@@ -3291,7 +3702,7 @@
       </w:pPr>
     </w:lvl>
   </w:abstractNum>
-  <w:abstractNum w:abstractNumId="19" w15:restartNumberingAfterBreak="0">
+  <w:abstractNum w:abstractNumId="21" w15:restartNumberingAfterBreak="0">
     <w:nsid w:val="4F064C07"/>
     <w:multiLevelType w:val="multilevel"/>
     <w:tmpl w:val="D174CC7C"/>
@@ -3440,7 +3851,7 @@
       </w:rPr>
     </w:lvl>
   </w:abstractNum>
-  <w:abstractNum w:abstractNumId="20" w15:restartNumberingAfterBreak="0">
+  <w:abstractNum w:abstractNumId="22" w15:restartNumberingAfterBreak="0">
     <w:nsid w:val="516C695D"/>
     <w:multiLevelType w:val="multilevel"/>
     <w:tmpl w:val="C7D849C8"/>
@@ -3553,7 +3964,7 @@
       </w:pPr>
     </w:lvl>
   </w:abstractNum>
-  <w:abstractNum w:abstractNumId="21" w15:restartNumberingAfterBreak="0">
+  <w:abstractNum w:abstractNumId="23" w15:restartNumberingAfterBreak="0">
     <w:nsid w:val="545F13AB"/>
     <w:multiLevelType w:val="multilevel"/>
     <w:tmpl w:val="58C01EAA"/>
@@ -3666,7 +4077,7 @@
       </w:pPr>
     </w:lvl>
   </w:abstractNum>
-  <w:abstractNum w:abstractNumId="22" w15:restartNumberingAfterBreak="0">
+  <w:abstractNum w:abstractNumId="24" w15:restartNumberingAfterBreak="0">
     <w:nsid w:val="56B17E38"/>
     <w:multiLevelType w:val="multilevel"/>
     <w:tmpl w:val="17E0525A"/>
@@ -3815,7 +4226,7 @@
       </w:rPr>
     </w:lvl>
   </w:abstractNum>
-  <w:abstractNum w:abstractNumId="23" w15:restartNumberingAfterBreak="0">
+  <w:abstractNum w:abstractNumId="25" w15:restartNumberingAfterBreak="0">
     <w:nsid w:val="57505B68"/>
     <w:multiLevelType w:val="multilevel"/>
     <w:tmpl w:val="C23295CA"/>
@@ -3964,7 +4375,7 @@
       </w:rPr>
     </w:lvl>
   </w:abstractNum>
-  <w:abstractNum w:abstractNumId="24" w15:restartNumberingAfterBreak="0">
+  <w:abstractNum w:abstractNumId="26" w15:restartNumberingAfterBreak="0">
     <w:nsid w:val="5DE023C2"/>
     <w:multiLevelType w:val="multilevel"/>
     <w:tmpl w:val="225C8F1A"/>
@@ -4077,7 +4488,7 @@
       </w:pPr>
     </w:lvl>
   </w:abstractNum>
-  <w:abstractNum w:abstractNumId="25" w15:restartNumberingAfterBreak="0">
+  <w:abstractNum w:abstractNumId="27" w15:restartNumberingAfterBreak="0">
     <w:nsid w:val="5FD83B9C"/>
     <w:multiLevelType w:val="multilevel"/>
     <w:tmpl w:val="243091DE"/>
@@ -4226,7 +4637,156 @@
       </w:rPr>
     </w:lvl>
   </w:abstractNum>
-  <w:abstractNum w:abstractNumId="26" w15:restartNumberingAfterBreak="0">
+  <w:abstractNum w:abstractNumId="28" w15:restartNumberingAfterBreak="0">
+    <w:nsid w:val="66BF7C83"/>
+    <w:multiLevelType w:val="multilevel"/>
+    <w:tmpl w:val="03702CE6"/>
+    <w:lvl w:ilvl="0">
+      <w:start w:val="1"/>
+      <w:numFmt w:val="bullet"/>
+      <w:lvlText w:val=""/>
+      <w:lvlJc w:val="left"/>
+      <w:pPr>
+        <w:tabs>
+          <w:tab w:val="num" w:pos="720"/>
+        </w:tabs>
+        <w:ind w:left="720" w:hanging="360"/>
+      </w:pPr>
+      <w:rPr>
+        <w:rFonts w:ascii="Symbol" w:hAnsi="Symbol" w:hint="default"/>
+        <w:sz w:val="20"/>
+      </w:rPr>
+    </w:lvl>
+    <w:lvl w:ilvl="1" w:tentative="1">
+      <w:start w:val="1"/>
+      <w:numFmt w:val="bullet"/>
+      <w:lvlText w:val="o"/>
+      <w:lvlJc w:val="left"/>
+      <w:pPr>
+        <w:tabs>
+          <w:tab w:val="num" w:pos="1440"/>
+        </w:tabs>
+        <w:ind w:left="1440" w:hanging="360"/>
+      </w:pPr>
+      <w:rPr>
+        <w:rFonts w:ascii="Courier New" w:hAnsi="Courier New" w:hint="default"/>
+        <w:sz w:val="20"/>
+      </w:rPr>
+    </w:lvl>
+    <w:lvl w:ilvl="2" w:tentative="1">
+      <w:start w:val="1"/>
+      <w:numFmt w:val="bullet"/>
+      <w:lvlText w:val=""/>
+      <w:lvlJc w:val="left"/>
+      <w:pPr>
+        <w:tabs>
+          <w:tab w:val="num" w:pos="2160"/>
+        </w:tabs>
+        <w:ind w:left="2160" w:hanging="360"/>
+      </w:pPr>
+      <w:rPr>
+        <w:rFonts w:ascii="Wingdings" w:hAnsi="Wingdings" w:hint="default"/>
+        <w:sz w:val="20"/>
+      </w:rPr>
+    </w:lvl>
+    <w:lvl w:ilvl="3" w:tentative="1">
+      <w:start w:val="1"/>
+      <w:numFmt w:val="bullet"/>
+      <w:lvlText w:val=""/>
+      <w:lvlJc w:val="left"/>
+      <w:pPr>
+        <w:tabs>
+          <w:tab w:val="num" w:pos="2880"/>
+        </w:tabs>
+        <w:ind w:left="2880" w:hanging="360"/>
+      </w:pPr>
+      <w:rPr>
+        <w:rFonts w:ascii="Wingdings" w:hAnsi="Wingdings" w:hint="default"/>
+        <w:sz w:val="20"/>
+      </w:rPr>
+    </w:lvl>
+    <w:lvl w:ilvl="4" w:tentative="1">
+      <w:start w:val="1"/>
+      <w:numFmt w:val="bullet"/>
+      <w:lvlText w:val=""/>
+      <w:lvlJc w:val="left"/>
+      <w:pPr>
+        <w:tabs>
+          <w:tab w:val="num" w:pos="3600"/>
+        </w:tabs>
+        <w:ind w:left="3600" w:hanging="360"/>
+      </w:pPr>
+      <w:rPr>
+        <w:rFonts w:ascii="Wingdings" w:hAnsi="Wingdings" w:hint="default"/>
+        <w:sz w:val="20"/>
+      </w:rPr>
+    </w:lvl>
+    <w:lvl w:ilvl="5" w:tentative="1">
+      <w:start w:val="1"/>
+      <w:numFmt w:val="bullet"/>
+      <w:lvlText w:val=""/>
+      <w:lvlJc w:val="left"/>
+      <w:pPr>
+        <w:tabs>
+          <w:tab w:val="num" w:pos="4320"/>
+        </w:tabs>
+        <w:ind w:left="4320" w:hanging="360"/>
+      </w:pPr>
+      <w:rPr>
+        <w:rFonts w:ascii="Wingdings" w:hAnsi="Wingdings" w:hint="default"/>
+        <w:sz w:val="20"/>
+      </w:rPr>
+    </w:lvl>
+    <w:lvl w:ilvl="6" w:tentative="1">
+      <w:start w:val="1"/>
+      <w:numFmt w:val="bullet"/>
+      <w:lvlText w:val=""/>
+      <w:lvlJc w:val="left"/>
+      <w:pPr>
+        <w:tabs>
+          <w:tab w:val="num" w:pos="5040"/>
+        </w:tabs>
+        <w:ind w:left="5040" w:hanging="360"/>
+      </w:pPr>
+      <w:rPr>
+        <w:rFonts w:ascii="Wingdings" w:hAnsi="Wingdings" w:hint="default"/>
+        <w:sz w:val="20"/>
+      </w:rPr>
+    </w:lvl>
+    <w:lvl w:ilvl="7" w:tentative="1">
+      <w:start w:val="1"/>
+      <w:numFmt w:val="bullet"/>
+      <w:lvlText w:val=""/>
+      <w:lvlJc w:val="left"/>
+      <w:pPr>
+        <w:tabs>
+          <w:tab w:val="num" w:pos="5760"/>
+        </w:tabs>
+        <w:ind w:left="5760" w:hanging="360"/>
+      </w:pPr>
+      <w:rPr>
+        <w:rFonts w:ascii="Wingdings" w:hAnsi="Wingdings" w:hint="default"/>
+        <w:sz w:val="20"/>
+      </w:rPr>
+    </w:lvl>
+    <w:lvl w:ilvl="8" w:tentative="1">
+      <w:start w:val="1"/>
+      <w:numFmt w:val="bullet"/>
+      <w:lvlText w:val=""/>
+      <w:lvlJc w:val="left"/>
+      <w:pPr>
+        <w:tabs>
+          <w:tab w:val="num" w:pos="6480"/>
+        </w:tabs>
+        <w:ind w:left="6480" w:hanging="360"/>
+      </w:pPr>
+      <w:rPr>
+        <w:rFonts w:ascii="Wingdings" w:hAnsi="Wingdings" w:hint="default"/>
+        <w:sz w:val="20"/>
+      </w:rPr>
+    </w:lvl>
+  </w:abstractNum>
+  <w:abstractNum w:abstractNumId="29" w15:restartNumberingAfterBreak="0">
     <w:nsid w:val="677F3F01"/>
     <w:multiLevelType w:val="multilevel"/>
     <w:tmpl w:val="A28A0798"/>
@@ -4375,7 +4935,7 @@
       </w:rPr>
     </w:lvl>
   </w:abstractNum>
-  <w:abstractNum w:abstractNumId="27" w15:restartNumberingAfterBreak="0">
+  <w:abstractNum w:abstractNumId="30" w15:restartNumberingAfterBreak="0">
     <w:nsid w:val="775138DB"/>
     <w:multiLevelType w:val="multilevel"/>
     <w:tmpl w:val="BB16D816"/>
@@ -4524,8 +5084,121 @@
       </w:rPr>
     </w:lvl>
   </w:abstractNum>
+  <w:abstractNum w:abstractNumId="31" w15:restartNumberingAfterBreak="0">
+    <w:nsid w:val="783F6649"/>
+    <w:multiLevelType w:val="multilevel"/>
+    <w:tmpl w:val="A9D01652"/>
+    <w:lvl w:ilvl="0">
+      <w:start w:val="1"/>
+      <w:numFmt w:val="decimal"/>
+      <w:lvlText w:val="%1."/>
+      <w:lvlJc w:val="left"/>
+      <w:pPr>
+        <w:tabs>
+          <w:tab w:val="num" w:pos="720"/>
+        </w:tabs>
+        <w:ind w:left="720" w:hanging="360"/>
+      </w:pPr>
+    </w:lvl>
+    <w:lvl w:ilvl="1" w:tentative="1">
+      <w:start w:val="1"/>
+      <w:numFmt w:val="decimal"/>
+      <w:lvlText w:val="%2."/>
+      <w:lvlJc w:val="left"/>
+      <w:pPr>
+        <w:tabs>
+          <w:tab w:val="num" w:pos="1440"/>
+        </w:tabs>
+        <w:ind w:left="1440" w:hanging="360"/>
+      </w:pPr>
+    </w:lvl>
+    <w:lvl w:ilvl="2" w:tentative="1">
+      <w:start w:val="1"/>
+      <w:numFmt w:val="decimal"/>
+      <w:lvlText w:val="%3."/>
+      <w:lvlJc w:val="left"/>
+      <w:pPr>
+        <w:tabs>
+          <w:tab w:val="num" w:pos="2160"/>
+        </w:tabs>
+        <w:ind w:left="2160" w:hanging="360"/>
+      </w:pPr>
+    </w:lvl>
+    <w:lvl w:ilvl="3" w:tentative="1">
+      <w:start w:val="1"/>
+      <w:numFmt w:val="decimal"/>
+      <w:lvlText w:val="%4."/>
+      <w:lvlJc w:val="left"/>
+      <w:pPr>
+        <w:tabs>
+          <w:tab w:val="num" w:pos="2880"/>
+        </w:tabs>
+        <w:ind w:left="2880" w:hanging="360"/>
+      </w:pPr>
+    </w:lvl>
+    <w:lvl w:ilvl="4" w:tentative="1">
+      <w:start w:val="1"/>
+      <w:numFmt w:val="decimal"/>
+      <w:lvlText w:val="%5."/>
+      <w:lvlJc w:val="left"/>
+      <w:pPr>
+        <w:tabs>
+          <w:tab w:val="num" w:pos="3600"/>
+        </w:tabs>
+        <w:ind w:left="3600" w:hanging="360"/>
+      </w:pPr>
+    </w:lvl>
+    <w:lvl w:ilvl="5" w:tentative="1">
+      <w:start w:val="1"/>
+      <w:numFmt w:val="decimal"/>
+      <w:lvlText w:val="%6."/>
+      <w:lvlJc w:val="left"/>
+      <w:pPr>
+        <w:tabs>
+          <w:tab w:val="num" w:pos="4320"/>
+        </w:tabs>
+        <w:ind w:left="4320" w:hanging="360"/>
+      </w:pPr>
+    </w:lvl>
+    <w:lvl w:ilvl="6" w:tentative="1">
+      <w:start w:val="1"/>
+      <w:numFmt w:val="decimal"/>
+      <w:lvlText w:val="%7."/>
+      <w:lvlJc w:val="left"/>
+      <w:pPr>
+        <w:tabs>
+          <w:tab w:val="num" w:pos="5040"/>
+        </w:tabs>
+        <w:ind w:left="5040" w:hanging="360"/>
+      </w:pPr>
+    </w:lvl>
+    <w:lvl w:ilvl="7" w:tentative="1">
+      <w:start w:val="1"/>
+      <w:numFmt w:val="decimal"/>
+      <w:lvlText w:val="%8."/>
+      <w:lvlJc w:val="left"/>
+      <w:pPr>
+        <w:tabs>
+          <w:tab w:val="num" w:pos="5760"/>
+        </w:tabs>
+        <w:ind w:left="5760" w:hanging="360"/>
+      </w:pPr>
+    </w:lvl>
+    <w:lvl w:ilvl="8" w:tentative="1">
+      <w:start w:val="1"/>
+      <w:numFmt w:val="decimal"/>
+      <w:lvlText w:val="%9."/>
+      <w:lvlJc w:val="left"/>
+      <w:pPr>
+        <w:tabs>
+          <w:tab w:val="num" w:pos="6480"/>
+        </w:tabs>
+        <w:ind w:left="6480" w:hanging="360"/>
+      </w:pPr>
+    </w:lvl>
+  </w:abstractNum>
   <w:num w:numId="1" w16cid:durableId="789280021">
-    <w:abstractNumId w:val="16"/>
+    <w:abstractNumId w:val="18"/>
   </w:num>
   <w:num w:numId="2" w16cid:durableId="137504928">
     <w:abstractNumId w:val="1"/>
@@ -4537,7 +5210,7 @@
     <w:abstractNumId w:val="7"/>
   </w:num>
   <w:num w:numId="5" w16cid:durableId="1702243630">
-    <w:abstractNumId w:val="20"/>
+    <w:abstractNumId w:val="22"/>
   </w:num>
   <w:num w:numId="6" w16cid:durableId="1139302666">
     <w:abstractNumId w:val="2"/>
@@ -4546,7 +5219,7 @@
     <w:abstractNumId w:val="4"/>
   </w:num>
   <w:num w:numId="8" w16cid:durableId="640118813">
-    <w:abstractNumId w:val="24"/>
+    <w:abstractNumId w:val="26"/>
   </w:num>
   <w:num w:numId="9" w16cid:durableId="342441912">
     <w:abstractNumId w:val="3"/>
@@ -4555,22 +5228,22 @@
     <w:abstractNumId w:val="13"/>
   </w:num>
   <w:num w:numId="11" w16cid:durableId="1744329482">
-    <w:abstractNumId w:val="17"/>
+    <w:abstractNumId w:val="19"/>
   </w:num>
   <w:num w:numId="12" w16cid:durableId="766316797">
-    <w:abstractNumId w:val="27"/>
+    <w:abstractNumId w:val="30"/>
   </w:num>
   <w:num w:numId="13" w16cid:durableId="1252855900">
-    <w:abstractNumId w:val="25"/>
+    <w:abstractNumId w:val="27"/>
   </w:num>
   <w:num w:numId="14" w16cid:durableId="216819548">
     <w:abstractNumId w:val="14"/>
   </w:num>
   <w:num w:numId="15" w16cid:durableId="482507873">
-    <w:abstractNumId w:val="19"/>
+    <w:abstractNumId w:val="21"/>
   </w:num>
   <w:num w:numId="16" w16cid:durableId="1311985462">
-    <w:abstractNumId w:val="22"/>
+    <w:abstractNumId w:val="24"/>
   </w:num>
   <w:num w:numId="17" w16cid:durableId="808939429">
     <w:abstractNumId w:val="8"/>
@@ -4579,7 +5252,7 @@
     <w:abstractNumId w:val="10"/>
   </w:num>
   <w:num w:numId="19" w16cid:durableId="1482308862">
-    <w:abstractNumId w:val="21"/>
+    <w:abstractNumId w:val="23"/>
   </w:num>
   <w:num w:numId="20" w16cid:durableId="685987202">
     <w:abstractNumId w:val="5"/>
@@ -4588,16 +5261,16 @@
     <w:abstractNumId w:val="6"/>
   </w:num>
   <w:num w:numId="22" w16cid:durableId="1768227695">
-    <w:abstractNumId w:val="23"/>
+    <w:abstractNumId w:val="25"/>
   </w:num>
   <w:num w:numId="23" w16cid:durableId="1535000397">
-    <w:abstractNumId w:val="26"/>
+    <w:abstractNumId w:val="29"/>
   </w:num>
   <w:num w:numId="24" w16cid:durableId="692389035">
     <w:abstractNumId w:val="12"/>
   </w:num>
   <w:num w:numId="25" w16cid:durableId="523708466">
-    <w:abstractNumId w:val="18"/>
+    <w:abstractNumId w:val="20"/>
   </w:num>
   <w:num w:numId="26" w16cid:durableId="1258560676">
     <w:abstractNumId w:val="15"/>
@@ -4607,6 +5280,18 @@
   </w:num>
   <w:num w:numId="28" w16cid:durableId="486632372">
     <w:abstractNumId w:val="9"/>
+  </w:num>
+  <w:num w:numId="29" w16cid:durableId="1604192854">
+    <w:abstractNumId w:val="16"/>
+  </w:num>
+  <w:num w:numId="30" w16cid:durableId="1781030775">
+    <w:abstractNumId w:val="17"/>
+  </w:num>
+  <w:num w:numId="31" w16cid:durableId="2050567897">
+    <w:abstractNumId w:val="28"/>
+  </w:num>
+  <w:num w:numId="32" w16cid:durableId="1668707474">
+    <w:abstractNumId w:val="31"/>
   </w:num>
 </w:numbering>
 </file>

</xml_diff>

<commit_message>
fix: Resolve Node 20 ERR_PACKAGE_PATH_NOT_EXPORTED crash by dynamically importing ESM package yahoo-finance2
</commit_message>
<xml_diff>
--- a/Project ARES Recovery Prompt.docx
+++ b/Project ARES Recovery Prompt.docx
@@ -59,7 +59,7 @@
       <w:pPr>
         <w:numPr>
           <w:ilvl w:val="0"/>
-          <w:numId w:val="31"/>
+          <w:numId w:val="33"/>
         </w:numPr>
         <w:rPr>
           <w:b/>
@@ -71,14 +71,14 @@
           <w:b/>
           <w:bCs/>
         </w:rPr>
-        <w:t>Target Audience 1 (Retail): 10,000 active global retail traders.</w:t>
+        <w:t>Target Audience: 10,000 active global retail traders.</w:t>
       </w:r>
     </w:p>
     <w:p>
       <w:pPr>
         <w:numPr>
           <w:ilvl w:val="0"/>
-          <w:numId w:val="31"/>
+          <w:numId w:val="33"/>
         </w:numPr>
         <w:rPr>
           <w:b/>
@@ -90,14 +90,14 @@
           <w:b/>
           <w:bCs/>
         </w:rPr>
-        <w:t>Target Audience 2 (Enterprise): Family Offices, Prop Trading Desks, Wealth Management.</w:t>
+        <w:t>Pricing: Freemium model. Pro Tier at $29/month.</w:t>
       </w:r>
     </w:p>
     <w:p>
       <w:pPr>
         <w:numPr>
           <w:ilvl w:val="0"/>
-          <w:numId w:val="31"/>
+          <w:numId w:val="33"/>
         </w:numPr>
         <w:rPr>
           <w:b/>
@@ -109,15 +109,11 @@
           <w:b/>
           <w:bCs/>
         </w:rPr>
-        <w:t>Pricing: Freemium model. Pro Tier at $29/month (with 7-Day Free Trial). Enterprise API at $5,000/month.</w:t>
+        <w:t>Target ARR: $3.48 Million+ USD.</w:t>
       </w:r>
     </w:p>
     <w:p>
       <w:pPr>
-        <w:numPr>
-          <w:ilvl w:val="0"/>
-          <w:numId w:val="31"/>
-        </w:numPr>
         <w:rPr>
           <w:b/>
           <w:bCs/>
@@ -128,11 +124,15 @@
           <w:b/>
           <w:bCs/>
         </w:rPr>
-        <w:t>Target ARR (Annual Recurring Revenue): $3.48 Million+ USD.</w:t>
+        <w:t>THE TECH STACK (Antigravity Protocol):</w:t>
       </w:r>
     </w:p>
     <w:p>
       <w:pPr>
+        <w:numPr>
+          <w:ilvl w:val="0"/>
+          <w:numId w:val="34"/>
+        </w:numPr>
         <w:rPr>
           <w:b/>
           <w:bCs/>
@@ -143,14 +143,14 @@
           <w:b/>
           <w:bCs/>
         </w:rPr>
-        <w:t>THE GTM (GO-TO-MARKET) STRATEGY:</w:t>
+        <w:t>The Brain: Google AI Studio (Gemini 2.5 Flash).</w:t>
       </w:r>
     </w:p>
     <w:p>
       <w:pPr>
         <w:numPr>
           <w:ilvl w:val="0"/>
-          <w:numId w:val="32"/>
+          <w:numId w:val="34"/>
         </w:numPr>
         <w:rPr>
           <w:b/>
@@ -162,14 +162,14 @@
           <w:b/>
           <w:bCs/>
         </w:rPr>
-        <w:t>The Daily Drop: Post daily Kill Zone screenshots on X to build organic authority.</w:t>
+        <w:t>The Backend: Node.js (Render.com).</w:t>
       </w:r>
     </w:p>
     <w:p>
       <w:pPr>
         <w:numPr>
           <w:ilvl w:val="0"/>
-          <w:numId w:val="32"/>
+          <w:numId w:val="34"/>
         </w:numPr>
         <w:rPr>
           <w:b/>
@@ -181,14 +181,14 @@
           <w:b/>
           <w:bCs/>
         </w:rPr>
-        <w:t>The Trojan Horse: Gift free lifetime Pro accounts to mid-tier crypto influencers (10k-50k followers) so they use watermarked ARES charts in their content.</w:t>
+        <w:t>The Sensors: CoinGecko API, Puppeteer (Farside/Coinglass), Yahoo Finance API (Corporate Sentiment).</w:t>
       </w:r>
     </w:p>
     <w:p>
       <w:pPr>
         <w:numPr>
           <w:ilvl w:val="0"/>
-          <w:numId w:val="32"/>
+          <w:numId w:val="34"/>
         </w:numPr>
         <w:rPr>
           <w:b/>
@@ -200,23 +200,7 @@
           <w:b/>
           <w:bCs/>
         </w:rPr>
-        <w:t>The Bloodhound Ads: Run targeted X video ads </w:t>
-      </w:r>
-      <w:r>
-        <w:rPr>
-          <w:b/>
-          <w:bCs/>
-          <w:i/>
-          <w:iCs/>
-        </w:rPr>
-        <w:t>only</w:t>
-      </w:r>
-      <w:r>
-        <w:rPr>
-          <w:b/>
-          <w:bCs/>
-        </w:rPr>
-        <w:t> on days the market crashes &gt;10%, targeting liquidated traders seeking risk management.</w:t>
+        <w:t>The Body: React Web App (Vercel).</w:t>
       </w:r>
     </w:p>
     <w:p>
@@ -254,7 +238,7 @@
           <w:b/>
           <w:bCs/>
         </w:rPr>
-        <w:t xml:space="preserve"> PHASE 1: PROVE THE BRAIN (Google AI Studio)</w:t>
+        <w:t xml:space="preserve"> PHASE 1-3: MVP BUILD &amp; DEPLOYMENT</w:t>
       </w:r>
     </w:p>
     <w:p>
@@ -264,7 +248,6 @@
           <w:bCs/>
         </w:rPr>
       </w:pPr>
-      <w:proofErr w:type="gramStart"/>
       <w:r>
         <w:rPr>
           <w:b/>
@@ -272,17 +255,14 @@
           <w:i/>
           <w:iCs/>
         </w:rPr>
-        <w:t>Status:[</w:t>
+        <w:t>Status:[COMPLETED]</w:t>
       </w:r>
-      <w:proofErr w:type="gramEnd"/>
       <w:r>
         <w:rPr>
           <w:b/>
           <w:bCs/>
-          <w:i/>
-          <w:iCs/>
-        </w:rPr>
-        <w:t>COMPLETED]</w:t>
+        </w:rPr>
+        <w:t> (Brain proven, Backend live, Frontend live, Stripe wired).</w:t>
       </w:r>
     </w:p>
     <w:p>
@@ -298,14 +278,14 @@
           <w:b/>
           <w:bCs/>
         </w:rPr>
-        <w:t>🟢</w:t>
+        <w:t>🟡</w:t>
       </w:r>
       <w:r>
         <w:rPr>
           <w:b/>
           <w:bCs/>
         </w:rPr>
-        <w:t xml:space="preserve"> PHASE 2: THE ANTIGRAVITY DEPLOYMENT (Backend Pipeline)</w:t>
+        <w:t xml:space="preserve"> PHASE 3.5: THE CORPORATE SENTIMENT UPGRADE (Live R&amp;D)</w:t>
       </w:r>
     </w:p>
     <w:p>
@@ -322,7 +302,7 @@
           <w:i/>
           <w:iCs/>
         </w:rPr>
-        <w:t>Status: [COMPLETED]</w:t>
+        <w:t>Status: [IN PROGRESS]</w:t>
       </w:r>
     </w:p>
     <w:p>
@@ -337,7 +317,7 @@
           <w:b/>
           <w:bCs/>
         </w:rPr>
-        <w:t>Deployed backend to Render.com.</w:t>
+        <w:t>Integrate yahoo-finance2 npm package into backend.</w:t>
       </w:r>
     </w:p>
     <w:p>
@@ -352,7 +332,7 @@
           <w:b/>
           <w:bCs/>
         </w:rPr>
-        <w:t>Built and merged dynamic Altcoin Scraper into production backend.</w:t>
+        <w:t>Fetch live COIN and HOOD market data to gauge retail broker health.</w:t>
       </w:r>
     </w:p>
     <w:p>
@@ -364,18 +344,10 @@
       </w:pPr>
       <w:r>
         <w:rPr>
-          <w:rFonts w:ascii="Segoe UI Emoji" w:hAnsi="Segoe UI Emoji" w:cs="Segoe UI Emoji"/>
-          <w:b/>
-          <w:bCs/>
-        </w:rPr>
-        <w:t>🟢</w:t>
-      </w:r>
-      <w:r>
-        <w:rPr>
-          <w:b/>
-          <w:bCs/>
-        </w:rPr>
-        <w:t xml:space="preserve"> PHASE 3: THE FRONTEND BUILD (React UI)</w:t>
+          <w:b/>
+          <w:bCs/>
+        </w:rPr>
+        <w:t>Update Gemini prompt to synthesize Corporate Sentiment.</w:t>
       </w:r>
     </w:p>
     <w:p>
@@ -385,119 +357,12 @@
           <w:bCs/>
         </w:rPr>
       </w:pPr>
-      <w:proofErr w:type="gramStart"/>
       <w:r>
         <w:rPr>
           <w:b/>
           <w:bCs/>
-          <w:i/>
-          <w:iCs/>
-        </w:rPr>
-        <w:lastRenderedPageBreak/>
-        <w:t>Status:[</w:t>
-      </w:r>
-      <w:proofErr w:type="gramEnd"/>
-      <w:r>
-        <w:rPr>
-          <w:b/>
-          <w:bCs/>
-          <w:i/>
-          <w:iCs/>
-        </w:rPr>
-        <w:t>COMPLETED]</w:t>
-      </w:r>
-    </w:p>
-    <w:p>
-      <w:pPr>
-        <w:rPr>
-          <w:b/>
-          <w:bCs/>
-        </w:rPr>
-      </w:pPr>
-      <w:r>
-        <w:rPr>
-          <w:b/>
-          <w:bCs/>
-        </w:rPr>
-        <w:t xml:space="preserve">Built </w:t>
-      </w:r>
-      <w:proofErr w:type="gramStart"/>
-      <w:r>
-        <w:rPr>
-          <w:b/>
-          <w:bCs/>
-        </w:rPr>
-        <w:t>dark-mode</w:t>
-      </w:r>
-      <w:proofErr w:type="gramEnd"/>
-      <w:r>
-        <w:rPr>
-          <w:b/>
-          <w:bCs/>
-        </w:rPr>
-        <w:t xml:space="preserve"> React dashboard with </w:t>
-      </w:r>
-      <w:proofErr w:type="spellStart"/>
-      <w:r>
-        <w:rPr>
-          <w:b/>
-          <w:bCs/>
-        </w:rPr>
-        <w:t>Glassmorphism</w:t>
-      </w:r>
-      <w:proofErr w:type="spellEnd"/>
-      <w:r>
-        <w:rPr>
-          <w:b/>
-          <w:bCs/>
-        </w:rPr>
-        <w:t>.</w:t>
-      </w:r>
-    </w:p>
-    <w:p>
-      <w:pPr>
-        <w:rPr>
-          <w:b/>
-          <w:bCs/>
-        </w:rPr>
-      </w:pPr>
-      <w:r>
-        <w:rPr>
-          <w:b/>
-          <w:bCs/>
-        </w:rPr>
-        <w:t>Implemented Freemium Paywall (Blur/Padlock) and Stripe Redirect.</w:t>
-      </w:r>
-    </w:p>
-    <w:p>
-      <w:pPr>
-        <w:rPr>
-          <w:b/>
-          <w:bCs/>
-        </w:rPr>
-      </w:pPr>
-      <w:r>
-        <w:rPr>
-          <w:b/>
-          <w:bCs/>
-        </w:rPr>
-        <w:t xml:space="preserve">Deployed frontend to </w:t>
-      </w:r>
-      <w:proofErr w:type="spellStart"/>
-      <w:r>
-        <w:rPr>
-          <w:b/>
-          <w:bCs/>
-        </w:rPr>
-        <w:t>Vercel</w:t>
-      </w:r>
-      <w:proofErr w:type="spellEnd"/>
-      <w:r>
-        <w:rPr>
-          <w:b/>
-          <w:bCs/>
-        </w:rPr>
-        <w:t>.</w:t>
+        </w:rPr>
+        <w:t>Add "Retail Broker Health" UI card to the React dashboard.</w:t>
       </w:r>
     </w:p>
     <w:p>
@@ -530,7 +395,6 @@
           <w:bCs/>
         </w:rPr>
       </w:pPr>
-      <w:proofErr w:type="gramStart"/>
       <w:r>
         <w:rPr>
           <w:b/>
@@ -538,17 +402,7 @@
           <w:i/>
           <w:iCs/>
         </w:rPr>
-        <w:t>Status:[</w:t>
-      </w:r>
-      <w:proofErr w:type="gramEnd"/>
-      <w:r>
-        <w:rPr>
-          <w:b/>
-          <w:bCs/>
-          <w:i/>
-          <w:iCs/>
-        </w:rPr>
-        <w:t>IN PROGRESS]</w:t>
+        <w:t>Status: [IN PROGRESS]</w:t>
       </w:r>
     </w:p>
     <w:p>
@@ -563,31 +417,8 @@
           <w:b/>
           <w:bCs/>
         </w:rPr>
-        <w:t xml:space="preserve">Launched X (Twitter) </w:t>
-      </w:r>
-      <w:proofErr w:type="gramStart"/>
-      <w:r>
-        <w:rPr>
-          <w:b/>
-          <w:bCs/>
-        </w:rPr>
-        <w:t>brand @</w:t>
-      </w:r>
-      <w:proofErr w:type="gramEnd"/>
-      <w:r>
-        <w:rPr>
-          <w:b/>
-          <w:bCs/>
-        </w:rPr>
-        <w:t>AresQuant.</w:t>
-      </w:r>
-      <w:r>
-        <w:rPr>
-          <w:b/>
-          <w:bCs/>
-        </w:rPr>
-        <w:br/>
-        <w:t>*[X] Activated Stripe payment gateway ($29/month) via CVEV Strategies LLC.</w:t>
+        <w:lastRenderedPageBreak/>
+        <w:t>Launched X (Twitter) brand @AresQuant.</w:t>
       </w:r>
     </w:p>
     <w:p>
@@ -602,7 +433,7 @@
           <w:b/>
           <w:bCs/>
         </w:rPr>
-        <w:t>Activated 7-Day Free Trial and Promo Codes.</w:t>
+        <w:t>Activated Stripe payment gateway ($29/month) with 7-Day Free Trial.</w:t>
       </w:r>
     </w:p>
     <w:p>
@@ -617,7 +448,7 @@
           <w:b/>
           <w:bCs/>
         </w:rPr>
-        <w:t>Created Tier-1 Vertical Video Ad asset.</w:t>
+        <w:t>Execute manual X Premium "Bloodhound" replies to bypass ad quarantine.</w:t>
       </w:r>
     </w:p>
     <w:p>
@@ -632,7 +463,7 @@
           <w:b/>
           <w:bCs/>
         </w:rPr>
-        <w:t>Execute the "Bloodhound" Video Ad Campaign during next market crash.</w:t>
+        <w:t>Form the LLC to establish the Corporate Veil.</w:t>
       </w:r>
     </w:p>
     <w:p>
@@ -680,7 +511,6 @@
           <w:bCs/>
         </w:rPr>
       </w:pPr>
-      <w:proofErr w:type="gramStart"/>
       <w:r>
         <w:rPr>
           <w:b/>
@@ -688,17 +518,7 @@
           <w:i/>
           <w:iCs/>
         </w:rPr>
-        <w:t>Status:[</w:t>
-      </w:r>
-      <w:proofErr w:type="gramEnd"/>
-      <w:r>
-        <w:rPr>
-          <w:b/>
-          <w:bCs/>
-          <w:i/>
-          <w:iCs/>
-        </w:rPr>
-        <w:t>LOCKED - Awaiting 100 Paying Users]</w:t>
+        <w:t>Status:[LOCKED - Awaiting 100 Paying Users]</w:t>
       </w:r>
     </w:p>
     <w:p>
@@ -761,7 +581,6 @@
           <w:bCs/>
         </w:rPr>
       </w:pPr>
-      <w:proofErr w:type="gramStart"/>
       <w:r>
         <w:rPr>
           <w:b/>
@@ -769,17 +588,7 @@
           <w:i/>
           <w:iCs/>
         </w:rPr>
-        <w:t>Status:[</w:t>
-      </w:r>
-      <w:proofErr w:type="gramEnd"/>
-      <w:r>
-        <w:rPr>
-          <w:b/>
-          <w:bCs/>
-          <w:i/>
-          <w:iCs/>
-        </w:rPr>
-        <w:t>LOCKED - Awaiting Phase 5 Completion]</w:t>
+        <w:t>Status:[LOCKED - Awaiting Phase 5 Completion]</w:t>
       </w:r>
     </w:p>
     <w:p>
@@ -1833,6 +1642,155 @@
     </w:lvl>
   </w:abstractNum>
   <w:abstractNum w:abstractNumId="7" w15:restartNumberingAfterBreak="0">
+    <w:nsid w:val="1A765AF4"/>
+    <w:multiLevelType w:val="multilevel"/>
+    <w:tmpl w:val="2DE2A710"/>
+    <w:lvl w:ilvl="0">
+      <w:start w:val="1"/>
+      <w:numFmt w:val="bullet"/>
+      <w:lvlText w:val=""/>
+      <w:lvlJc w:val="left"/>
+      <w:pPr>
+        <w:tabs>
+          <w:tab w:val="num" w:pos="720"/>
+        </w:tabs>
+        <w:ind w:left="720" w:hanging="360"/>
+      </w:pPr>
+      <w:rPr>
+        <w:rFonts w:ascii="Symbol" w:hAnsi="Symbol" w:hint="default"/>
+        <w:sz w:val="20"/>
+      </w:rPr>
+    </w:lvl>
+    <w:lvl w:ilvl="1" w:tentative="1">
+      <w:start w:val="1"/>
+      <w:numFmt w:val="bullet"/>
+      <w:lvlText w:val="o"/>
+      <w:lvlJc w:val="left"/>
+      <w:pPr>
+        <w:tabs>
+          <w:tab w:val="num" w:pos="1440"/>
+        </w:tabs>
+        <w:ind w:left="1440" w:hanging="360"/>
+      </w:pPr>
+      <w:rPr>
+        <w:rFonts w:ascii="Courier New" w:hAnsi="Courier New" w:hint="default"/>
+        <w:sz w:val="20"/>
+      </w:rPr>
+    </w:lvl>
+    <w:lvl w:ilvl="2" w:tentative="1">
+      <w:start w:val="1"/>
+      <w:numFmt w:val="bullet"/>
+      <w:lvlText w:val=""/>
+      <w:lvlJc w:val="left"/>
+      <w:pPr>
+        <w:tabs>
+          <w:tab w:val="num" w:pos="2160"/>
+        </w:tabs>
+        <w:ind w:left="2160" w:hanging="360"/>
+      </w:pPr>
+      <w:rPr>
+        <w:rFonts w:ascii="Wingdings" w:hAnsi="Wingdings" w:hint="default"/>
+        <w:sz w:val="20"/>
+      </w:rPr>
+    </w:lvl>
+    <w:lvl w:ilvl="3" w:tentative="1">
+      <w:start w:val="1"/>
+      <w:numFmt w:val="bullet"/>
+      <w:lvlText w:val=""/>
+      <w:lvlJc w:val="left"/>
+      <w:pPr>
+        <w:tabs>
+          <w:tab w:val="num" w:pos="2880"/>
+        </w:tabs>
+        <w:ind w:left="2880" w:hanging="360"/>
+      </w:pPr>
+      <w:rPr>
+        <w:rFonts w:ascii="Wingdings" w:hAnsi="Wingdings" w:hint="default"/>
+        <w:sz w:val="20"/>
+      </w:rPr>
+    </w:lvl>
+    <w:lvl w:ilvl="4" w:tentative="1">
+      <w:start w:val="1"/>
+      <w:numFmt w:val="bullet"/>
+      <w:lvlText w:val=""/>
+      <w:lvlJc w:val="left"/>
+      <w:pPr>
+        <w:tabs>
+          <w:tab w:val="num" w:pos="3600"/>
+        </w:tabs>
+        <w:ind w:left="3600" w:hanging="360"/>
+      </w:pPr>
+      <w:rPr>
+        <w:rFonts w:ascii="Wingdings" w:hAnsi="Wingdings" w:hint="default"/>
+        <w:sz w:val="20"/>
+      </w:rPr>
+    </w:lvl>
+    <w:lvl w:ilvl="5" w:tentative="1">
+      <w:start w:val="1"/>
+      <w:numFmt w:val="bullet"/>
+      <w:lvlText w:val=""/>
+      <w:lvlJc w:val="left"/>
+      <w:pPr>
+        <w:tabs>
+          <w:tab w:val="num" w:pos="4320"/>
+        </w:tabs>
+        <w:ind w:left="4320" w:hanging="360"/>
+      </w:pPr>
+      <w:rPr>
+        <w:rFonts w:ascii="Wingdings" w:hAnsi="Wingdings" w:hint="default"/>
+        <w:sz w:val="20"/>
+      </w:rPr>
+    </w:lvl>
+    <w:lvl w:ilvl="6" w:tentative="1">
+      <w:start w:val="1"/>
+      <w:numFmt w:val="bullet"/>
+      <w:lvlText w:val=""/>
+      <w:lvlJc w:val="left"/>
+      <w:pPr>
+        <w:tabs>
+          <w:tab w:val="num" w:pos="5040"/>
+        </w:tabs>
+        <w:ind w:left="5040" w:hanging="360"/>
+      </w:pPr>
+      <w:rPr>
+        <w:rFonts w:ascii="Wingdings" w:hAnsi="Wingdings" w:hint="default"/>
+        <w:sz w:val="20"/>
+      </w:rPr>
+    </w:lvl>
+    <w:lvl w:ilvl="7" w:tentative="1">
+      <w:start w:val="1"/>
+      <w:numFmt w:val="bullet"/>
+      <w:lvlText w:val=""/>
+      <w:lvlJc w:val="left"/>
+      <w:pPr>
+        <w:tabs>
+          <w:tab w:val="num" w:pos="5760"/>
+        </w:tabs>
+        <w:ind w:left="5760" w:hanging="360"/>
+      </w:pPr>
+      <w:rPr>
+        <w:rFonts w:ascii="Wingdings" w:hAnsi="Wingdings" w:hint="default"/>
+        <w:sz w:val="20"/>
+      </w:rPr>
+    </w:lvl>
+    <w:lvl w:ilvl="8" w:tentative="1">
+      <w:start w:val="1"/>
+      <w:numFmt w:val="bullet"/>
+      <w:lvlText w:val=""/>
+      <w:lvlJc w:val="left"/>
+      <w:pPr>
+        <w:tabs>
+          <w:tab w:val="num" w:pos="6480"/>
+        </w:tabs>
+        <w:ind w:left="6480" w:hanging="360"/>
+      </w:pPr>
+      <w:rPr>
+        <w:rFonts w:ascii="Wingdings" w:hAnsi="Wingdings" w:hint="default"/>
+        <w:sz w:val="20"/>
+      </w:rPr>
+    </w:lvl>
+  </w:abstractNum>
+  <w:abstractNum w:abstractNumId="8" w15:restartNumberingAfterBreak="0">
     <w:nsid w:val="1B42700F"/>
     <w:multiLevelType w:val="multilevel"/>
     <w:tmpl w:val="7C427FBC"/>
@@ -1981,7 +1939,7 @@
       </w:rPr>
     </w:lvl>
   </w:abstractNum>
-  <w:abstractNum w:abstractNumId="8" w15:restartNumberingAfterBreak="0">
+  <w:abstractNum w:abstractNumId="9" w15:restartNumberingAfterBreak="0">
     <w:nsid w:val="1EF72939"/>
     <w:multiLevelType w:val="multilevel"/>
     <w:tmpl w:val="5E50B286"/>
@@ -2094,7 +2052,7 @@
       </w:pPr>
     </w:lvl>
   </w:abstractNum>
-  <w:abstractNum w:abstractNumId="9" w15:restartNumberingAfterBreak="0">
+  <w:abstractNum w:abstractNumId="10" w15:restartNumberingAfterBreak="0">
     <w:nsid w:val="25655BEF"/>
     <w:multiLevelType w:val="multilevel"/>
     <w:tmpl w:val="53542AB2"/>
@@ -2207,7 +2165,7 @@
       </w:pPr>
     </w:lvl>
   </w:abstractNum>
-  <w:abstractNum w:abstractNumId="10" w15:restartNumberingAfterBreak="0">
+  <w:abstractNum w:abstractNumId="11" w15:restartNumberingAfterBreak="0">
     <w:nsid w:val="29794AF3"/>
     <w:multiLevelType w:val="multilevel"/>
     <w:tmpl w:val="2040802E"/>
@@ -2356,7 +2314,7 @@
       </w:rPr>
     </w:lvl>
   </w:abstractNum>
-  <w:abstractNum w:abstractNumId="11" w15:restartNumberingAfterBreak="0">
+  <w:abstractNum w:abstractNumId="12" w15:restartNumberingAfterBreak="0">
     <w:nsid w:val="2F5F1481"/>
     <w:multiLevelType w:val="multilevel"/>
     <w:tmpl w:val="A6441098"/>
@@ -2505,7 +2463,156 @@
       </w:rPr>
     </w:lvl>
   </w:abstractNum>
-  <w:abstractNum w:abstractNumId="12" w15:restartNumberingAfterBreak="0">
+  <w:abstractNum w:abstractNumId="13" w15:restartNumberingAfterBreak="0">
+    <w:nsid w:val="3BAE5092"/>
+    <w:multiLevelType w:val="multilevel"/>
+    <w:tmpl w:val="4D4A6A02"/>
+    <w:lvl w:ilvl="0">
+      <w:start w:val="1"/>
+      <w:numFmt w:val="bullet"/>
+      <w:lvlText w:val=""/>
+      <w:lvlJc w:val="left"/>
+      <w:pPr>
+        <w:tabs>
+          <w:tab w:val="num" w:pos="720"/>
+        </w:tabs>
+        <w:ind w:left="720" w:hanging="360"/>
+      </w:pPr>
+      <w:rPr>
+        <w:rFonts w:ascii="Symbol" w:hAnsi="Symbol" w:hint="default"/>
+        <w:sz w:val="20"/>
+      </w:rPr>
+    </w:lvl>
+    <w:lvl w:ilvl="1" w:tentative="1">
+      <w:start w:val="1"/>
+      <w:numFmt w:val="bullet"/>
+      <w:lvlText w:val="o"/>
+      <w:lvlJc w:val="left"/>
+      <w:pPr>
+        <w:tabs>
+          <w:tab w:val="num" w:pos="1440"/>
+        </w:tabs>
+        <w:ind w:left="1440" w:hanging="360"/>
+      </w:pPr>
+      <w:rPr>
+        <w:rFonts w:ascii="Courier New" w:hAnsi="Courier New" w:hint="default"/>
+        <w:sz w:val="20"/>
+      </w:rPr>
+    </w:lvl>
+    <w:lvl w:ilvl="2" w:tentative="1">
+      <w:start w:val="1"/>
+      <w:numFmt w:val="bullet"/>
+      <w:lvlText w:val=""/>
+      <w:lvlJc w:val="left"/>
+      <w:pPr>
+        <w:tabs>
+          <w:tab w:val="num" w:pos="2160"/>
+        </w:tabs>
+        <w:ind w:left="2160" w:hanging="360"/>
+      </w:pPr>
+      <w:rPr>
+        <w:rFonts w:ascii="Wingdings" w:hAnsi="Wingdings" w:hint="default"/>
+        <w:sz w:val="20"/>
+      </w:rPr>
+    </w:lvl>
+    <w:lvl w:ilvl="3" w:tentative="1">
+      <w:start w:val="1"/>
+      <w:numFmt w:val="bullet"/>
+      <w:lvlText w:val=""/>
+      <w:lvlJc w:val="left"/>
+      <w:pPr>
+        <w:tabs>
+          <w:tab w:val="num" w:pos="2880"/>
+        </w:tabs>
+        <w:ind w:left="2880" w:hanging="360"/>
+      </w:pPr>
+      <w:rPr>
+        <w:rFonts w:ascii="Wingdings" w:hAnsi="Wingdings" w:hint="default"/>
+        <w:sz w:val="20"/>
+      </w:rPr>
+    </w:lvl>
+    <w:lvl w:ilvl="4" w:tentative="1">
+      <w:start w:val="1"/>
+      <w:numFmt w:val="bullet"/>
+      <w:lvlText w:val=""/>
+      <w:lvlJc w:val="left"/>
+      <w:pPr>
+        <w:tabs>
+          <w:tab w:val="num" w:pos="3600"/>
+        </w:tabs>
+        <w:ind w:left="3600" w:hanging="360"/>
+      </w:pPr>
+      <w:rPr>
+        <w:rFonts w:ascii="Wingdings" w:hAnsi="Wingdings" w:hint="default"/>
+        <w:sz w:val="20"/>
+      </w:rPr>
+    </w:lvl>
+    <w:lvl w:ilvl="5" w:tentative="1">
+      <w:start w:val="1"/>
+      <w:numFmt w:val="bullet"/>
+      <w:lvlText w:val=""/>
+      <w:lvlJc w:val="left"/>
+      <w:pPr>
+        <w:tabs>
+          <w:tab w:val="num" w:pos="4320"/>
+        </w:tabs>
+        <w:ind w:left="4320" w:hanging="360"/>
+      </w:pPr>
+      <w:rPr>
+        <w:rFonts w:ascii="Wingdings" w:hAnsi="Wingdings" w:hint="default"/>
+        <w:sz w:val="20"/>
+      </w:rPr>
+    </w:lvl>
+    <w:lvl w:ilvl="6" w:tentative="1">
+      <w:start w:val="1"/>
+      <w:numFmt w:val="bullet"/>
+      <w:lvlText w:val=""/>
+      <w:lvlJc w:val="left"/>
+      <w:pPr>
+        <w:tabs>
+          <w:tab w:val="num" w:pos="5040"/>
+        </w:tabs>
+        <w:ind w:left="5040" w:hanging="360"/>
+      </w:pPr>
+      <w:rPr>
+        <w:rFonts w:ascii="Wingdings" w:hAnsi="Wingdings" w:hint="default"/>
+        <w:sz w:val="20"/>
+      </w:rPr>
+    </w:lvl>
+    <w:lvl w:ilvl="7" w:tentative="1">
+      <w:start w:val="1"/>
+      <w:numFmt w:val="bullet"/>
+      <w:lvlText w:val=""/>
+      <w:lvlJc w:val="left"/>
+      <w:pPr>
+        <w:tabs>
+          <w:tab w:val="num" w:pos="5760"/>
+        </w:tabs>
+        <w:ind w:left="5760" w:hanging="360"/>
+      </w:pPr>
+      <w:rPr>
+        <w:rFonts w:ascii="Wingdings" w:hAnsi="Wingdings" w:hint="default"/>
+        <w:sz w:val="20"/>
+      </w:rPr>
+    </w:lvl>
+    <w:lvl w:ilvl="8" w:tentative="1">
+      <w:start w:val="1"/>
+      <w:numFmt w:val="bullet"/>
+      <w:lvlText w:val=""/>
+      <w:lvlJc w:val="left"/>
+      <w:pPr>
+        <w:tabs>
+          <w:tab w:val="num" w:pos="6480"/>
+        </w:tabs>
+        <w:ind w:left="6480" w:hanging="360"/>
+      </w:pPr>
+      <w:rPr>
+        <w:rFonts w:ascii="Wingdings" w:hAnsi="Wingdings" w:hint="default"/>
+        <w:sz w:val="20"/>
+      </w:rPr>
+    </w:lvl>
+  </w:abstractNum>
+  <w:abstractNum w:abstractNumId="14" w15:restartNumberingAfterBreak="0">
     <w:nsid w:val="3CB53753"/>
     <w:multiLevelType w:val="multilevel"/>
     <w:tmpl w:val="3A2AB962"/>
@@ -2654,7 +2761,7 @@
       </w:rPr>
     </w:lvl>
   </w:abstractNum>
-  <w:abstractNum w:abstractNumId="13" w15:restartNumberingAfterBreak="0">
+  <w:abstractNum w:abstractNumId="15" w15:restartNumberingAfterBreak="0">
     <w:nsid w:val="3EC96FB4"/>
     <w:multiLevelType w:val="multilevel"/>
     <w:tmpl w:val="5CF0F000"/>
@@ -2803,7 +2910,7 @@
       </w:rPr>
     </w:lvl>
   </w:abstractNum>
-  <w:abstractNum w:abstractNumId="14" w15:restartNumberingAfterBreak="0">
+  <w:abstractNum w:abstractNumId="16" w15:restartNumberingAfterBreak="0">
     <w:nsid w:val="3ECC4647"/>
     <w:multiLevelType w:val="multilevel"/>
     <w:tmpl w:val="ABEE4BA2"/>
@@ -2916,7 +3023,7 @@
       </w:pPr>
     </w:lvl>
   </w:abstractNum>
-  <w:abstractNum w:abstractNumId="15" w15:restartNumberingAfterBreak="0">
+  <w:abstractNum w:abstractNumId="17" w15:restartNumberingAfterBreak="0">
     <w:nsid w:val="40B5324A"/>
     <w:multiLevelType w:val="multilevel"/>
     <w:tmpl w:val="F2BA4C7C"/>
@@ -3065,7 +3172,7 @@
       </w:rPr>
     </w:lvl>
   </w:abstractNum>
-  <w:abstractNum w:abstractNumId="16" w15:restartNumberingAfterBreak="0">
+  <w:abstractNum w:abstractNumId="18" w15:restartNumberingAfterBreak="0">
     <w:nsid w:val="424F0898"/>
     <w:multiLevelType w:val="multilevel"/>
     <w:tmpl w:val="C6A6500E"/>
@@ -3214,7 +3321,7 @@
       </w:rPr>
     </w:lvl>
   </w:abstractNum>
-  <w:abstractNum w:abstractNumId="17" w15:restartNumberingAfterBreak="0">
+  <w:abstractNum w:abstractNumId="19" w15:restartNumberingAfterBreak="0">
     <w:nsid w:val="477F0CE4"/>
     <w:multiLevelType w:val="multilevel"/>
     <w:tmpl w:val="6B74BC06"/>
@@ -3327,7 +3434,7 @@
       </w:pPr>
     </w:lvl>
   </w:abstractNum>
-  <w:abstractNum w:abstractNumId="18" w15:restartNumberingAfterBreak="0">
+  <w:abstractNum w:abstractNumId="20" w15:restartNumberingAfterBreak="0">
     <w:nsid w:val="47CC1A89"/>
     <w:multiLevelType w:val="multilevel"/>
     <w:tmpl w:val="650CEE58"/>
@@ -3476,7 +3583,7 @@
       </w:rPr>
     </w:lvl>
   </w:abstractNum>
-  <w:abstractNum w:abstractNumId="19" w15:restartNumberingAfterBreak="0">
+  <w:abstractNum w:abstractNumId="21" w15:restartNumberingAfterBreak="0">
     <w:nsid w:val="48397FB2"/>
     <w:multiLevelType w:val="multilevel"/>
     <w:tmpl w:val="3B3E1206"/>
@@ -3589,7 +3696,7 @@
       </w:pPr>
     </w:lvl>
   </w:abstractNum>
-  <w:abstractNum w:abstractNumId="20" w15:restartNumberingAfterBreak="0">
+  <w:abstractNum w:abstractNumId="22" w15:restartNumberingAfterBreak="0">
     <w:nsid w:val="4BEF63ED"/>
     <w:multiLevelType w:val="multilevel"/>
     <w:tmpl w:val="85DCDA0A"/>
@@ -3702,7 +3809,7 @@
       </w:pPr>
     </w:lvl>
   </w:abstractNum>
-  <w:abstractNum w:abstractNumId="21" w15:restartNumberingAfterBreak="0">
+  <w:abstractNum w:abstractNumId="23" w15:restartNumberingAfterBreak="0">
     <w:nsid w:val="4F064C07"/>
     <w:multiLevelType w:val="multilevel"/>
     <w:tmpl w:val="D174CC7C"/>
@@ -3851,7 +3958,7 @@
       </w:rPr>
     </w:lvl>
   </w:abstractNum>
-  <w:abstractNum w:abstractNumId="22" w15:restartNumberingAfterBreak="0">
+  <w:abstractNum w:abstractNumId="24" w15:restartNumberingAfterBreak="0">
     <w:nsid w:val="516C695D"/>
     <w:multiLevelType w:val="multilevel"/>
     <w:tmpl w:val="C7D849C8"/>
@@ -3964,7 +4071,7 @@
       </w:pPr>
     </w:lvl>
   </w:abstractNum>
-  <w:abstractNum w:abstractNumId="23" w15:restartNumberingAfterBreak="0">
+  <w:abstractNum w:abstractNumId="25" w15:restartNumberingAfterBreak="0">
     <w:nsid w:val="545F13AB"/>
     <w:multiLevelType w:val="multilevel"/>
     <w:tmpl w:val="58C01EAA"/>
@@ -4077,7 +4184,7 @@
       </w:pPr>
     </w:lvl>
   </w:abstractNum>
-  <w:abstractNum w:abstractNumId="24" w15:restartNumberingAfterBreak="0">
+  <w:abstractNum w:abstractNumId="26" w15:restartNumberingAfterBreak="0">
     <w:nsid w:val="56B17E38"/>
     <w:multiLevelType w:val="multilevel"/>
     <w:tmpl w:val="17E0525A"/>
@@ -4226,7 +4333,7 @@
       </w:rPr>
     </w:lvl>
   </w:abstractNum>
-  <w:abstractNum w:abstractNumId="25" w15:restartNumberingAfterBreak="0">
+  <w:abstractNum w:abstractNumId="27" w15:restartNumberingAfterBreak="0">
     <w:nsid w:val="57505B68"/>
     <w:multiLevelType w:val="multilevel"/>
     <w:tmpl w:val="C23295CA"/>
@@ -4375,7 +4482,7 @@
       </w:rPr>
     </w:lvl>
   </w:abstractNum>
-  <w:abstractNum w:abstractNumId="26" w15:restartNumberingAfterBreak="0">
+  <w:abstractNum w:abstractNumId="28" w15:restartNumberingAfterBreak="0">
     <w:nsid w:val="5DE023C2"/>
     <w:multiLevelType w:val="multilevel"/>
     <w:tmpl w:val="225C8F1A"/>
@@ -4488,7 +4595,7 @@
       </w:pPr>
     </w:lvl>
   </w:abstractNum>
-  <w:abstractNum w:abstractNumId="27" w15:restartNumberingAfterBreak="0">
+  <w:abstractNum w:abstractNumId="29" w15:restartNumberingAfterBreak="0">
     <w:nsid w:val="5FD83B9C"/>
     <w:multiLevelType w:val="multilevel"/>
     <w:tmpl w:val="243091DE"/>
@@ -4637,7 +4744,7 @@
       </w:rPr>
     </w:lvl>
   </w:abstractNum>
-  <w:abstractNum w:abstractNumId="28" w15:restartNumberingAfterBreak="0">
+  <w:abstractNum w:abstractNumId="30" w15:restartNumberingAfterBreak="0">
     <w:nsid w:val="66BF7C83"/>
     <w:multiLevelType w:val="multilevel"/>
     <w:tmpl w:val="03702CE6"/>
@@ -4786,7 +4893,7 @@
       </w:rPr>
     </w:lvl>
   </w:abstractNum>
-  <w:abstractNum w:abstractNumId="29" w15:restartNumberingAfterBreak="0">
+  <w:abstractNum w:abstractNumId="31" w15:restartNumberingAfterBreak="0">
     <w:nsid w:val="677F3F01"/>
     <w:multiLevelType w:val="multilevel"/>
     <w:tmpl w:val="A28A0798"/>
@@ -4935,7 +5042,7 @@
       </w:rPr>
     </w:lvl>
   </w:abstractNum>
-  <w:abstractNum w:abstractNumId="30" w15:restartNumberingAfterBreak="0">
+  <w:abstractNum w:abstractNumId="32" w15:restartNumberingAfterBreak="0">
     <w:nsid w:val="775138DB"/>
     <w:multiLevelType w:val="multilevel"/>
     <w:tmpl w:val="BB16D816"/>
@@ -5084,7 +5191,7 @@
       </w:rPr>
     </w:lvl>
   </w:abstractNum>
-  <w:abstractNum w:abstractNumId="31" w15:restartNumberingAfterBreak="0">
+  <w:abstractNum w:abstractNumId="33" w15:restartNumberingAfterBreak="0">
     <w:nsid w:val="783F6649"/>
     <w:multiLevelType w:val="multilevel"/>
     <w:tmpl w:val="A9D01652"/>
@@ -5198,7 +5305,7 @@
     </w:lvl>
   </w:abstractNum>
   <w:num w:numId="1" w16cid:durableId="789280021">
-    <w:abstractNumId w:val="18"/>
+    <w:abstractNumId w:val="20"/>
   </w:num>
   <w:num w:numId="2" w16cid:durableId="137504928">
     <w:abstractNumId w:val="1"/>
@@ -5207,10 +5314,10 @@
     <w:abstractNumId w:val="0"/>
   </w:num>
   <w:num w:numId="4" w16cid:durableId="2078428977">
-    <w:abstractNumId w:val="7"/>
+    <w:abstractNumId w:val="8"/>
   </w:num>
   <w:num w:numId="5" w16cid:durableId="1702243630">
-    <w:abstractNumId w:val="22"/>
+    <w:abstractNumId w:val="24"/>
   </w:num>
   <w:num w:numId="6" w16cid:durableId="1139302666">
     <w:abstractNumId w:val="2"/>
@@ -5219,40 +5326,40 @@
     <w:abstractNumId w:val="4"/>
   </w:num>
   <w:num w:numId="8" w16cid:durableId="640118813">
-    <w:abstractNumId w:val="26"/>
+    <w:abstractNumId w:val="28"/>
   </w:num>
   <w:num w:numId="9" w16cid:durableId="342441912">
     <w:abstractNumId w:val="3"/>
   </w:num>
   <w:num w:numId="10" w16cid:durableId="1509635353">
-    <w:abstractNumId w:val="13"/>
+    <w:abstractNumId w:val="15"/>
   </w:num>
   <w:num w:numId="11" w16cid:durableId="1744329482">
-    <w:abstractNumId w:val="19"/>
+    <w:abstractNumId w:val="21"/>
   </w:num>
   <w:num w:numId="12" w16cid:durableId="766316797">
-    <w:abstractNumId w:val="30"/>
+    <w:abstractNumId w:val="32"/>
   </w:num>
   <w:num w:numId="13" w16cid:durableId="1252855900">
-    <w:abstractNumId w:val="27"/>
+    <w:abstractNumId w:val="29"/>
   </w:num>
   <w:num w:numId="14" w16cid:durableId="216819548">
-    <w:abstractNumId w:val="14"/>
+    <w:abstractNumId w:val="16"/>
   </w:num>
   <w:num w:numId="15" w16cid:durableId="482507873">
-    <w:abstractNumId w:val="21"/>
+    <w:abstractNumId w:val="23"/>
   </w:num>
   <w:num w:numId="16" w16cid:durableId="1311985462">
-    <w:abstractNumId w:val="24"/>
+    <w:abstractNumId w:val="26"/>
   </w:num>
   <w:num w:numId="17" w16cid:durableId="808939429">
-    <w:abstractNumId w:val="8"/>
+    <w:abstractNumId w:val="9"/>
   </w:num>
   <w:num w:numId="18" w16cid:durableId="1713189035">
-    <w:abstractNumId w:val="10"/>
+    <w:abstractNumId w:val="11"/>
   </w:num>
   <w:num w:numId="19" w16cid:durableId="1482308862">
-    <w:abstractNumId w:val="23"/>
+    <w:abstractNumId w:val="25"/>
   </w:num>
   <w:num w:numId="20" w16cid:durableId="685987202">
     <w:abstractNumId w:val="5"/>
@@ -5261,37 +5368,43 @@
     <w:abstractNumId w:val="6"/>
   </w:num>
   <w:num w:numId="22" w16cid:durableId="1768227695">
-    <w:abstractNumId w:val="25"/>
+    <w:abstractNumId w:val="27"/>
   </w:num>
   <w:num w:numId="23" w16cid:durableId="1535000397">
-    <w:abstractNumId w:val="29"/>
+    <w:abstractNumId w:val="31"/>
   </w:num>
   <w:num w:numId="24" w16cid:durableId="692389035">
+    <w:abstractNumId w:val="14"/>
+  </w:num>
+  <w:num w:numId="25" w16cid:durableId="523708466">
+    <w:abstractNumId w:val="22"/>
+  </w:num>
+  <w:num w:numId="26" w16cid:durableId="1258560676">
+    <w:abstractNumId w:val="17"/>
+  </w:num>
+  <w:num w:numId="27" w16cid:durableId="230240066">
     <w:abstractNumId w:val="12"/>
   </w:num>
-  <w:num w:numId="25" w16cid:durableId="523708466">
-    <w:abstractNumId w:val="20"/>
-  </w:num>
-  <w:num w:numId="26" w16cid:durableId="1258560676">
-    <w:abstractNumId w:val="15"/>
-  </w:num>
-  <w:num w:numId="27" w16cid:durableId="230240066">
-    <w:abstractNumId w:val="11"/>
-  </w:num>
   <w:num w:numId="28" w16cid:durableId="486632372">
-    <w:abstractNumId w:val="9"/>
+    <w:abstractNumId w:val="10"/>
   </w:num>
   <w:num w:numId="29" w16cid:durableId="1604192854">
-    <w:abstractNumId w:val="16"/>
+    <w:abstractNumId w:val="18"/>
   </w:num>
   <w:num w:numId="30" w16cid:durableId="1781030775">
-    <w:abstractNumId w:val="17"/>
+    <w:abstractNumId w:val="19"/>
   </w:num>
   <w:num w:numId="31" w16cid:durableId="2050567897">
-    <w:abstractNumId w:val="28"/>
+    <w:abstractNumId w:val="30"/>
   </w:num>
   <w:num w:numId="32" w16cid:durableId="1668707474">
-    <w:abstractNumId w:val="31"/>
+    <w:abstractNumId w:val="33"/>
+  </w:num>
+  <w:num w:numId="33" w16cid:durableId="1559433268">
+    <w:abstractNumId w:val="7"/>
+  </w:num>
+  <w:num w:numId="34" w16cid:durableId="755635575">
+    <w:abstractNumId w:val="13"/>
   </w:num>
 </w:numbering>
 </file>

</xml_diff>